<commit_message>
feat: add ABET project assessment instruments and updated project documentation for Kinova integration
</commit_message>
<xml_diff>
--- a/education/evidencias_abet/PLANTILLA_EVIDENCIA_ABET_TALLER_01_ROS2_CLI.docx
+++ b/education/evidencias_abet/PLANTILLA_EVIDENCIA_ABET_TALLER_01_ROS2_CLI.docx
@@ -520,6 +520,167 @@
           </w:p>
         </w:tc>
       </w:tr>
+      <w:tr>
+        <w:tc>
+          <w:tcPr>
+            <w:tcW w:type="dxa" w:w="5227"/>
+            <w:vAlign w:val="center"/>
+            <w:tcMar>
+              <w:top w:w="35" w:type="dxa"/>
+              <w:start w:w="55" w:type="dxa"/>
+              <w:bottom w:w="35" w:type="dxa"/>
+              <w:end w:w="55" w:type="dxa"/>
+            </w:tcMar>
+            <w:shd w:fill="EAF2F8"/>
+          </w:tcPr>
+          <w:p>
+            <w:pPr>
+              <w:spacing w:after="0"/>
+            </w:pPr>
+            <w:r>
+              <w:rPr>
+                <w:rFonts w:ascii="Arial" w:hAnsi="Arial"/>
+                <w:b/>
+                <w:sz w:val="16"/>
+              </w:rPr>
+              <w:t>Periodo</w:t>
+            </w:r>
+          </w:p>
+        </w:tc>
+        <w:tc>
+          <w:tcPr>
+            <w:tcW w:type="dxa" w:w="5227"/>
+            <w:vAlign w:val="center"/>
+            <w:tcMar>
+              <w:top w:w="35" w:type="dxa"/>
+              <w:start w:w="55" w:type="dxa"/>
+              <w:bottom w:w="35" w:type="dxa"/>
+              <w:end w:w="55" w:type="dxa"/>
+            </w:tcMar>
+            <w:shd w:fill="EAF2F8"/>
+          </w:tcPr>
+          <w:p>
+            <w:pPr>
+              <w:spacing w:after="0"/>
+            </w:pPr>
+            <w:r>
+              <w:rPr>
+                <w:rFonts w:ascii="Arial" w:hAnsi="Arial"/>
+                <w:b w:val="0"/>
+                <w:sz w:val="16"/>
+              </w:rPr>
+              <w:t>2026-2</w:t>
+            </w:r>
+          </w:p>
+        </w:tc>
+      </w:tr>
+      <w:tr>
+        <w:tc>
+          <w:tcPr>
+            <w:tcW w:type="dxa" w:w="5227"/>
+            <w:vAlign w:val="center"/>
+            <w:tcMar>
+              <w:top w:w="35" w:type="dxa"/>
+              <w:start w:w="55" w:type="dxa"/>
+              <w:bottom w:w="35" w:type="dxa"/>
+              <w:end w:w="55" w:type="dxa"/>
+            </w:tcMar>
+            <w:shd w:fill="EAF2F8"/>
+          </w:tcPr>
+          <w:p>
+            <w:pPr>
+              <w:spacing w:after="0"/>
+            </w:pPr>
+            <w:r>
+              <w:rPr>
+                <w:rFonts w:ascii="Arial" w:hAnsi="Arial"/>
+                <w:b/>
+                <w:sz w:val="16"/>
+              </w:rPr>
+              <w:t>Evaluador</w:t>
+            </w:r>
+          </w:p>
+        </w:tc>
+        <w:tc>
+          <w:tcPr>
+            <w:tcW w:type="dxa" w:w="5227"/>
+            <w:vAlign w:val="center"/>
+            <w:tcMar>
+              <w:top w:w="35" w:type="dxa"/>
+              <w:start w:w="55" w:type="dxa"/>
+              <w:bottom w:w="35" w:type="dxa"/>
+              <w:end w:w="55" w:type="dxa"/>
+            </w:tcMar>
+            <w:shd w:fill="EAF2F8"/>
+          </w:tcPr>
+          <w:p>
+            <w:pPr>
+              <w:spacing w:after="0"/>
+            </w:pPr>
+            <w:r>
+              <w:rPr>
+                <w:rFonts w:ascii="Arial" w:hAnsi="Arial"/>
+                <w:b w:val="0"/>
+                <w:sz w:val="16"/>
+              </w:rPr>
+            </w:r>
+          </w:p>
+        </w:tc>
+      </w:tr>
+      <w:tr>
+        <w:tc>
+          <w:tcPr>
+            <w:tcW w:type="dxa" w:w="5227"/>
+            <w:vAlign w:val="center"/>
+            <w:tcMar>
+              <w:top w:w="35" w:type="dxa"/>
+              <w:start w:w="55" w:type="dxa"/>
+              <w:bottom w:w="35" w:type="dxa"/>
+              <w:end w:w="55" w:type="dxa"/>
+            </w:tcMar>
+            <w:shd w:fill="EAF2F8"/>
+          </w:tcPr>
+          <w:p>
+            <w:pPr>
+              <w:spacing w:after="0"/>
+            </w:pPr>
+            <w:r>
+              <w:rPr>
+                <w:rFonts w:ascii="Arial" w:hAnsi="Arial"/>
+                <w:b/>
+                <w:sz w:val="16"/>
+              </w:rPr>
+              <w:t>Versión del instrumento</w:t>
+            </w:r>
+          </w:p>
+        </w:tc>
+        <w:tc>
+          <w:tcPr>
+            <w:tcW w:type="dxa" w:w="5227"/>
+            <w:vAlign w:val="center"/>
+            <w:tcMar>
+              <w:top w:w="35" w:type="dxa"/>
+              <w:start w:w="55" w:type="dxa"/>
+              <w:bottom w:w="35" w:type="dxa"/>
+              <w:end w:w="55" w:type="dxa"/>
+            </w:tcMar>
+            <w:shd w:fill="EAF2F8"/>
+          </w:tcPr>
+          <w:p>
+            <w:pPr>
+              <w:spacing w:after="0"/>
+            </w:pPr>
+            <w:r>
+              <w:rPr>
+                <w:rFonts w:ascii="Arial" w:hAnsi="Arial"/>
+                <w:b w:val="0"/>
+                <w:sz w:val="16"/>
+              </w:rPr>
+              <w:t>1.0</w:t>
+            </w:r>
+          </w:p>
+        </w:tc>
+      </w:tr>
     </w:tbl>
     <w:p>
       <w:pPr>
@@ -545,16 +706,11 @@
         <w:spacing w:after="20"/>
       </w:pPr>
       <w:r>
-        <w:t xml:space="preserve">Quien evalúa marca </w:t>
-      </w:r>
-      <w:r>
         <w:rPr>
-          <w:b/>
+          <w:rFonts w:ascii="Arial" w:hAnsi="Arial"/>
+          <w:sz w:val="18"/>
         </w:rPr>
-        <w:t>una sola casilla por criterio</w:t>
-      </w:r>
-      <w:r>
-        <w:t>, correspondiente al nivel más alto demostrado. El nivel es acumulativo: para marcarlo también deben cumplirse los niveles anteriores.</w:t>
+        <w:t>Quien evalúa marca una sola banda de desempeño por criterio y registra un valor de 0 a 500 dentro del intervalo correspondiente. N3, N4 y N5 muestran progresión de dominio; N1 y N2 son bandas alternativas.</w:t>
       </w:r>
     </w:p>
     <w:p>
@@ -563,7 +719,11 @@
         <w:spacing w:after="20"/>
       </w:pPr>
       <w:r>
-        <w:t>En el consolidado final se copia el aporte indicado en la tabla rápida y se suman los cinco aportes. No se asignan puntajes intermedios.</w:t>
+        <w:rPr>
+          <w:rFonts w:ascii="Arial" w:hAnsi="Arial"/>
+          <w:sz w:val="18"/>
+        </w:rPr>
+        <w:t>Si falta evidencia obligatoria se marca N1 y se registra 0. Zubatronic calcula el aporte ponderado; en una copia manual se usa aporte = valor × peso / 100.</w:t>
       </w:r>
     </w:p>
     <w:tbl>
@@ -598,14 +758,13 @@
           </w:tcPr>
           <w:p>
             <w:pPr>
-              <w:spacing w:after="0" w:line="240" w:lineRule="auto"/>
+              <w:spacing w:after="0"/>
             </w:pPr>
             <w:r>
               <w:rPr>
-                <w:rFonts w:ascii="Aptos" w:hAnsi="Aptos"/>
+                <w:rFonts w:ascii="Arial" w:hAnsi="Arial"/>
                 <w:b/>
-                <w:color w:val="FFFFFF"/>
-                <w:sz w:val="15"/>
+                <w:sz w:val="16"/>
               </w:rPr>
               <w:t>Nivel</w:t>
             </w:r>
@@ -625,16 +784,15 @@
           </w:tcPr>
           <w:p>
             <w:pPr>
-              <w:spacing w:after="0" w:line="240" w:lineRule="auto"/>
+              <w:spacing w:after="0"/>
             </w:pPr>
             <w:r>
               <w:rPr>
-                <w:rFonts w:ascii="Aptos" w:hAnsi="Aptos"/>
+                <w:rFonts w:ascii="Arial" w:hAnsi="Arial"/>
                 <w:b/>
-                <w:color w:val="FFFFFF"/>
-                <w:sz w:val="15"/>
+                <w:sz w:val="16"/>
               </w:rPr>
-              <w:t>Valor fijo</w:t>
+              <w:t>Intervalo Zubatronic / valor guía</w:t>
             </w:r>
           </w:p>
         </w:tc>
@@ -652,14 +810,13 @@
           </w:tcPr>
           <w:p>
             <w:pPr>
-              <w:spacing w:after="0" w:line="240" w:lineRule="auto"/>
+              <w:spacing w:after="0"/>
             </w:pPr>
             <w:r>
               <w:rPr>
-                <w:rFonts w:ascii="Aptos" w:hAnsi="Aptos"/>
+                <w:rFonts w:ascii="Arial" w:hAnsi="Arial"/>
                 <w:b/>
-                <w:color w:val="FFFFFF"/>
-                <w:sz w:val="15"/>
+                <w:sz w:val="16"/>
               </w:rPr>
               <w:t>Interpretación</w:t>
             </w:r>
@@ -683,12 +840,13 @@
           </w:tcPr>
           <w:p>
             <w:pPr>
-              <w:spacing w:after="0" w:line="240" w:lineRule="auto"/>
+              <w:spacing w:after="0"/>
             </w:pPr>
             <w:r>
               <w:rPr>
-                <w:rFonts w:ascii="Aptos" w:hAnsi="Aptos"/>
-                <w:sz w:val="15"/>
+                <w:rFonts w:ascii="Arial" w:hAnsi="Arial"/>
+                <w:b w:val="0"/>
+                <w:sz w:val="16"/>
               </w:rPr>
               <w:t>N5</w:t>
             </w:r>
@@ -707,15 +865,15 @@
           </w:tcPr>
           <w:p>
             <w:pPr>
-              <w:spacing w:after="0" w:line="240" w:lineRule="auto"/>
-              <w:jc w:val="center"/>
+              <w:spacing w:after="0"/>
             </w:pPr>
             <w:r>
               <w:rPr>
-                <w:rFonts w:ascii="Aptos" w:hAnsi="Aptos"/>
-                <w:sz w:val="15"/>
+                <w:rFonts w:ascii="Arial" w:hAnsi="Arial"/>
+                <w:b w:val="0"/>
+                <w:sz w:val="16"/>
               </w:rPr>
-              <w:t>500</w:t>
+              <w:t>475–500 / guía 500</w:t>
             </w:r>
           </w:p>
         </w:tc>
@@ -732,14 +890,15 @@
           </w:tcPr>
           <w:p>
             <w:pPr>
-              <w:spacing w:after="0" w:line="240" w:lineRule="auto"/>
+              <w:spacing w:after="0"/>
             </w:pPr>
             <w:r>
               <w:rPr>
-                <w:rFonts w:ascii="Aptos" w:hAnsi="Aptos"/>
-                <w:sz w:val="15"/>
+                <w:rFonts w:ascii="Arial" w:hAnsi="Arial"/>
+                <w:b w:val="0"/>
+                <w:sz w:val="16"/>
               </w:rPr>
-              <w:t>Excelente: desempeño completo, preciso y reproducible.</w:t>
+              <w:t>Excelente: desempeño completo, preciso, robusto y reproducible.</w:t>
             </w:r>
           </w:p>
         </w:tc>
@@ -762,12 +921,13 @@
           </w:tcPr>
           <w:p>
             <w:pPr>
-              <w:spacing w:after="0" w:line="240" w:lineRule="auto"/>
+              <w:spacing w:after="0"/>
             </w:pPr>
             <w:r>
               <w:rPr>
-                <w:rFonts w:ascii="Aptos" w:hAnsi="Aptos"/>
-                <w:sz w:val="15"/>
+                <w:rFonts w:ascii="Arial" w:hAnsi="Arial"/>
+                <w:b w:val="0"/>
+                <w:sz w:val="16"/>
               </w:rPr>
               <w:t>N4</w:t>
             </w:r>
@@ -787,15 +947,15 @@
           </w:tcPr>
           <w:p>
             <w:pPr>
-              <w:spacing w:after="0" w:line="240" w:lineRule="auto"/>
-              <w:jc w:val="center"/>
+              <w:spacing w:after="0"/>
             </w:pPr>
             <w:r>
               <w:rPr>
-                <w:rFonts w:ascii="Aptos" w:hAnsi="Aptos"/>
-                <w:sz w:val="15"/>
+                <w:rFonts w:ascii="Arial" w:hAnsi="Arial"/>
+                <w:b w:val="0"/>
+                <w:sz w:val="16"/>
               </w:rPr>
-              <w:t>450</w:t>
+              <w:t>400–474 / guía 450</w:t>
             </w:r>
           </w:p>
         </w:tc>
@@ -813,12 +973,13 @@
           </w:tcPr>
           <w:p>
             <w:pPr>
-              <w:spacing w:after="0" w:line="240" w:lineRule="auto"/>
+              <w:spacing w:after="0"/>
             </w:pPr>
             <w:r>
               <w:rPr>
-                <w:rFonts w:ascii="Aptos" w:hAnsi="Aptos"/>
-                <w:sz w:val="15"/>
+                <w:rFonts w:ascii="Arial" w:hAnsi="Arial"/>
+                <w:b w:val="0"/>
+                <w:sz w:val="16"/>
               </w:rPr>
               <w:t>Bueno: desempeño correcto con omisiones menores.</w:t>
             </w:r>
@@ -842,12 +1003,13 @@
           </w:tcPr>
           <w:p>
             <w:pPr>
-              <w:spacing w:after="0" w:line="240" w:lineRule="auto"/>
+              <w:spacing w:after="0"/>
             </w:pPr>
             <w:r>
               <w:rPr>
-                <w:rFonts w:ascii="Aptos" w:hAnsi="Aptos"/>
-                <w:sz w:val="15"/>
+                <w:rFonts w:ascii="Arial" w:hAnsi="Arial"/>
+                <w:b w:val="0"/>
+                <w:sz w:val="16"/>
               </w:rPr>
               <w:t>N3</w:t>
             </w:r>
@@ -866,15 +1028,15 @@
           </w:tcPr>
           <w:p>
             <w:pPr>
-              <w:spacing w:after="0" w:line="240" w:lineRule="auto"/>
-              <w:jc w:val="center"/>
+              <w:spacing w:after="0"/>
             </w:pPr>
             <w:r>
               <w:rPr>
-                <w:rFonts w:ascii="Aptos" w:hAnsi="Aptos"/>
-                <w:sz w:val="15"/>
+                <w:rFonts w:ascii="Arial" w:hAnsi="Arial"/>
+                <w:b w:val="0"/>
+                <w:sz w:val="16"/>
               </w:rPr>
-              <w:t>350</w:t>
+              <w:t>300–399 / guía 350</w:t>
             </w:r>
           </w:p>
         </w:tc>
@@ -891,14 +1053,15 @@
           </w:tcPr>
           <w:p>
             <w:pPr>
-              <w:spacing w:after="0" w:line="240" w:lineRule="auto"/>
+              <w:spacing w:after="0"/>
             </w:pPr>
             <w:r>
               <w:rPr>
-                <w:rFonts w:ascii="Aptos" w:hAnsi="Aptos"/>
-                <w:sz w:val="15"/>
+                <w:rFonts w:ascii="Arial" w:hAnsi="Arial"/>
+                <w:b w:val="0"/>
+                <w:sz w:val="16"/>
               </w:rPr>
-              <w:t>Aceptable: logra lo esencial con explicación parcial.</w:t>
+              <w:t>Aceptable: logra el funcionamiento esencial y presenta evidencia verificable. Umbral de logro.</w:t>
             </w:r>
           </w:p>
         </w:tc>
@@ -921,12 +1084,13 @@
           </w:tcPr>
           <w:p>
             <w:pPr>
-              <w:spacing w:after="0" w:line="240" w:lineRule="auto"/>
+              <w:spacing w:after="0"/>
             </w:pPr>
             <w:r>
               <w:rPr>
-                <w:rFonts w:ascii="Aptos" w:hAnsi="Aptos"/>
-                <w:sz w:val="15"/>
+                <w:rFonts w:ascii="Arial" w:hAnsi="Arial"/>
+                <w:b w:val="0"/>
+                <w:sz w:val="16"/>
               </w:rPr>
               <w:t>N2</w:t>
             </w:r>
@@ -946,15 +1110,15 @@
           </w:tcPr>
           <w:p>
             <w:pPr>
-              <w:spacing w:after="0" w:line="240" w:lineRule="auto"/>
-              <w:jc w:val="center"/>
+              <w:spacing w:after="0"/>
             </w:pPr>
             <w:r>
               <w:rPr>
-                <w:rFonts w:ascii="Aptos" w:hAnsi="Aptos"/>
-                <w:sz w:val="15"/>
+                <w:rFonts w:ascii="Arial" w:hAnsi="Arial"/>
+                <w:b w:val="0"/>
+                <w:sz w:val="16"/>
               </w:rPr>
-              <w:t>250</w:t>
+              <w:t>150–299 / guía 250</w:t>
             </w:r>
           </w:p>
         </w:tc>
@@ -972,14 +1136,15 @@
           </w:tcPr>
           <w:p>
             <w:pPr>
-              <w:spacing w:after="0" w:line="240" w:lineRule="auto"/>
+              <w:spacing w:after="0"/>
             </w:pPr>
             <w:r>
               <w:rPr>
-                <w:rFonts w:ascii="Aptos" w:hAnsi="Aptos"/>
-                <w:sz w:val="15"/>
+                <w:rFonts w:ascii="Arial" w:hAnsi="Arial"/>
+                <w:b w:val="0"/>
+                <w:sz w:val="16"/>
               </w:rPr>
-              <w:t>Parcial: evidencia incompleta o errores importantes.</w:t>
+              <w:t>Cumplimiento parcial: evidencia incompleta o errores importantes.</w:t>
             </w:r>
           </w:p>
         </w:tc>
@@ -1001,12 +1166,13 @@
           </w:tcPr>
           <w:p>
             <w:pPr>
-              <w:spacing w:after="0" w:line="240" w:lineRule="auto"/>
+              <w:spacing w:after="0"/>
             </w:pPr>
             <w:r>
               <w:rPr>
-                <w:rFonts w:ascii="Aptos" w:hAnsi="Aptos"/>
-                <w:sz w:val="15"/>
+                <w:rFonts w:ascii="Arial" w:hAnsi="Arial"/>
+                <w:b w:val="0"/>
+                <w:sz w:val="16"/>
               </w:rPr>
               <w:t>N1</w:t>
             </w:r>
@@ -1025,15 +1191,15 @@
           </w:tcPr>
           <w:p>
             <w:pPr>
-              <w:spacing w:after="0" w:line="240" w:lineRule="auto"/>
-              <w:jc w:val="center"/>
+              <w:spacing w:after="0"/>
             </w:pPr>
             <w:r>
               <w:rPr>
-                <w:rFonts w:ascii="Aptos" w:hAnsi="Aptos"/>
-                <w:sz w:val="15"/>
+                <w:rFonts w:ascii="Arial" w:hAnsi="Arial"/>
+                <w:b w:val="0"/>
+                <w:sz w:val="16"/>
               </w:rPr>
-              <w:t>100</w:t>
+              <w:t>0–149 / guía 100</w:t>
             </w:r>
           </w:p>
         </w:tc>
@@ -1050,95 +1216,15 @@
           </w:tcPr>
           <w:p>
             <w:pPr>
-              <w:spacing w:after="0" w:line="240" w:lineRule="auto"/>
+              <w:spacing w:after="0"/>
             </w:pPr>
             <w:r>
               <w:rPr>
-                <w:rFonts w:ascii="Aptos" w:hAnsi="Aptos"/>
-                <w:sz w:val="15"/>
+                <w:rFonts w:ascii="Arial" w:hAnsi="Arial"/>
+                <w:b w:val="0"/>
+                <w:sz w:val="16"/>
               </w:rPr>
-              <w:t>Inicial: evidencia mínima, fragmentaria o no funcional.</w:t>
-            </w:r>
-          </w:p>
-        </w:tc>
-      </w:tr>
-      <w:tr>
-        <w:trPr>
-          <w:cantSplit/>
-        </w:trPr>
-        <w:tc>
-          <w:tcPr>
-            <w:tcW w:type="dxa" w:w="3485"/>
-            <w:vAlign w:val="center"/>
-            <w:tcMar>
-              <w:top w:w="35" w:type="dxa"/>
-              <w:start w:w="55" w:type="dxa"/>
-              <w:bottom w:w="35" w:type="dxa"/>
-              <w:end w:w="55" w:type="dxa"/>
-            </w:tcMar>
-            <w:shd w:fill="EAF2F8"/>
-          </w:tcPr>
-          <w:p>
-            <w:pPr>
-              <w:spacing w:after="0" w:line="240" w:lineRule="auto"/>
-            </w:pPr>
-            <w:r>
-              <w:rPr>
-                <w:rFonts w:ascii="Aptos" w:hAnsi="Aptos"/>
-                <w:sz w:val="15"/>
-              </w:rPr>
-              <w:t>N0</w:t>
-            </w:r>
-          </w:p>
-        </w:tc>
-        <w:tc>
-          <w:tcPr>
-            <w:tcW w:type="dxa" w:w="3485"/>
-            <w:vAlign w:val="center"/>
-            <w:tcMar>
-              <w:top w:w="35" w:type="dxa"/>
-              <w:start w:w="55" w:type="dxa"/>
-              <w:bottom w:w="35" w:type="dxa"/>
-              <w:end w:w="55" w:type="dxa"/>
-            </w:tcMar>
-            <w:shd w:fill="EAF2F8"/>
-          </w:tcPr>
-          <w:p>
-            <w:pPr>
-              <w:spacing w:after="0" w:line="240" w:lineRule="auto"/>
-              <w:jc w:val="center"/>
-            </w:pPr>
-            <w:r>
-              <w:rPr>
-                <w:rFonts w:ascii="Aptos" w:hAnsi="Aptos"/>
-                <w:sz w:val="15"/>
-              </w:rPr>
-              <w:t>0</w:t>
-            </w:r>
-          </w:p>
-        </w:tc>
-        <w:tc>
-          <w:tcPr>
-            <w:tcW w:type="dxa" w:w="3485"/>
-            <w:vAlign w:val="center"/>
-            <w:tcMar>
-              <w:top w:w="35" w:type="dxa"/>
-              <w:start w:w="55" w:type="dxa"/>
-              <w:bottom w:w="35" w:type="dxa"/>
-              <w:end w:w="55" w:type="dxa"/>
-            </w:tcMar>
-            <w:shd w:fill="EAF2F8"/>
-          </w:tcPr>
-          <w:p>
-            <w:pPr>
-              <w:spacing w:after="0" w:line="240" w:lineRule="auto"/>
-            </w:pPr>
-            <w:r>
-              <w:rPr>
-                <w:rFonts w:ascii="Aptos" w:hAnsi="Aptos"/>
-                <w:sz w:val="15"/>
-              </w:rPr>
-              <w:t>Sin evidencia verificable.</w:t>
+              <w:t>No cumple: evidencia mínima, fragmentaria o no funcional. Sin evidencia obligatoria se registra 0.</w:t>
             </w:r>
           </w:p>
         </w:tc>
@@ -2915,17 +3001,13 @@
       </w:r>
     </w:p>
     <w:p>
-      <w:r>
-        <w:t xml:space="preserve">Marque con una </w:t>
-      </w:r>
+      <w:pPr/>
       <w:r>
         <w:rPr>
-          <w:b/>
+          <w:rFonts w:ascii="Arial" w:hAnsi="Arial"/>
+          <w:sz w:val="18"/>
         </w:rPr>
-        <w:t>X</w:t>
-      </w:r>
-      <w:r>
-        <w:t xml:space="preserve"> una sola casilla en cada criterio. Si no existe evidencia verificable, marque N0.</w:t>
+        <w:t>Marque con una X una sola banda y escriba el valor exacto para Zubatronic. Si no existe evidencia obligatoria verificable, marque N1 y registre 0.</w:t>
       </w:r>
     </w:p>
     <w:p>
@@ -3023,16 +3105,15 @@
           </w:tcPr>
           <w:p>
             <w:pPr>
-              <w:spacing w:after="0" w:line="240" w:lineRule="auto"/>
+              <w:spacing w:after="0"/>
             </w:pPr>
             <w:r>
               <w:rPr>
-                <w:rFonts w:ascii="Aptos" w:hAnsi="Aptos"/>
+                <w:rFonts w:ascii="Arial" w:hAnsi="Arial"/>
                 <w:b/>
-                <w:color w:val="FFFFFF"/>
-                <w:sz w:val="15"/>
+                <w:sz w:val="16"/>
               </w:rPr>
-              <w:t>Evidencia observable acumulativa</w:t>
+              <w:t>Evidencia observable del nivel</w:t>
             </w:r>
           </w:p>
         </w:tc>
@@ -3099,14 +3180,15 @@
           </w:tcPr>
           <w:p>
             <w:pPr>
-              <w:spacing w:after="0" w:line="240" w:lineRule="auto"/>
+              <w:spacing w:after="0"/>
             </w:pPr>
             <w:r>
               <w:rPr>
-                <w:rFonts w:ascii="Aptos" w:hAnsi="Aptos"/>
-                <w:sz w:val="15"/>
+                <w:rFonts w:ascii="Arial" w:hAnsi="Arial"/>
+                <w:b w:val="0"/>
+                <w:sz w:val="16"/>
               </w:rPr>
-              <w:t>N5 — 500</w:t>
+              <w:t>N5 — 475–500</w:t>
             </w:r>
           </w:p>
         </w:tc>
@@ -3199,14 +3281,15 @@
           </w:tcPr>
           <w:p>
             <w:pPr>
-              <w:spacing w:after="0" w:line="240" w:lineRule="auto"/>
+              <w:spacing w:after="0"/>
             </w:pPr>
             <w:r>
               <w:rPr>
-                <w:rFonts w:ascii="Aptos" w:hAnsi="Aptos"/>
-                <w:sz w:val="15"/>
+                <w:rFonts w:ascii="Arial" w:hAnsi="Arial"/>
+                <w:b w:val="0"/>
+                <w:sz w:val="16"/>
               </w:rPr>
-              <w:t>N4 — 450</w:t>
+              <w:t>N4 — 400–474</w:t>
             </w:r>
           </w:p>
         </w:tc>
@@ -3298,14 +3381,15 @@
           </w:tcPr>
           <w:p>
             <w:pPr>
-              <w:spacing w:after="0" w:line="240" w:lineRule="auto"/>
+              <w:spacing w:after="0"/>
             </w:pPr>
             <w:r>
               <w:rPr>
-                <w:rFonts w:ascii="Aptos" w:hAnsi="Aptos"/>
-                <w:sz w:val="15"/>
+                <w:rFonts w:ascii="Arial" w:hAnsi="Arial"/>
+                <w:b w:val="0"/>
+                <w:sz w:val="16"/>
               </w:rPr>
-              <w:t>N3 — 350</w:t>
+              <w:t>N3 — 300–399</w:t>
             </w:r>
           </w:p>
         </w:tc>
@@ -3398,14 +3482,15 @@
           </w:tcPr>
           <w:p>
             <w:pPr>
-              <w:spacing w:after="0" w:line="240" w:lineRule="auto"/>
+              <w:spacing w:after="0"/>
             </w:pPr>
             <w:r>
               <w:rPr>
-                <w:rFonts w:ascii="Aptos" w:hAnsi="Aptos"/>
-                <w:sz w:val="15"/>
+                <w:rFonts w:ascii="Arial" w:hAnsi="Arial"/>
+                <w:b w:val="0"/>
+                <w:sz w:val="16"/>
               </w:rPr>
-              <w:t>N2 — 250</w:t>
+              <w:t>N2 — 150–299</w:t>
             </w:r>
           </w:p>
         </w:tc>
@@ -3497,14 +3582,15 @@
           </w:tcPr>
           <w:p>
             <w:pPr>
-              <w:spacing w:after="0" w:line="240" w:lineRule="auto"/>
+              <w:spacing w:after="0"/>
             </w:pPr>
             <w:r>
               <w:rPr>
-                <w:rFonts w:ascii="Aptos" w:hAnsi="Aptos"/>
-                <w:sz w:val="15"/>
+                <w:rFonts w:ascii="Arial" w:hAnsi="Arial"/>
+                <w:b w:val="0"/>
+                <w:sz w:val="16"/>
               </w:rPr>
-              <w:t>N1 — 100</w:t>
+              <w:t>N1 — 0–149</w:t>
             </w:r>
           </w:p>
         </w:tc>
@@ -3521,129 +3607,28 @@
           </w:tcPr>
           <w:p>
             <w:pPr>
-              <w:spacing w:after="0" w:line="240" w:lineRule="auto"/>
+              <w:spacing w:after="0"/>
             </w:pPr>
             <w:r>
               <w:rPr>
-                <w:rFonts w:ascii="Aptos" w:hAnsi="Aptos"/>
-                <w:sz w:val="15"/>
+                <w:rFonts w:ascii="Arial" w:hAnsi="Arial"/>
+                <w:b w:val="0"/>
+                <w:sz w:val="16"/>
               </w:rPr>
-              <w:t>Presenta evidencia fragmentaria, no funcional o sin interpretación.</w:t>
-            </w:r>
-          </w:p>
-        </w:tc>
-      </w:tr>
-      <w:tr>
-        <w:trPr>
-          <w:cantSplit/>
-        </w:trPr>
-        <w:tc>
-          <w:tcPr>
-            <w:tcW w:type="dxa" w:w="3485"/>
-            <w:vAlign w:val="center"/>
-            <w:tcMar>
-              <w:top w:w="35" w:type="dxa"/>
-              <w:start w:w="55" w:type="dxa"/>
-              <w:bottom w:w="35" w:type="dxa"/>
-              <w:end w:w="55" w:type="dxa"/>
-            </w:tcMar>
-            <w:shd w:fill="EAF2F8"/>
-          </w:tcPr>
-          <w:p>
-            <w:pPr>
-              <w:spacing w:after="0" w:line="240" w:lineRule="auto"/>
-              <w:jc w:val="center"/>
-            </w:pPr>
-            <w:r>
-              <w:rPr>
-                <w:rFonts w:ascii="Aptos" w:hAnsi="Aptos"/>
-                <w:sz w:val="15"/>
-              </w:rPr>
-            </w:r>
-            <w:sdt>
-              <w:sdtPr>
-                <w:alias w:val="Marcar nivel"/>
-                <w:tag w:val="nivel"/>
-                <w:id w:val="-100022"/>
-                <w14:checkbox>
-                  <w14:checked w14:val="0"/>
-                  <w14:checkedState w14:val="2612" w14:font="MS Gothic"/>
-                  <w14:uncheckedState w14:val="2610" w14:font="MS Gothic"/>
-                </w14:checkbox>
-              </w:sdtPr>
-              <w:sdtContent>
-                <w:r>
-                  <w:rPr>
-                    <w:rFonts w:ascii="MS Gothic" w:hAnsi="MS Gothic"/>
-                    <w:sz w:val="22"/>
-                  </w:rPr>
-                  <w:t>☐</w:t>
-                </w:r>
-              </w:sdtContent>
-            </w:sdt>
-          </w:p>
-        </w:tc>
-        <w:tc>
-          <w:tcPr>
-            <w:tcW w:type="dxa" w:w="3485"/>
-            <w:vAlign w:val="center"/>
-            <w:tcMar>
-              <w:top w:w="35" w:type="dxa"/>
-              <w:start w:w="55" w:type="dxa"/>
-              <w:bottom w:w="35" w:type="dxa"/>
-              <w:end w:w="55" w:type="dxa"/>
-            </w:tcMar>
-            <w:shd w:fill="EAF2F8"/>
-          </w:tcPr>
-          <w:p>
-            <w:pPr>
-              <w:spacing w:after="0" w:line="240" w:lineRule="auto"/>
-            </w:pPr>
-            <w:r>
-              <w:rPr>
-                <w:rFonts w:ascii="Aptos" w:hAnsi="Aptos"/>
-                <w:sz w:val="15"/>
-              </w:rPr>
-              <w:t>N0 — 0</w:t>
-            </w:r>
-          </w:p>
-        </w:tc>
-        <w:tc>
-          <w:tcPr>
-            <w:tcW w:type="dxa" w:w="3485"/>
-            <w:vAlign w:val="center"/>
-            <w:tcMar>
-              <w:top w:w="35" w:type="dxa"/>
-              <w:start w:w="55" w:type="dxa"/>
-              <w:bottom w:w="35" w:type="dxa"/>
-              <w:end w:w="55" w:type="dxa"/>
-            </w:tcMar>
-            <w:shd w:fill="EAF2F8"/>
-          </w:tcPr>
-          <w:p>
-            <w:pPr>
-              <w:spacing w:after="0" w:line="240" w:lineRule="auto"/>
-            </w:pPr>
-            <w:r>
-              <w:rPr>
-                <w:rFonts w:ascii="Aptos" w:hAnsi="Aptos"/>
-                <w:sz w:val="15"/>
-              </w:rPr>
-              <w:t>No presenta evidencia verificable para el criterio.</w:t>
+              <w:t>Presenta evidencia fragmentaria, no funcional o sin interpretación; incluye ausencia de evidencia obligatoria.</w:t>
             </w:r>
           </w:p>
         </w:tc>
       </w:tr>
     </w:tbl>
     <w:p>
+      <w:pPr/>
       <w:r>
         <w:rPr>
-          <w:b/>
+          <w:rFonts w:ascii="Arial" w:hAnsi="Arial"/>
+          <w:sz w:val="18"/>
         </w:rPr>
-        <w:t>Nivel C1 marcado:</w:t>
-      </w:r>
-      <w:r>
-        <w:t xml:space="preserve"> ________</w:t>
+        <w:t>Nivel C1 marcado: ________    Valor Zubatronic (0–500): ________</w:t>
       </w:r>
     </w:p>
     <w:p>
@@ -3741,16 +3726,15 @@
           </w:tcPr>
           <w:p>
             <w:pPr>
-              <w:spacing w:after="0" w:line="240" w:lineRule="auto"/>
+              <w:spacing w:after="0"/>
             </w:pPr>
             <w:r>
               <w:rPr>
-                <w:rFonts w:ascii="Aptos" w:hAnsi="Aptos"/>
+                <w:rFonts w:ascii="Arial" w:hAnsi="Arial"/>
                 <w:b/>
-                <w:color w:val="FFFFFF"/>
-                <w:sz w:val="15"/>
+                <w:sz w:val="16"/>
               </w:rPr>
-              <w:t>Evidencia observable acumulativa</w:t>
+              <w:t>Evidencia observable del nivel</w:t>
             </w:r>
           </w:p>
         </w:tc>
@@ -3817,14 +3801,15 @@
           </w:tcPr>
           <w:p>
             <w:pPr>
-              <w:spacing w:after="0" w:line="240" w:lineRule="auto"/>
+              <w:spacing w:after="0"/>
             </w:pPr>
             <w:r>
               <w:rPr>
-                <w:rFonts w:ascii="Aptos" w:hAnsi="Aptos"/>
-                <w:sz w:val="15"/>
+                <w:rFonts w:ascii="Arial" w:hAnsi="Arial"/>
+                <w:b w:val="0"/>
+                <w:sz w:val="16"/>
               </w:rPr>
-              <w:t>N5 — 500</w:t>
+              <w:t>N5 — 475–500</w:t>
             </w:r>
           </w:p>
         </w:tc>
@@ -3947,14 +3932,15 @@
           </w:tcPr>
           <w:p>
             <w:pPr>
-              <w:spacing w:after="0" w:line="240" w:lineRule="auto"/>
+              <w:spacing w:after="0"/>
             </w:pPr>
             <w:r>
               <w:rPr>
-                <w:rFonts w:ascii="Aptos" w:hAnsi="Aptos"/>
-                <w:sz w:val="15"/>
+                <w:rFonts w:ascii="Arial" w:hAnsi="Arial"/>
+                <w:b w:val="0"/>
+                <w:sz w:val="16"/>
               </w:rPr>
-              <w:t>N4 — 450</w:t>
+              <w:t>N4 — 400–474</w:t>
             </w:r>
           </w:p>
         </w:tc>
@@ -4046,14 +4032,15 @@
           </w:tcPr>
           <w:p>
             <w:pPr>
-              <w:spacing w:after="0" w:line="240" w:lineRule="auto"/>
+              <w:spacing w:after="0"/>
             </w:pPr>
             <w:r>
               <w:rPr>
-                <w:rFonts w:ascii="Aptos" w:hAnsi="Aptos"/>
-                <w:sz w:val="15"/>
+                <w:rFonts w:ascii="Arial" w:hAnsi="Arial"/>
+                <w:b w:val="0"/>
+                <w:sz w:val="16"/>
               </w:rPr>
-              <w:t>N3 — 350</w:t>
+              <w:t>N3 — 300–399</w:t>
             </w:r>
           </w:p>
         </w:tc>
@@ -4176,14 +4163,15 @@
           </w:tcPr>
           <w:p>
             <w:pPr>
-              <w:spacing w:after="0" w:line="240" w:lineRule="auto"/>
+              <w:spacing w:after="0"/>
             </w:pPr>
             <w:r>
               <w:rPr>
-                <w:rFonts w:ascii="Aptos" w:hAnsi="Aptos"/>
-                <w:sz w:val="15"/>
+                <w:rFonts w:ascii="Arial" w:hAnsi="Arial"/>
+                <w:b w:val="0"/>
+                <w:sz w:val="16"/>
               </w:rPr>
-              <w:t>N2 — 250</w:t>
+              <w:t>N2 — 150–299</w:t>
             </w:r>
           </w:p>
         </w:tc>
@@ -4275,14 +4263,15 @@
           </w:tcPr>
           <w:p>
             <w:pPr>
-              <w:spacing w:after="0" w:line="240" w:lineRule="auto"/>
+              <w:spacing w:after="0"/>
             </w:pPr>
             <w:r>
               <w:rPr>
-                <w:rFonts w:ascii="Aptos" w:hAnsi="Aptos"/>
-                <w:sz w:val="15"/>
+                <w:rFonts w:ascii="Arial" w:hAnsi="Arial"/>
+                <w:b w:val="0"/>
+                <w:sz w:val="16"/>
               </w:rPr>
-              <w:t>N1 — 100</w:t>
+              <w:t>N1 — 0–149</w:t>
             </w:r>
           </w:p>
         </w:tc>
@@ -4299,129 +4288,28 @@
           </w:tcPr>
           <w:p>
             <w:pPr>
-              <w:spacing w:after="0" w:line="240" w:lineRule="auto"/>
+              <w:spacing w:after="0"/>
             </w:pPr>
             <w:r>
               <w:rPr>
-                <w:rFonts w:ascii="Aptos" w:hAnsi="Aptos"/>
-                <w:sz w:val="15"/>
+                <w:rFonts w:ascii="Arial" w:hAnsi="Arial"/>
+                <w:b w:val="0"/>
+                <w:sz w:val="16"/>
               </w:rPr>
-              <w:t>Presenta intentos sin una publicación funcional verificable.</w:t>
-            </w:r>
-          </w:p>
-        </w:tc>
-      </w:tr>
-      <w:tr>
-        <w:trPr>
-          <w:cantSplit/>
-        </w:trPr>
-        <w:tc>
-          <w:tcPr>
-            <w:tcW w:type="dxa" w:w="3485"/>
-            <w:vAlign w:val="center"/>
-            <w:tcMar>
-              <w:top w:w="35" w:type="dxa"/>
-              <w:start w:w="55" w:type="dxa"/>
-              <w:bottom w:w="35" w:type="dxa"/>
-              <w:end w:w="55" w:type="dxa"/>
-            </w:tcMar>
-            <w:shd w:fill="EAF2F8"/>
-          </w:tcPr>
-          <w:p>
-            <w:pPr>
-              <w:spacing w:after="0" w:line="240" w:lineRule="auto"/>
-              <w:jc w:val="center"/>
-            </w:pPr>
-            <w:r>
-              <w:rPr>
-                <w:rFonts w:ascii="Aptos" w:hAnsi="Aptos"/>
-                <w:sz w:val="15"/>
-              </w:rPr>
-            </w:r>
-            <w:sdt>
-              <w:sdtPr>
-                <w:alias w:val="Marcar nivel"/>
-                <w:tag w:val="nivel"/>
-                <w:id w:val="-100024"/>
-                <w14:checkbox>
-                  <w14:checked w14:val="0"/>
-                  <w14:checkedState w14:val="2612" w14:font="MS Gothic"/>
-                  <w14:uncheckedState w14:val="2610" w14:font="MS Gothic"/>
-                </w14:checkbox>
-              </w:sdtPr>
-              <w:sdtContent>
-                <w:r>
-                  <w:rPr>
-                    <w:rFonts w:ascii="MS Gothic" w:hAnsi="MS Gothic"/>
-                    <w:sz w:val="22"/>
-                  </w:rPr>
-                  <w:t>☐</w:t>
-                </w:r>
-              </w:sdtContent>
-            </w:sdt>
-          </w:p>
-        </w:tc>
-        <w:tc>
-          <w:tcPr>
-            <w:tcW w:type="dxa" w:w="3485"/>
-            <w:vAlign w:val="center"/>
-            <w:tcMar>
-              <w:top w:w="35" w:type="dxa"/>
-              <w:start w:w="55" w:type="dxa"/>
-              <w:bottom w:w="35" w:type="dxa"/>
-              <w:end w:w="55" w:type="dxa"/>
-            </w:tcMar>
-            <w:shd w:fill="EAF2F8"/>
-          </w:tcPr>
-          <w:p>
-            <w:pPr>
-              <w:spacing w:after="0" w:line="240" w:lineRule="auto"/>
-            </w:pPr>
-            <w:r>
-              <w:rPr>
-                <w:rFonts w:ascii="Aptos" w:hAnsi="Aptos"/>
-                <w:sz w:val="15"/>
-              </w:rPr>
-              <w:t>N0 — 0</w:t>
-            </w:r>
-          </w:p>
-        </w:tc>
-        <w:tc>
-          <w:tcPr>
-            <w:tcW w:type="dxa" w:w="3485"/>
-            <w:vAlign w:val="center"/>
-            <w:tcMar>
-              <w:top w:w="35" w:type="dxa"/>
-              <w:start w:w="55" w:type="dxa"/>
-              <w:bottom w:w="35" w:type="dxa"/>
-              <w:end w:w="55" w:type="dxa"/>
-            </w:tcMar>
-            <w:shd w:fill="EAF2F8"/>
-          </w:tcPr>
-          <w:p>
-            <w:pPr>
-              <w:spacing w:after="0" w:line="240" w:lineRule="auto"/>
-            </w:pPr>
-            <w:r>
-              <w:rPr>
-                <w:rFonts w:ascii="Aptos" w:hAnsi="Aptos"/>
-                <w:sz w:val="15"/>
-              </w:rPr>
-              <w:t>No presenta evidencia verificable para el criterio.</w:t>
+              <w:t>Presenta intentos sin una publicación funcional verificable o no presenta la evidencia obligatoria.</w:t>
             </w:r>
           </w:p>
         </w:tc>
       </w:tr>
     </w:tbl>
     <w:p>
+      <w:pPr/>
       <w:r>
         <w:rPr>
-          <w:b/>
+          <w:rFonts w:ascii="Arial" w:hAnsi="Arial"/>
+          <w:sz w:val="18"/>
         </w:rPr>
-        <w:t>Nivel C2 marcado:</w:t>
-      </w:r>
-      <w:r>
-        <w:t xml:space="preserve"> ________</w:t>
+        <w:t>Nivel C2 marcado: ________    Valor Zubatronic (0–500): ________</w:t>
       </w:r>
     </w:p>
     <w:p>
@@ -4524,16 +4412,15 @@
           </w:tcPr>
           <w:p>
             <w:pPr>
-              <w:spacing w:after="0" w:line="240" w:lineRule="auto"/>
+              <w:spacing w:after="0"/>
             </w:pPr>
             <w:r>
               <w:rPr>
-                <w:rFonts w:ascii="Aptos" w:hAnsi="Aptos"/>
+                <w:rFonts w:ascii="Arial" w:hAnsi="Arial"/>
                 <w:b/>
-                <w:color w:val="FFFFFF"/>
-                <w:sz w:val="15"/>
+                <w:sz w:val="16"/>
               </w:rPr>
-              <w:t>Evidencia observable acumulativa</w:t>
+              <w:t>Evidencia observable del nivel</w:t>
             </w:r>
           </w:p>
         </w:tc>
@@ -4600,14 +4487,15 @@
           </w:tcPr>
           <w:p>
             <w:pPr>
-              <w:spacing w:after="0" w:line="240" w:lineRule="auto"/>
+              <w:spacing w:after="0"/>
             </w:pPr>
             <w:r>
               <w:rPr>
-                <w:rFonts w:ascii="Aptos" w:hAnsi="Aptos"/>
-                <w:sz w:val="15"/>
+                <w:rFonts w:ascii="Arial" w:hAnsi="Arial"/>
+                <w:b w:val="0"/>
+                <w:sz w:val="16"/>
               </w:rPr>
-              <w:t>N5 — 500</w:t>
+              <w:t>N5 — 475–500</w:t>
             </w:r>
           </w:p>
         </w:tc>
@@ -4700,14 +4588,15 @@
           </w:tcPr>
           <w:p>
             <w:pPr>
-              <w:spacing w:after="0" w:line="240" w:lineRule="auto"/>
+              <w:spacing w:after="0"/>
             </w:pPr>
             <w:r>
               <w:rPr>
-                <w:rFonts w:ascii="Aptos" w:hAnsi="Aptos"/>
-                <w:sz w:val="15"/>
+                <w:rFonts w:ascii="Arial" w:hAnsi="Arial"/>
+                <w:b w:val="0"/>
+                <w:sz w:val="16"/>
               </w:rPr>
-              <w:t>N4 — 450</w:t>
+              <w:t>N4 — 400–474</w:t>
             </w:r>
           </w:p>
         </w:tc>
@@ -4799,14 +4688,15 @@
           </w:tcPr>
           <w:p>
             <w:pPr>
-              <w:spacing w:after="0" w:line="240" w:lineRule="auto"/>
+              <w:spacing w:after="0"/>
             </w:pPr>
             <w:r>
               <w:rPr>
-                <w:rFonts w:ascii="Aptos" w:hAnsi="Aptos"/>
-                <w:sz w:val="15"/>
+                <w:rFonts w:ascii="Arial" w:hAnsi="Arial"/>
+                <w:b w:val="0"/>
+                <w:sz w:val="16"/>
               </w:rPr>
-              <w:t>N3 — 350</w:t>
+              <w:t>N3 — 300–399</w:t>
             </w:r>
           </w:p>
         </w:tc>
@@ -4944,14 +4834,15 @@
           </w:tcPr>
           <w:p>
             <w:pPr>
-              <w:spacing w:after="0" w:line="240" w:lineRule="auto"/>
+              <w:spacing w:after="0"/>
             </w:pPr>
             <w:r>
               <w:rPr>
-                <w:rFonts w:ascii="Aptos" w:hAnsi="Aptos"/>
-                <w:sz w:val="15"/>
+                <w:rFonts w:ascii="Arial" w:hAnsi="Arial"/>
+                <w:b w:val="0"/>
+                <w:sz w:val="16"/>
               </w:rPr>
-              <w:t>N2 — 250</w:t>
+              <w:t>N2 — 150–299</w:t>
             </w:r>
           </w:p>
         </w:tc>
@@ -5043,14 +4934,15 @@
           </w:tcPr>
           <w:p>
             <w:pPr>
-              <w:spacing w:after="0" w:line="240" w:lineRule="auto"/>
+              <w:spacing w:after="0"/>
             </w:pPr>
             <w:r>
               <w:rPr>
-                <w:rFonts w:ascii="Aptos" w:hAnsi="Aptos"/>
-                <w:sz w:val="15"/>
+                <w:rFonts w:ascii="Arial" w:hAnsi="Arial"/>
+                <w:b w:val="0"/>
+                <w:sz w:val="16"/>
               </w:rPr>
-              <w:t>N1 — 100</w:t>
+              <w:t>N1 — 0–149</w:t>
             </w:r>
           </w:p>
         </w:tc>
@@ -5067,129 +4959,28 @@
           </w:tcPr>
           <w:p>
             <w:pPr>
-              <w:spacing w:after="0" w:line="240" w:lineRule="auto"/>
+              <w:spacing w:after="0"/>
             </w:pPr>
             <w:r>
               <w:rPr>
-                <w:rFonts w:ascii="Aptos" w:hAnsi="Aptos"/>
-                <w:sz w:val="15"/>
+                <w:rFonts w:ascii="Arial" w:hAnsi="Arial"/>
+                <w:b w:val="0"/>
+                <w:sz w:val="16"/>
               </w:rPr>
-              <w:t>Presenta intentos sin operaciones funcionales verificables.</w:t>
-            </w:r>
-          </w:p>
-        </w:tc>
-      </w:tr>
-      <w:tr>
-        <w:trPr>
-          <w:cantSplit/>
-        </w:trPr>
-        <w:tc>
-          <w:tcPr>
-            <w:tcW w:type="dxa" w:w="3485"/>
-            <w:vAlign w:val="center"/>
-            <w:tcMar>
-              <w:top w:w="35" w:type="dxa"/>
-              <w:start w:w="55" w:type="dxa"/>
-              <w:bottom w:w="35" w:type="dxa"/>
-              <w:end w:w="55" w:type="dxa"/>
-            </w:tcMar>
-            <w:shd w:fill="EAF2F8"/>
-          </w:tcPr>
-          <w:p>
-            <w:pPr>
-              <w:spacing w:after="0" w:line="240" w:lineRule="auto"/>
-              <w:jc w:val="center"/>
-            </w:pPr>
-            <w:r>
-              <w:rPr>
-                <w:rFonts w:ascii="Aptos" w:hAnsi="Aptos"/>
-                <w:sz w:val="15"/>
-              </w:rPr>
-            </w:r>
-            <w:sdt>
-              <w:sdtPr>
-                <w:alias w:val="Marcar nivel"/>
-                <w:tag w:val="nivel"/>
-                <w:id w:val="-100027"/>
-                <w14:checkbox>
-                  <w14:checked w14:val="0"/>
-                  <w14:checkedState w14:val="2612" w14:font="MS Gothic"/>
-                  <w14:uncheckedState w14:val="2610" w14:font="MS Gothic"/>
-                </w14:checkbox>
-              </w:sdtPr>
-              <w:sdtContent>
-                <w:r>
-                  <w:rPr>
-                    <w:rFonts w:ascii="MS Gothic" w:hAnsi="MS Gothic"/>
-                    <w:sz w:val="22"/>
-                  </w:rPr>
-                  <w:t>☐</w:t>
-                </w:r>
-              </w:sdtContent>
-            </w:sdt>
-          </w:p>
-        </w:tc>
-        <w:tc>
-          <w:tcPr>
-            <w:tcW w:type="dxa" w:w="3485"/>
-            <w:vAlign w:val="center"/>
-            <w:tcMar>
-              <w:top w:w="35" w:type="dxa"/>
-              <w:start w:w="55" w:type="dxa"/>
-              <w:bottom w:w="35" w:type="dxa"/>
-              <w:end w:w="55" w:type="dxa"/>
-            </w:tcMar>
-            <w:shd w:fill="EAF2F8"/>
-          </w:tcPr>
-          <w:p>
-            <w:pPr>
-              <w:spacing w:after="0" w:line="240" w:lineRule="auto"/>
-            </w:pPr>
-            <w:r>
-              <w:rPr>
-                <w:rFonts w:ascii="Aptos" w:hAnsi="Aptos"/>
-                <w:sz w:val="15"/>
-              </w:rPr>
-              <w:t>N0 — 0</w:t>
-            </w:r>
-          </w:p>
-        </w:tc>
-        <w:tc>
-          <w:tcPr>
-            <w:tcW w:type="dxa" w:w="3485"/>
-            <w:vAlign w:val="center"/>
-            <w:tcMar>
-              <w:top w:w="35" w:type="dxa"/>
-              <w:start w:w="55" w:type="dxa"/>
-              <w:bottom w:w="35" w:type="dxa"/>
-              <w:end w:w="55" w:type="dxa"/>
-            </w:tcMar>
-            <w:shd w:fill="EAF2F8"/>
-          </w:tcPr>
-          <w:p>
-            <w:pPr>
-              <w:spacing w:after="0" w:line="240" w:lineRule="auto"/>
-            </w:pPr>
-            <w:r>
-              <w:rPr>
-                <w:rFonts w:ascii="Aptos" w:hAnsi="Aptos"/>
-                <w:sz w:val="15"/>
-              </w:rPr>
-              <w:t>No presenta evidencia verificable para el criterio.</w:t>
+              <w:t>Presenta intentos sin operaciones funcionales verificables o no presenta la evidencia obligatoria.</w:t>
             </w:r>
           </w:p>
         </w:tc>
       </w:tr>
     </w:tbl>
     <w:p>
+      <w:pPr/>
       <w:r>
         <w:rPr>
-          <w:b/>
+          <w:rFonts w:ascii="Arial" w:hAnsi="Arial"/>
+          <w:sz w:val="18"/>
         </w:rPr>
-        <w:t>Nivel C3 marcado:</w:t>
-      </w:r>
-      <w:r>
-        <w:t xml:space="preserve"> ________</w:t>
+        <w:t>Nivel C3 marcado: ________    Valor Zubatronic (0–500): ________</w:t>
       </w:r>
     </w:p>
     <w:p>
@@ -5298,16 +5089,15 @@
           </w:tcPr>
           <w:p>
             <w:pPr>
-              <w:spacing w:after="0" w:line="240" w:lineRule="auto"/>
+              <w:spacing w:after="0"/>
             </w:pPr>
             <w:r>
               <w:rPr>
-                <w:rFonts w:ascii="Aptos" w:hAnsi="Aptos"/>
+                <w:rFonts w:ascii="Arial" w:hAnsi="Arial"/>
                 <w:b/>
-                <w:color w:val="FFFFFF"/>
-                <w:sz w:val="15"/>
+                <w:sz w:val="16"/>
               </w:rPr>
-              <w:t>Evidencia observable acumulativa</w:t>
+              <w:t>Evidencia observable del nivel</w:t>
             </w:r>
           </w:p>
         </w:tc>
@@ -5374,14 +5164,15 @@
           </w:tcPr>
           <w:p>
             <w:pPr>
-              <w:spacing w:after="0" w:line="240" w:lineRule="auto"/>
+              <w:spacing w:after="0"/>
             </w:pPr>
             <w:r>
               <w:rPr>
-                <w:rFonts w:ascii="Aptos" w:hAnsi="Aptos"/>
-                <w:sz w:val="15"/>
+                <w:rFonts w:ascii="Arial" w:hAnsi="Arial"/>
+                <w:b w:val="0"/>
+                <w:sz w:val="16"/>
               </w:rPr>
-              <w:t>N5 — 500</w:t>
+              <w:t>N5 — 475–500</w:t>
             </w:r>
           </w:p>
         </w:tc>
@@ -5474,14 +5265,15 @@
           </w:tcPr>
           <w:p>
             <w:pPr>
-              <w:spacing w:after="0" w:line="240" w:lineRule="auto"/>
+              <w:spacing w:after="0"/>
             </w:pPr>
             <w:r>
               <w:rPr>
-                <w:rFonts w:ascii="Aptos" w:hAnsi="Aptos"/>
-                <w:sz w:val="15"/>
+                <w:rFonts w:ascii="Arial" w:hAnsi="Arial"/>
+                <w:b w:val="0"/>
+                <w:sz w:val="16"/>
               </w:rPr>
-              <w:t>N4 — 450</w:t>
+              <w:t>N4 — 400–474</w:t>
             </w:r>
           </w:p>
         </w:tc>
@@ -5573,14 +5365,15 @@
           </w:tcPr>
           <w:p>
             <w:pPr>
-              <w:spacing w:after="0" w:line="240" w:lineRule="auto"/>
+              <w:spacing w:after="0"/>
             </w:pPr>
             <w:r>
               <w:rPr>
-                <w:rFonts w:ascii="Aptos" w:hAnsi="Aptos"/>
-                <w:sz w:val="15"/>
+                <w:rFonts w:ascii="Arial" w:hAnsi="Arial"/>
+                <w:b w:val="0"/>
+                <w:sz w:val="16"/>
               </w:rPr>
-              <w:t>N3 — 350</w:t>
+              <w:t>N3 — 300–399</w:t>
             </w:r>
           </w:p>
         </w:tc>
@@ -5673,14 +5466,15 @@
           </w:tcPr>
           <w:p>
             <w:pPr>
-              <w:spacing w:after="0" w:line="240" w:lineRule="auto"/>
+              <w:spacing w:after="0"/>
             </w:pPr>
             <w:r>
               <w:rPr>
-                <w:rFonts w:ascii="Aptos" w:hAnsi="Aptos"/>
-                <w:sz w:val="15"/>
+                <w:rFonts w:ascii="Arial" w:hAnsi="Arial"/>
+                <w:b w:val="0"/>
+                <w:sz w:val="16"/>
               </w:rPr>
-              <w:t>N2 — 250</w:t>
+              <w:t>N2 — 150–299</w:t>
             </w:r>
           </w:p>
         </w:tc>
@@ -5772,14 +5566,15 @@
           </w:tcPr>
           <w:p>
             <w:pPr>
-              <w:spacing w:after="0" w:line="240" w:lineRule="auto"/>
+              <w:spacing w:after="0"/>
             </w:pPr>
             <w:r>
               <w:rPr>
-                <w:rFonts w:ascii="Aptos" w:hAnsi="Aptos"/>
-                <w:sz w:val="15"/>
+                <w:rFonts w:ascii="Arial" w:hAnsi="Arial"/>
+                <w:b w:val="0"/>
+                <w:sz w:val="16"/>
               </w:rPr>
-              <w:t>N1 — 100</w:t>
+              <w:t>N1 — 0–149</w:t>
             </w:r>
           </w:p>
         </w:tc>
@@ -5796,129 +5591,28 @@
           </w:tcPr>
           <w:p>
             <w:pPr>
-              <w:spacing w:after="0" w:line="240" w:lineRule="auto"/>
+              <w:spacing w:after="0"/>
             </w:pPr>
             <w:r>
               <w:rPr>
-                <w:rFonts w:ascii="Aptos" w:hAnsi="Aptos"/>
-                <w:sz w:val="15"/>
+                <w:rFonts w:ascii="Arial" w:hAnsi="Arial"/>
+                <w:b w:val="0"/>
+                <w:sz w:val="16"/>
               </w:rPr>
-              <w:t>Las propuestas son genéricas o no corresponden a la comunicación requerida.</w:t>
-            </w:r>
-          </w:p>
-        </w:tc>
-      </w:tr>
-      <w:tr>
-        <w:trPr>
-          <w:cantSplit/>
-        </w:trPr>
-        <w:tc>
-          <w:tcPr>
-            <w:tcW w:type="dxa" w:w="3485"/>
-            <w:vAlign w:val="center"/>
-            <w:tcMar>
-              <w:top w:w="35" w:type="dxa"/>
-              <w:start w:w="55" w:type="dxa"/>
-              <w:bottom w:w="35" w:type="dxa"/>
-              <w:end w:w="55" w:type="dxa"/>
-            </w:tcMar>
-            <w:shd w:fill="EAF2F8"/>
-          </w:tcPr>
-          <w:p>
-            <w:pPr>
-              <w:spacing w:after="0" w:line="240" w:lineRule="auto"/>
-              <w:jc w:val="center"/>
-            </w:pPr>
-            <w:r>
-              <w:rPr>
-                <w:rFonts w:ascii="Aptos" w:hAnsi="Aptos"/>
-                <w:sz w:val="15"/>
-              </w:rPr>
-            </w:r>
-            <w:sdt>
-              <w:sdtPr>
-                <w:alias w:val="Marcar nivel"/>
-                <w:tag w:val="nivel"/>
-                <w:id w:val="-100029"/>
-                <w14:checkbox>
-                  <w14:checked w14:val="0"/>
-                  <w14:checkedState w14:val="2612" w14:font="MS Gothic"/>
-                  <w14:uncheckedState w14:val="2610" w14:font="MS Gothic"/>
-                </w14:checkbox>
-              </w:sdtPr>
-              <w:sdtContent>
-                <w:r>
-                  <w:rPr>
-                    <w:rFonts w:ascii="MS Gothic" w:hAnsi="MS Gothic"/>
-                    <w:sz w:val="22"/>
-                  </w:rPr>
-                  <w:t>☐</w:t>
-                </w:r>
-              </w:sdtContent>
-            </w:sdt>
-          </w:p>
-        </w:tc>
-        <w:tc>
-          <w:tcPr>
-            <w:tcW w:type="dxa" w:w="3485"/>
-            <w:vAlign w:val="center"/>
-            <w:tcMar>
-              <w:top w:w="35" w:type="dxa"/>
-              <w:start w:w="55" w:type="dxa"/>
-              <w:bottom w:w="35" w:type="dxa"/>
-              <w:end w:w="55" w:type="dxa"/>
-            </w:tcMar>
-            <w:shd w:fill="EAF2F8"/>
-          </w:tcPr>
-          <w:p>
-            <w:pPr>
-              <w:spacing w:after="0" w:line="240" w:lineRule="auto"/>
-            </w:pPr>
-            <w:r>
-              <w:rPr>
-                <w:rFonts w:ascii="Aptos" w:hAnsi="Aptos"/>
-                <w:sz w:val="15"/>
-              </w:rPr>
-              <w:t>N0 — 0</w:t>
-            </w:r>
-          </w:p>
-        </w:tc>
-        <w:tc>
-          <w:tcPr>
-            <w:tcW w:type="dxa" w:w="3485"/>
-            <w:vAlign w:val="center"/>
-            <w:tcMar>
-              <w:top w:w="35" w:type="dxa"/>
-              <w:start w:w="55" w:type="dxa"/>
-              <w:bottom w:w="35" w:type="dxa"/>
-              <w:end w:w="55" w:type="dxa"/>
-            </w:tcMar>
-            <w:shd w:fill="EAF2F8"/>
-          </w:tcPr>
-          <w:p>
-            <w:pPr>
-              <w:spacing w:after="0" w:line="240" w:lineRule="auto"/>
-            </w:pPr>
-            <w:r>
-              <w:rPr>
-                <w:rFonts w:ascii="Aptos" w:hAnsi="Aptos"/>
-                <w:sz w:val="15"/>
-              </w:rPr>
-              <w:t>No presenta evidencia verificable para el criterio.</w:t>
+              <w:t>Las propuestas son genéricas, no corresponden a la comunicación requerida o no se presenta la evidencia obligatoria.</w:t>
             </w:r>
           </w:p>
         </w:tc>
       </w:tr>
     </w:tbl>
     <w:p>
+      <w:pPr/>
       <w:r>
         <w:rPr>
-          <w:b/>
+          <w:rFonts w:ascii="Arial" w:hAnsi="Arial"/>
+          <w:sz w:val="18"/>
         </w:rPr>
-        <w:t>Nivel C4 marcado:</w:t>
-      </w:r>
-      <w:r>
-        <w:t xml:space="preserve"> ________</w:t>
+        <w:t>Nivel C4 marcado: ________    Valor Zubatronic (0–500): ________</w:t>
       </w:r>
     </w:p>
     <w:p>
@@ -6021,16 +5715,15 @@
           </w:tcPr>
           <w:p>
             <w:pPr>
-              <w:spacing w:after="0" w:line="240" w:lineRule="auto"/>
+              <w:spacing w:after="0"/>
             </w:pPr>
             <w:r>
               <w:rPr>
-                <w:rFonts w:ascii="Aptos" w:hAnsi="Aptos"/>
+                <w:rFonts w:ascii="Arial" w:hAnsi="Arial"/>
                 <w:b/>
-                <w:color w:val="FFFFFF"/>
-                <w:sz w:val="15"/>
+                <w:sz w:val="16"/>
               </w:rPr>
-              <w:t>Evidencia observable acumulativa</w:t>
+              <w:t>Evidencia observable del nivel</w:t>
             </w:r>
           </w:p>
         </w:tc>
@@ -6097,14 +5790,15 @@
           </w:tcPr>
           <w:p>
             <w:pPr>
-              <w:spacing w:after="0" w:line="240" w:lineRule="auto"/>
+              <w:spacing w:after="0"/>
             </w:pPr>
             <w:r>
               <w:rPr>
-                <w:rFonts w:ascii="Aptos" w:hAnsi="Aptos"/>
-                <w:sz w:val="15"/>
+                <w:rFonts w:ascii="Arial" w:hAnsi="Arial"/>
+                <w:b w:val="0"/>
+                <w:sz w:val="16"/>
               </w:rPr>
-              <w:t>N5 — 500</w:t>
+              <w:t>N5 — 475–500</w:t>
             </w:r>
           </w:p>
         </w:tc>
@@ -6197,14 +5891,15 @@
           </w:tcPr>
           <w:p>
             <w:pPr>
-              <w:spacing w:after="0" w:line="240" w:lineRule="auto"/>
+              <w:spacing w:after="0"/>
             </w:pPr>
             <w:r>
               <w:rPr>
-                <w:rFonts w:ascii="Aptos" w:hAnsi="Aptos"/>
-                <w:sz w:val="15"/>
+                <w:rFonts w:ascii="Arial" w:hAnsi="Arial"/>
+                <w:b w:val="0"/>
+                <w:sz w:val="16"/>
               </w:rPr>
-              <w:t>N4 — 450</w:t>
+              <w:t>N4 — 400–474</w:t>
             </w:r>
           </w:p>
         </w:tc>
@@ -6296,14 +5991,15 @@
           </w:tcPr>
           <w:p>
             <w:pPr>
-              <w:spacing w:after="0" w:line="240" w:lineRule="auto"/>
+              <w:spacing w:after="0"/>
             </w:pPr>
             <w:r>
               <w:rPr>
-                <w:rFonts w:ascii="Aptos" w:hAnsi="Aptos"/>
-                <w:sz w:val="15"/>
+                <w:rFonts w:ascii="Arial" w:hAnsi="Arial"/>
+                <w:b w:val="0"/>
+                <w:sz w:val="16"/>
               </w:rPr>
-              <w:t>N3 — 350</w:t>
+              <w:t>N3 — 300–399</w:t>
             </w:r>
           </w:p>
         </w:tc>
@@ -6396,14 +6092,15 @@
           </w:tcPr>
           <w:p>
             <w:pPr>
-              <w:spacing w:after="0" w:line="240" w:lineRule="auto"/>
+              <w:spacing w:after="0"/>
             </w:pPr>
             <w:r>
               <w:rPr>
-                <w:rFonts w:ascii="Aptos" w:hAnsi="Aptos"/>
-                <w:sz w:val="15"/>
+                <w:rFonts w:ascii="Arial" w:hAnsi="Arial"/>
+                <w:b w:val="0"/>
+                <w:sz w:val="16"/>
               </w:rPr>
-              <w:t>N2 — 250</w:t>
+              <w:t>N2 — 150–299</w:t>
             </w:r>
           </w:p>
         </w:tc>
@@ -6495,14 +6192,15 @@
           </w:tcPr>
           <w:p>
             <w:pPr>
-              <w:spacing w:after="0" w:line="240" w:lineRule="auto"/>
+              <w:spacing w:after="0"/>
             </w:pPr>
             <w:r>
               <w:rPr>
-                <w:rFonts w:ascii="Aptos" w:hAnsi="Aptos"/>
-                <w:sz w:val="15"/>
+                <w:rFonts w:ascii="Arial" w:hAnsi="Arial"/>
+                <w:b w:val="0"/>
+                <w:sz w:val="16"/>
               </w:rPr>
-              <w:t>N1 — 100</w:t>
+              <w:t>N1 — 0–149</w:t>
             </w:r>
           </w:p>
         </w:tc>
@@ -6519,129 +6217,28 @@
           </w:tcPr>
           <w:p>
             <w:pPr>
-              <w:spacing w:after="0" w:line="240" w:lineRule="auto"/>
+              <w:spacing w:after="0"/>
             </w:pPr>
             <w:r>
               <w:rPr>
-                <w:rFonts w:ascii="Aptos" w:hAnsi="Aptos"/>
-                <w:sz w:val="15"/>
+                <w:rFonts w:ascii="Arial" w:hAnsi="Arial"/>
+                <w:b w:val="0"/>
+                <w:sz w:val="16"/>
               </w:rPr>
-              <w:t>La evidencia es fragmentaria, ilegible o no atribuible a la ejecución solicitada.</w:t>
-            </w:r>
-          </w:p>
-        </w:tc>
-      </w:tr>
-      <w:tr>
-        <w:trPr>
-          <w:cantSplit/>
-        </w:trPr>
-        <w:tc>
-          <w:tcPr>
-            <w:tcW w:type="dxa" w:w="3485"/>
-            <w:vAlign w:val="center"/>
-            <w:tcMar>
-              <w:top w:w="35" w:type="dxa"/>
-              <w:start w:w="55" w:type="dxa"/>
-              <w:bottom w:w="35" w:type="dxa"/>
-              <w:end w:w="55" w:type="dxa"/>
-            </w:tcMar>
-            <w:shd w:fill="EAF2F8"/>
-          </w:tcPr>
-          <w:p>
-            <w:pPr>
-              <w:spacing w:after="0" w:line="240" w:lineRule="auto"/>
-              <w:jc w:val="center"/>
-            </w:pPr>
-            <w:r>
-              <w:rPr>
-                <w:rFonts w:ascii="Aptos" w:hAnsi="Aptos"/>
-                <w:sz w:val="15"/>
-              </w:rPr>
-            </w:r>
-            <w:sdt>
-              <w:sdtPr>
-                <w:alias w:val="Marcar nivel"/>
-                <w:tag w:val="nivel"/>
-                <w:id w:val="-100032"/>
-                <w14:checkbox>
-                  <w14:checked w14:val="0"/>
-                  <w14:checkedState w14:val="2612" w14:font="MS Gothic"/>
-                  <w14:uncheckedState w14:val="2610" w14:font="MS Gothic"/>
-                </w14:checkbox>
-              </w:sdtPr>
-              <w:sdtContent>
-                <w:r>
-                  <w:rPr>
-                    <w:rFonts w:ascii="MS Gothic" w:hAnsi="MS Gothic"/>
-                    <w:sz w:val="22"/>
-                  </w:rPr>
-                  <w:t>☐</w:t>
-                </w:r>
-              </w:sdtContent>
-            </w:sdt>
-          </w:p>
-        </w:tc>
-        <w:tc>
-          <w:tcPr>
-            <w:tcW w:type="dxa" w:w="3485"/>
-            <w:vAlign w:val="center"/>
-            <w:tcMar>
-              <w:top w:w="35" w:type="dxa"/>
-              <w:start w:w="55" w:type="dxa"/>
-              <w:bottom w:w="35" w:type="dxa"/>
-              <w:end w:w="55" w:type="dxa"/>
-            </w:tcMar>
-            <w:shd w:fill="EAF2F8"/>
-          </w:tcPr>
-          <w:p>
-            <w:pPr>
-              <w:spacing w:after="0" w:line="240" w:lineRule="auto"/>
-            </w:pPr>
-            <w:r>
-              <w:rPr>
-                <w:rFonts w:ascii="Aptos" w:hAnsi="Aptos"/>
-                <w:sz w:val="15"/>
-              </w:rPr>
-              <w:t>N0 — 0</w:t>
-            </w:r>
-          </w:p>
-        </w:tc>
-        <w:tc>
-          <w:tcPr>
-            <w:tcW w:type="dxa" w:w="3485"/>
-            <w:vAlign w:val="center"/>
-            <w:tcMar>
-              <w:top w:w="35" w:type="dxa"/>
-              <w:start w:w="55" w:type="dxa"/>
-              <w:bottom w:w="35" w:type="dxa"/>
-              <w:end w:w="55" w:type="dxa"/>
-            </w:tcMar>
-            <w:shd w:fill="EAF2F8"/>
-          </w:tcPr>
-          <w:p>
-            <w:pPr>
-              <w:spacing w:after="0" w:line="240" w:lineRule="auto"/>
-            </w:pPr>
-            <w:r>
-              <w:rPr>
-                <w:rFonts w:ascii="Aptos" w:hAnsi="Aptos"/>
-                <w:sz w:val="15"/>
-              </w:rPr>
-              <w:t>No presenta evidencia verificable para el criterio.</w:t>
+              <w:t>La evidencia es fragmentaria, ilegible, no atribuible o está ausente.</w:t>
             </w:r>
           </w:p>
         </w:tc>
       </w:tr>
     </w:tbl>
     <w:p>
+      <w:pPr/>
       <w:r>
         <w:rPr>
-          <w:b/>
+          <w:rFonts w:ascii="Arial" w:hAnsi="Arial"/>
+          <w:sz w:val="18"/>
         </w:rPr>
-        <w:t>Nivel C5 marcado:</w:t>
-      </w:r>
-      <w:r>
-        <w:t xml:space="preserve"> ________</w:t>
+        <w:t>Nivel C5 marcado: ________    Valor Zubatronic (0–500): ________</w:t>
       </w:r>
     </w:p>
     <w:p>
@@ -6655,1297 +6252,23 @@
         <w:keepNext/>
       </w:pPr>
       <w:r>
-        <w:t>6. Tabla rápida de aportes</w:t>
+        <w:rPr>
+          <w:rFonts w:ascii="Arial" w:hAnsi="Arial"/>
+          <w:sz w:val="18"/>
+        </w:rPr>
+        <w:t>6. Captura y cálculo</w:t>
       </w:r>
     </w:p>
     <w:p>
+      <w:pPr/>
       <w:r>
-        <w:t>Después de marcar cada nivel, copie en el consolidado el aporte correspondiente. Los valores ya incluyen el peso del criterio.</w:t>
+        <w:rPr>
+          <w:rFonts w:ascii="Arial" w:hAnsi="Arial"/>
+          <w:sz w:val="18"/>
+        </w:rPr>
+        <w:t>Capture en Zubatronic el valor exacto de cada criterio. La plataforma calcula: aporte = valor × peso / 100; nota sobre 500 = suma de aportes; nota sobre 5,0 = total / 100. Los valores guía son 500, 450, 350, 250 y 100; sin evidencia obligatoria se registra 0 dentro de N1.</w:t>
       </w:r>
     </w:p>
-    <w:tbl>
-      <w:tblPr>
-        <w:tblStyle w:val="TableGrid"/>
-        <w:tblW w:type="auto" w:w="0"/>
-        <w:jc w:val="center"/>
-        <w:tblLayout w:type="autofit"/>
-        <w:tblLook w:firstColumn="1" w:firstRow="1" w:lastColumn="0" w:lastRow="0" w:noHBand="0" w:noVBand="1" w:val="04A0"/>
-      </w:tblPr>
-      <w:tblGrid>
-        <w:gridCol w:w="1307"/>
-        <w:gridCol w:w="1307"/>
-        <w:gridCol w:w="1307"/>
-        <w:gridCol w:w="1307"/>
-        <w:gridCol w:w="1307"/>
-        <w:gridCol w:w="1307"/>
-        <w:gridCol w:w="1307"/>
-        <w:gridCol w:w="1307"/>
-      </w:tblGrid>
-      <w:tr>
-        <w:trPr>
-          <w:tblHeader w:val="true"/>
-          <w:cantSplit/>
-        </w:trPr>
-        <w:tc>
-          <w:tcPr>
-            <w:tcW w:type="dxa" w:w="1307"/>
-            <w:vAlign w:val="center"/>
-            <w:tcMar>
-              <w:top w:w="35" w:type="dxa"/>
-              <w:start w:w="55" w:type="dxa"/>
-              <w:bottom w:w="35" w:type="dxa"/>
-              <w:end w:w="55" w:type="dxa"/>
-            </w:tcMar>
-            <w:shd w:fill="1F4E78"/>
-          </w:tcPr>
-          <w:p>
-            <w:pPr>
-              <w:spacing w:after="0" w:line="240" w:lineRule="auto"/>
-            </w:pPr>
-            <w:r>
-              <w:rPr>
-                <w:rFonts w:ascii="Aptos" w:hAnsi="Aptos"/>
-                <w:b/>
-                <w:color w:val="FFFFFF"/>
-                <w:sz w:val="15"/>
-              </w:rPr>
-              <w:t>Criterio</w:t>
-            </w:r>
-          </w:p>
-        </w:tc>
-        <w:tc>
-          <w:tcPr>
-            <w:tcW w:type="dxa" w:w="1307"/>
-            <w:vAlign w:val="center"/>
-            <w:tcMar>
-              <w:top w:w="35" w:type="dxa"/>
-              <w:start w:w="55" w:type="dxa"/>
-              <w:bottom w:w="35" w:type="dxa"/>
-              <w:end w:w="55" w:type="dxa"/>
-            </w:tcMar>
-            <w:shd w:fill="1F4E78"/>
-          </w:tcPr>
-          <w:p>
-            <w:pPr>
-              <w:spacing w:after="0" w:line="240" w:lineRule="auto"/>
-            </w:pPr>
-            <w:r>
-              <w:rPr>
-                <w:rFonts w:ascii="Aptos" w:hAnsi="Aptos"/>
-                <w:b/>
-                <w:color w:val="FFFFFF"/>
-                <w:sz w:val="15"/>
-              </w:rPr>
-              <w:t>Peso</w:t>
-            </w:r>
-          </w:p>
-        </w:tc>
-        <w:tc>
-          <w:tcPr>
-            <w:tcW w:type="dxa" w:w="1307"/>
-            <w:vAlign w:val="center"/>
-            <w:tcMar>
-              <w:top w:w="35" w:type="dxa"/>
-              <w:start w:w="55" w:type="dxa"/>
-              <w:bottom w:w="35" w:type="dxa"/>
-              <w:end w:w="55" w:type="dxa"/>
-            </w:tcMar>
-            <w:shd w:fill="1F4E78"/>
-          </w:tcPr>
-          <w:p>
-            <w:pPr>
-              <w:spacing w:after="0" w:line="240" w:lineRule="auto"/>
-              <w:jc w:val="center"/>
-            </w:pPr>
-            <w:r>
-              <w:rPr>
-                <w:rFonts w:ascii="Aptos" w:hAnsi="Aptos"/>
-                <w:b/>
-                <w:color w:val="FFFFFF"/>
-                <w:sz w:val="15"/>
-              </w:rPr>
-              <w:t>N0</w:t>
-            </w:r>
-          </w:p>
-        </w:tc>
-        <w:tc>
-          <w:tcPr>
-            <w:tcW w:type="dxa" w:w="1307"/>
-            <w:vAlign w:val="center"/>
-            <w:tcMar>
-              <w:top w:w="35" w:type="dxa"/>
-              <w:start w:w="55" w:type="dxa"/>
-              <w:bottom w:w="35" w:type="dxa"/>
-              <w:end w:w="55" w:type="dxa"/>
-            </w:tcMar>
-            <w:shd w:fill="1F4E78"/>
-          </w:tcPr>
-          <w:p>
-            <w:pPr>
-              <w:spacing w:after="0" w:line="240" w:lineRule="auto"/>
-              <w:jc w:val="center"/>
-            </w:pPr>
-            <w:r>
-              <w:rPr>
-                <w:rFonts w:ascii="Aptos" w:hAnsi="Aptos"/>
-                <w:b/>
-                <w:color w:val="FFFFFF"/>
-                <w:sz w:val="15"/>
-              </w:rPr>
-              <w:t>N1</w:t>
-            </w:r>
-          </w:p>
-        </w:tc>
-        <w:tc>
-          <w:tcPr>
-            <w:tcW w:type="dxa" w:w="1307"/>
-            <w:vAlign w:val="center"/>
-            <w:tcMar>
-              <w:top w:w="35" w:type="dxa"/>
-              <w:start w:w="55" w:type="dxa"/>
-              <w:bottom w:w="35" w:type="dxa"/>
-              <w:end w:w="55" w:type="dxa"/>
-            </w:tcMar>
-            <w:shd w:fill="1F4E78"/>
-          </w:tcPr>
-          <w:p>
-            <w:pPr>
-              <w:spacing w:after="0" w:line="240" w:lineRule="auto"/>
-              <w:jc w:val="center"/>
-            </w:pPr>
-            <w:r>
-              <w:rPr>
-                <w:rFonts w:ascii="Aptos" w:hAnsi="Aptos"/>
-                <w:b/>
-                <w:color w:val="FFFFFF"/>
-                <w:sz w:val="15"/>
-              </w:rPr>
-              <w:t>N2</w:t>
-            </w:r>
-          </w:p>
-        </w:tc>
-        <w:tc>
-          <w:tcPr>
-            <w:tcW w:type="dxa" w:w="1307"/>
-            <w:vAlign w:val="center"/>
-            <w:tcMar>
-              <w:top w:w="35" w:type="dxa"/>
-              <w:start w:w="55" w:type="dxa"/>
-              <w:bottom w:w="35" w:type="dxa"/>
-              <w:end w:w="55" w:type="dxa"/>
-            </w:tcMar>
-            <w:shd w:fill="1F4E78"/>
-          </w:tcPr>
-          <w:p>
-            <w:pPr>
-              <w:spacing w:after="0" w:line="240" w:lineRule="auto"/>
-              <w:jc w:val="center"/>
-            </w:pPr>
-            <w:r>
-              <w:rPr>
-                <w:rFonts w:ascii="Aptos" w:hAnsi="Aptos"/>
-                <w:b/>
-                <w:color w:val="FFFFFF"/>
-                <w:sz w:val="15"/>
-              </w:rPr>
-              <w:t>N3</w:t>
-            </w:r>
-          </w:p>
-        </w:tc>
-        <w:tc>
-          <w:tcPr>
-            <w:tcW w:type="dxa" w:w="1307"/>
-            <w:vAlign w:val="center"/>
-            <w:tcMar>
-              <w:top w:w="35" w:type="dxa"/>
-              <w:start w:w="55" w:type="dxa"/>
-              <w:bottom w:w="35" w:type="dxa"/>
-              <w:end w:w="55" w:type="dxa"/>
-            </w:tcMar>
-            <w:shd w:fill="1F4E78"/>
-          </w:tcPr>
-          <w:p>
-            <w:pPr>
-              <w:spacing w:after="0" w:line="240" w:lineRule="auto"/>
-              <w:jc w:val="center"/>
-            </w:pPr>
-            <w:r>
-              <w:rPr>
-                <w:rFonts w:ascii="Aptos" w:hAnsi="Aptos"/>
-                <w:b/>
-                <w:color w:val="FFFFFF"/>
-                <w:sz w:val="15"/>
-              </w:rPr>
-              <w:t>N4</w:t>
-            </w:r>
-          </w:p>
-        </w:tc>
-        <w:tc>
-          <w:tcPr>
-            <w:tcW w:type="dxa" w:w="1307"/>
-            <w:vAlign w:val="center"/>
-            <w:tcMar>
-              <w:top w:w="35" w:type="dxa"/>
-              <w:start w:w="55" w:type="dxa"/>
-              <w:bottom w:w="35" w:type="dxa"/>
-              <w:end w:w="55" w:type="dxa"/>
-            </w:tcMar>
-            <w:shd w:fill="1F4E78"/>
-          </w:tcPr>
-          <w:p>
-            <w:pPr>
-              <w:spacing w:after="0" w:line="240" w:lineRule="auto"/>
-              <w:jc w:val="center"/>
-            </w:pPr>
-            <w:r>
-              <w:rPr>
-                <w:rFonts w:ascii="Aptos" w:hAnsi="Aptos"/>
-                <w:b/>
-                <w:color w:val="FFFFFF"/>
-                <w:sz w:val="15"/>
-              </w:rPr>
-              <w:t>N5</w:t>
-            </w:r>
-          </w:p>
-        </w:tc>
-      </w:tr>
-      <w:tr>
-        <w:trPr>
-          <w:cantSplit/>
-        </w:trPr>
-        <w:tc>
-          <w:tcPr>
-            <w:tcW w:type="dxa" w:w="1307"/>
-            <w:vAlign w:val="center"/>
-            <w:tcMar>
-              <w:top w:w="35" w:type="dxa"/>
-              <w:start w:w="55" w:type="dxa"/>
-              <w:bottom w:w="35" w:type="dxa"/>
-              <w:end w:w="55" w:type="dxa"/>
-            </w:tcMar>
-          </w:tcPr>
-          <w:p>
-            <w:pPr>
-              <w:spacing w:after="0" w:line="240" w:lineRule="auto"/>
-            </w:pPr>
-            <w:r>
-              <w:rPr>
-                <w:rFonts w:ascii="Aptos" w:hAnsi="Aptos"/>
-                <w:sz w:val="15"/>
-              </w:rPr>
-              <w:t>C1</w:t>
-            </w:r>
-          </w:p>
-        </w:tc>
-        <w:tc>
-          <w:tcPr>
-            <w:tcW w:type="dxa" w:w="1307"/>
-            <w:vAlign w:val="center"/>
-            <w:tcMar>
-              <w:top w:w="35" w:type="dxa"/>
-              <w:start w:w="55" w:type="dxa"/>
-              <w:bottom w:w="35" w:type="dxa"/>
-              <w:end w:w="55" w:type="dxa"/>
-            </w:tcMar>
-          </w:tcPr>
-          <w:p>
-            <w:pPr>
-              <w:spacing w:after="0" w:line="240" w:lineRule="auto"/>
-              <w:jc w:val="center"/>
-            </w:pPr>
-            <w:r>
-              <w:rPr>
-                <w:rFonts w:ascii="Aptos" w:hAnsi="Aptos"/>
-                <w:sz w:val="15"/>
-              </w:rPr>
-              <w:t>25%</w:t>
-            </w:r>
-          </w:p>
-        </w:tc>
-        <w:tc>
-          <w:tcPr>
-            <w:tcW w:type="dxa" w:w="1307"/>
-            <w:vAlign w:val="center"/>
-            <w:tcMar>
-              <w:top w:w="35" w:type="dxa"/>
-              <w:start w:w="55" w:type="dxa"/>
-              <w:bottom w:w="35" w:type="dxa"/>
-              <w:end w:w="55" w:type="dxa"/>
-            </w:tcMar>
-          </w:tcPr>
-          <w:p>
-            <w:pPr>
-              <w:spacing w:after="0" w:line="240" w:lineRule="auto"/>
-              <w:jc w:val="center"/>
-            </w:pPr>
-            <w:r>
-              <w:rPr>
-                <w:rFonts w:ascii="Aptos" w:hAnsi="Aptos"/>
-                <w:sz w:val="15"/>
-              </w:rPr>
-              <w:t>0</w:t>
-            </w:r>
-          </w:p>
-        </w:tc>
-        <w:tc>
-          <w:tcPr>
-            <w:tcW w:type="dxa" w:w="1307"/>
-            <w:vAlign w:val="center"/>
-            <w:tcMar>
-              <w:top w:w="35" w:type="dxa"/>
-              <w:start w:w="55" w:type="dxa"/>
-              <w:bottom w:w="35" w:type="dxa"/>
-              <w:end w:w="55" w:type="dxa"/>
-            </w:tcMar>
-          </w:tcPr>
-          <w:p>
-            <w:pPr>
-              <w:spacing w:after="0" w:line="240" w:lineRule="auto"/>
-              <w:jc w:val="center"/>
-            </w:pPr>
-            <w:r>
-              <w:rPr>
-                <w:rFonts w:ascii="Aptos" w:hAnsi="Aptos"/>
-                <w:sz w:val="15"/>
-              </w:rPr>
-              <w:t>25</w:t>
-            </w:r>
-          </w:p>
-        </w:tc>
-        <w:tc>
-          <w:tcPr>
-            <w:tcW w:type="dxa" w:w="1307"/>
-            <w:vAlign w:val="center"/>
-            <w:tcMar>
-              <w:top w:w="35" w:type="dxa"/>
-              <w:start w:w="55" w:type="dxa"/>
-              <w:bottom w:w="35" w:type="dxa"/>
-              <w:end w:w="55" w:type="dxa"/>
-            </w:tcMar>
-          </w:tcPr>
-          <w:p>
-            <w:pPr>
-              <w:spacing w:after="0" w:line="240" w:lineRule="auto"/>
-              <w:jc w:val="center"/>
-            </w:pPr>
-            <w:r>
-              <w:rPr>
-                <w:rFonts w:ascii="Aptos" w:hAnsi="Aptos"/>
-                <w:sz w:val="15"/>
-              </w:rPr>
-              <w:t>62,5</w:t>
-            </w:r>
-          </w:p>
-        </w:tc>
-        <w:tc>
-          <w:tcPr>
-            <w:tcW w:type="dxa" w:w="1307"/>
-            <w:vAlign w:val="center"/>
-            <w:tcMar>
-              <w:top w:w="35" w:type="dxa"/>
-              <w:start w:w="55" w:type="dxa"/>
-              <w:bottom w:w="35" w:type="dxa"/>
-              <w:end w:w="55" w:type="dxa"/>
-            </w:tcMar>
-          </w:tcPr>
-          <w:p>
-            <w:pPr>
-              <w:spacing w:after="0" w:line="240" w:lineRule="auto"/>
-              <w:jc w:val="center"/>
-            </w:pPr>
-            <w:r>
-              <w:rPr>
-                <w:rFonts w:ascii="Aptos" w:hAnsi="Aptos"/>
-                <w:sz w:val="15"/>
-              </w:rPr>
-              <w:t>87,5</w:t>
-            </w:r>
-          </w:p>
-        </w:tc>
-        <w:tc>
-          <w:tcPr>
-            <w:tcW w:type="dxa" w:w="1307"/>
-            <w:vAlign w:val="center"/>
-            <w:tcMar>
-              <w:top w:w="35" w:type="dxa"/>
-              <w:start w:w="55" w:type="dxa"/>
-              <w:bottom w:w="35" w:type="dxa"/>
-              <w:end w:w="55" w:type="dxa"/>
-            </w:tcMar>
-          </w:tcPr>
-          <w:p>
-            <w:pPr>
-              <w:spacing w:after="0" w:line="240" w:lineRule="auto"/>
-              <w:jc w:val="center"/>
-            </w:pPr>
-            <w:r>
-              <w:rPr>
-                <w:rFonts w:ascii="Aptos" w:hAnsi="Aptos"/>
-                <w:sz w:val="15"/>
-              </w:rPr>
-              <w:t>112,5</w:t>
-            </w:r>
-          </w:p>
-        </w:tc>
-        <w:tc>
-          <w:tcPr>
-            <w:tcW w:type="dxa" w:w="1307"/>
-            <w:vAlign w:val="center"/>
-            <w:tcMar>
-              <w:top w:w="35" w:type="dxa"/>
-              <w:start w:w="55" w:type="dxa"/>
-              <w:bottom w:w="35" w:type="dxa"/>
-              <w:end w:w="55" w:type="dxa"/>
-            </w:tcMar>
-          </w:tcPr>
-          <w:p>
-            <w:pPr>
-              <w:spacing w:after="0" w:line="240" w:lineRule="auto"/>
-              <w:jc w:val="center"/>
-            </w:pPr>
-            <w:r>
-              <w:rPr>
-                <w:rFonts w:ascii="Aptos" w:hAnsi="Aptos"/>
-                <w:sz w:val="15"/>
-              </w:rPr>
-              <w:t>125</w:t>
-            </w:r>
-          </w:p>
-        </w:tc>
-      </w:tr>
-      <w:tr>
-        <w:trPr>
-          <w:cantSplit/>
-        </w:trPr>
-        <w:tc>
-          <w:tcPr>
-            <w:tcW w:type="dxa" w:w="1307"/>
-            <w:vAlign w:val="center"/>
-            <w:tcMar>
-              <w:top w:w="35" w:type="dxa"/>
-              <w:start w:w="55" w:type="dxa"/>
-              <w:bottom w:w="35" w:type="dxa"/>
-              <w:end w:w="55" w:type="dxa"/>
-            </w:tcMar>
-            <w:shd w:fill="EAF2F8"/>
-          </w:tcPr>
-          <w:p>
-            <w:pPr>
-              <w:spacing w:after="0" w:line="240" w:lineRule="auto"/>
-            </w:pPr>
-            <w:r>
-              <w:rPr>
-                <w:rFonts w:ascii="Aptos" w:hAnsi="Aptos"/>
-                <w:sz w:val="15"/>
-              </w:rPr>
-              <w:t>C2</w:t>
-            </w:r>
-          </w:p>
-        </w:tc>
-        <w:tc>
-          <w:tcPr>
-            <w:tcW w:type="dxa" w:w="1307"/>
-            <w:vAlign w:val="center"/>
-            <w:tcMar>
-              <w:top w:w="35" w:type="dxa"/>
-              <w:start w:w="55" w:type="dxa"/>
-              <w:bottom w:w="35" w:type="dxa"/>
-              <w:end w:w="55" w:type="dxa"/>
-            </w:tcMar>
-            <w:shd w:fill="EAF2F8"/>
-          </w:tcPr>
-          <w:p>
-            <w:pPr>
-              <w:spacing w:after="0" w:line="240" w:lineRule="auto"/>
-              <w:jc w:val="center"/>
-            </w:pPr>
-            <w:r>
-              <w:rPr>
-                <w:rFonts w:ascii="Aptos" w:hAnsi="Aptos"/>
-                <w:sz w:val="15"/>
-              </w:rPr>
-              <w:t>20%</w:t>
-            </w:r>
-          </w:p>
-        </w:tc>
-        <w:tc>
-          <w:tcPr>
-            <w:tcW w:type="dxa" w:w="1307"/>
-            <w:vAlign w:val="center"/>
-            <w:tcMar>
-              <w:top w:w="35" w:type="dxa"/>
-              <w:start w:w="55" w:type="dxa"/>
-              <w:bottom w:w="35" w:type="dxa"/>
-              <w:end w:w="55" w:type="dxa"/>
-            </w:tcMar>
-            <w:shd w:fill="EAF2F8"/>
-          </w:tcPr>
-          <w:p>
-            <w:pPr>
-              <w:spacing w:after="0" w:line="240" w:lineRule="auto"/>
-              <w:jc w:val="center"/>
-            </w:pPr>
-            <w:r>
-              <w:rPr>
-                <w:rFonts w:ascii="Aptos" w:hAnsi="Aptos"/>
-                <w:sz w:val="15"/>
-              </w:rPr>
-              <w:t>0</w:t>
-            </w:r>
-          </w:p>
-        </w:tc>
-        <w:tc>
-          <w:tcPr>
-            <w:tcW w:type="dxa" w:w="1307"/>
-            <w:vAlign w:val="center"/>
-            <w:tcMar>
-              <w:top w:w="35" w:type="dxa"/>
-              <w:start w:w="55" w:type="dxa"/>
-              <w:bottom w:w="35" w:type="dxa"/>
-              <w:end w:w="55" w:type="dxa"/>
-            </w:tcMar>
-            <w:shd w:fill="EAF2F8"/>
-          </w:tcPr>
-          <w:p>
-            <w:pPr>
-              <w:spacing w:after="0" w:line="240" w:lineRule="auto"/>
-              <w:jc w:val="center"/>
-            </w:pPr>
-            <w:r>
-              <w:rPr>
-                <w:rFonts w:ascii="Aptos" w:hAnsi="Aptos"/>
-                <w:sz w:val="15"/>
-              </w:rPr>
-              <w:t>20</w:t>
-            </w:r>
-          </w:p>
-        </w:tc>
-        <w:tc>
-          <w:tcPr>
-            <w:tcW w:type="dxa" w:w="1307"/>
-            <w:vAlign w:val="center"/>
-            <w:tcMar>
-              <w:top w:w="35" w:type="dxa"/>
-              <w:start w:w="55" w:type="dxa"/>
-              <w:bottom w:w="35" w:type="dxa"/>
-              <w:end w:w="55" w:type="dxa"/>
-            </w:tcMar>
-            <w:shd w:fill="EAF2F8"/>
-          </w:tcPr>
-          <w:p>
-            <w:pPr>
-              <w:spacing w:after="0" w:line="240" w:lineRule="auto"/>
-              <w:jc w:val="center"/>
-            </w:pPr>
-            <w:r>
-              <w:rPr>
-                <w:rFonts w:ascii="Aptos" w:hAnsi="Aptos"/>
-                <w:sz w:val="15"/>
-              </w:rPr>
-              <w:t>50</w:t>
-            </w:r>
-          </w:p>
-        </w:tc>
-        <w:tc>
-          <w:tcPr>
-            <w:tcW w:type="dxa" w:w="1307"/>
-            <w:vAlign w:val="center"/>
-            <w:tcMar>
-              <w:top w:w="35" w:type="dxa"/>
-              <w:start w:w="55" w:type="dxa"/>
-              <w:bottom w:w="35" w:type="dxa"/>
-              <w:end w:w="55" w:type="dxa"/>
-            </w:tcMar>
-            <w:shd w:fill="EAF2F8"/>
-          </w:tcPr>
-          <w:p>
-            <w:pPr>
-              <w:spacing w:after="0" w:line="240" w:lineRule="auto"/>
-              <w:jc w:val="center"/>
-            </w:pPr>
-            <w:r>
-              <w:rPr>
-                <w:rFonts w:ascii="Aptos" w:hAnsi="Aptos"/>
-                <w:sz w:val="15"/>
-              </w:rPr>
-              <w:t>70</w:t>
-            </w:r>
-          </w:p>
-        </w:tc>
-        <w:tc>
-          <w:tcPr>
-            <w:tcW w:type="dxa" w:w="1307"/>
-            <w:vAlign w:val="center"/>
-            <w:tcMar>
-              <w:top w:w="35" w:type="dxa"/>
-              <w:start w:w="55" w:type="dxa"/>
-              <w:bottom w:w="35" w:type="dxa"/>
-              <w:end w:w="55" w:type="dxa"/>
-            </w:tcMar>
-            <w:shd w:fill="EAF2F8"/>
-          </w:tcPr>
-          <w:p>
-            <w:pPr>
-              <w:spacing w:after="0" w:line="240" w:lineRule="auto"/>
-              <w:jc w:val="center"/>
-            </w:pPr>
-            <w:r>
-              <w:rPr>
-                <w:rFonts w:ascii="Aptos" w:hAnsi="Aptos"/>
-                <w:sz w:val="15"/>
-              </w:rPr>
-              <w:t>90</w:t>
-            </w:r>
-          </w:p>
-        </w:tc>
-        <w:tc>
-          <w:tcPr>
-            <w:tcW w:type="dxa" w:w="1307"/>
-            <w:vAlign w:val="center"/>
-            <w:tcMar>
-              <w:top w:w="35" w:type="dxa"/>
-              <w:start w:w="55" w:type="dxa"/>
-              <w:bottom w:w="35" w:type="dxa"/>
-              <w:end w:w="55" w:type="dxa"/>
-            </w:tcMar>
-            <w:shd w:fill="EAF2F8"/>
-          </w:tcPr>
-          <w:p>
-            <w:pPr>
-              <w:spacing w:after="0" w:line="240" w:lineRule="auto"/>
-              <w:jc w:val="center"/>
-            </w:pPr>
-            <w:r>
-              <w:rPr>
-                <w:rFonts w:ascii="Aptos" w:hAnsi="Aptos"/>
-                <w:sz w:val="15"/>
-              </w:rPr>
-              <w:t>100</w:t>
-            </w:r>
-          </w:p>
-        </w:tc>
-      </w:tr>
-      <w:tr>
-        <w:trPr>
-          <w:cantSplit/>
-        </w:trPr>
-        <w:tc>
-          <w:tcPr>
-            <w:tcW w:type="dxa" w:w="1307"/>
-            <w:vAlign w:val="center"/>
-            <w:tcMar>
-              <w:top w:w="35" w:type="dxa"/>
-              <w:start w:w="55" w:type="dxa"/>
-              <w:bottom w:w="35" w:type="dxa"/>
-              <w:end w:w="55" w:type="dxa"/>
-            </w:tcMar>
-          </w:tcPr>
-          <w:p>
-            <w:pPr>
-              <w:spacing w:after="0" w:line="240" w:lineRule="auto"/>
-            </w:pPr>
-            <w:r>
-              <w:rPr>
-                <w:rFonts w:ascii="Aptos" w:hAnsi="Aptos"/>
-                <w:sz w:val="15"/>
-              </w:rPr>
-              <w:t>C3</w:t>
-            </w:r>
-          </w:p>
-        </w:tc>
-        <w:tc>
-          <w:tcPr>
-            <w:tcW w:type="dxa" w:w="1307"/>
-            <w:vAlign w:val="center"/>
-            <w:tcMar>
-              <w:top w:w="35" w:type="dxa"/>
-              <w:start w:w="55" w:type="dxa"/>
-              <w:bottom w:w="35" w:type="dxa"/>
-              <w:end w:w="55" w:type="dxa"/>
-            </w:tcMar>
-          </w:tcPr>
-          <w:p>
-            <w:pPr>
-              <w:spacing w:after="0" w:line="240" w:lineRule="auto"/>
-              <w:jc w:val="center"/>
-            </w:pPr>
-            <w:r>
-              <w:rPr>
-                <w:rFonts w:ascii="Aptos" w:hAnsi="Aptos"/>
-                <w:sz w:val="15"/>
-              </w:rPr>
-              <w:t>20%</w:t>
-            </w:r>
-          </w:p>
-        </w:tc>
-        <w:tc>
-          <w:tcPr>
-            <w:tcW w:type="dxa" w:w="1307"/>
-            <w:vAlign w:val="center"/>
-            <w:tcMar>
-              <w:top w:w="35" w:type="dxa"/>
-              <w:start w:w="55" w:type="dxa"/>
-              <w:bottom w:w="35" w:type="dxa"/>
-              <w:end w:w="55" w:type="dxa"/>
-            </w:tcMar>
-          </w:tcPr>
-          <w:p>
-            <w:pPr>
-              <w:spacing w:after="0" w:line="240" w:lineRule="auto"/>
-              <w:jc w:val="center"/>
-            </w:pPr>
-            <w:r>
-              <w:rPr>
-                <w:rFonts w:ascii="Aptos" w:hAnsi="Aptos"/>
-                <w:sz w:val="15"/>
-              </w:rPr>
-              <w:t>0</w:t>
-            </w:r>
-          </w:p>
-        </w:tc>
-        <w:tc>
-          <w:tcPr>
-            <w:tcW w:type="dxa" w:w="1307"/>
-            <w:vAlign w:val="center"/>
-            <w:tcMar>
-              <w:top w:w="35" w:type="dxa"/>
-              <w:start w:w="55" w:type="dxa"/>
-              <w:bottom w:w="35" w:type="dxa"/>
-              <w:end w:w="55" w:type="dxa"/>
-            </w:tcMar>
-          </w:tcPr>
-          <w:p>
-            <w:pPr>
-              <w:spacing w:after="0" w:line="240" w:lineRule="auto"/>
-              <w:jc w:val="center"/>
-            </w:pPr>
-            <w:r>
-              <w:rPr>
-                <w:rFonts w:ascii="Aptos" w:hAnsi="Aptos"/>
-                <w:sz w:val="15"/>
-              </w:rPr>
-              <w:t>20</w:t>
-            </w:r>
-          </w:p>
-        </w:tc>
-        <w:tc>
-          <w:tcPr>
-            <w:tcW w:type="dxa" w:w="1307"/>
-            <w:vAlign w:val="center"/>
-            <w:tcMar>
-              <w:top w:w="35" w:type="dxa"/>
-              <w:start w:w="55" w:type="dxa"/>
-              <w:bottom w:w="35" w:type="dxa"/>
-              <w:end w:w="55" w:type="dxa"/>
-            </w:tcMar>
-          </w:tcPr>
-          <w:p>
-            <w:pPr>
-              <w:spacing w:after="0" w:line="240" w:lineRule="auto"/>
-              <w:jc w:val="center"/>
-            </w:pPr>
-            <w:r>
-              <w:rPr>
-                <w:rFonts w:ascii="Aptos" w:hAnsi="Aptos"/>
-                <w:sz w:val="15"/>
-              </w:rPr>
-              <w:t>50</w:t>
-            </w:r>
-          </w:p>
-        </w:tc>
-        <w:tc>
-          <w:tcPr>
-            <w:tcW w:type="dxa" w:w="1307"/>
-            <w:vAlign w:val="center"/>
-            <w:tcMar>
-              <w:top w:w="35" w:type="dxa"/>
-              <w:start w:w="55" w:type="dxa"/>
-              <w:bottom w:w="35" w:type="dxa"/>
-              <w:end w:w="55" w:type="dxa"/>
-            </w:tcMar>
-          </w:tcPr>
-          <w:p>
-            <w:pPr>
-              <w:spacing w:after="0" w:line="240" w:lineRule="auto"/>
-              <w:jc w:val="center"/>
-            </w:pPr>
-            <w:r>
-              <w:rPr>
-                <w:rFonts w:ascii="Aptos" w:hAnsi="Aptos"/>
-                <w:sz w:val="15"/>
-              </w:rPr>
-              <w:t>70</w:t>
-            </w:r>
-          </w:p>
-        </w:tc>
-        <w:tc>
-          <w:tcPr>
-            <w:tcW w:type="dxa" w:w="1307"/>
-            <w:vAlign w:val="center"/>
-            <w:tcMar>
-              <w:top w:w="35" w:type="dxa"/>
-              <w:start w:w="55" w:type="dxa"/>
-              <w:bottom w:w="35" w:type="dxa"/>
-              <w:end w:w="55" w:type="dxa"/>
-            </w:tcMar>
-          </w:tcPr>
-          <w:p>
-            <w:pPr>
-              <w:spacing w:after="0" w:line="240" w:lineRule="auto"/>
-              <w:jc w:val="center"/>
-            </w:pPr>
-            <w:r>
-              <w:rPr>
-                <w:rFonts w:ascii="Aptos" w:hAnsi="Aptos"/>
-                <w:sz w:val="15"/>
-              </w:rPr>
-              <w:t>90</w:t>
-            </w:r>
-          </w:p>
-        </w:tc>
-        <w:tc>
-          <w:tcPr>
-            <w:tcW w:type="dxa" w:w="1307"/>
-            <w:vAlign w:val="center"/>
-            <w:tcMar>
-              <w:top w:w="35" w:type="dxa"/>
-              <w:start w:w="55" w:type="dxa"/>
-              <w:bottom w:w="35" w:type="dxa"/>
-              <w:end w:w="55" w:type="dxa"/>
-            </w:tcMar>
-          </w:tcPr>
-          <w:p>
-            <w:pPr>
-              <w:spacing w:after="0" w:line="240" w:lineRule="auto"/>
-              <w:jc w:val="center"/>
-            </w:pPr>
-            <w:r>
-              <w:rPr>
-                <w:rFonts w:ascii="Aptos" w:hAnsi="Aptos"/>
-                <w:sz w:val="15"/>
-              </w:rPr>
-              <w:t>100</w:t>
-            </w:r>
-          </w:p>
-        </w:tc>
-      </w:tr>
-      <w:tr>
-        <w:trPr>
-          <w:cantSplit/>
-        </w:trPr>
-        <w:tc>
-          <w:tcPr>
-            <w:tcW w:type="dxa" w:w="1307"/>
-            <w:vAlign w:val="center"/>
-            <w:tcMar>
-              <w:top w:w="35" w:type="dxa"/>
-              <w:start w:w="55" w:type="dxa"/>
-              <w:bottom w:w="35" w:type="dxa"/>
-              <w:end w:w="55" w:type="dxa"/>
-            </w:tcMar>
-            <w:shd w:fill="EAF2F8"/>
-          </w:tcPr>
-          <w:p>
-            <w:pPr>
-              <w:spacing w:after="0" w:line="240" w:lineRule="auto"/>
-            </w:pPr>
-            <w:r>
-              <w:rPr>
-                <w:rFonts w:ascii="Aptos" w:hAnsi="Aptos"/>
-                <w:sz w:val="15"/>
-              </w:rPr>
-              <w:t>C4</w:t>
-            </w:r>
-          </w:p>
-        </w:tc>
-        <w:tc>
-          <w:tcPr>
-            <w:tcW w:type="dxa" w:w="1307"/>
-            <w:vAlign w:val="center"/>
-            <w:tcMar>
-              <w:top w:w="35" w:type="dxa"/>
-              <w:start w:w="55" w:type="dxa"/>
-              <w:bottom w:w="35" w:type="dxa"/>
-              <w:end w:w="55" w:type="dxa"/>
-            </w:tcMar>
-            <w:shd w:fill="EAF2F8"/>
-          </w:tcPr>
-          <w:p>
-            <w:pPr>
-              <w:spacing w:after="0" w:line="240" w:lineRule="auto"/>
-              <w:jc w:val="center"/>
-            </w:pPr>
-            <w:r>
-              <w:rPr>
-                <w:rFonts w:ascii="Aptos" w:hAnsi="Aptos"/>
-                <w:sz w:val="15"/>
-              </w:rPr>
-              <w:t>20%</w:t>
-            </w:r>
-          </w:p>
-        </w:tc>
-        <w:tc>
-          <w:tcPr>
-            <w:tcW w:type="dxa" w:w="1307"/>
-            <w:vAlign w:val="center"/>
-            <w:tcMar>
-              <w:top w:w="35" w:type="dxa"/>
-              <w:start w:w="55" w:type="dxa"/>
-              <w:bottom w:w="35" w:type="dxa"/>
-              <w:end w:w="55" w:type="dxa"/>
-            </w:tcMar>
-            <w:shd w:fill="EAF2F8"/>
-          </w:tcPr>
-          <w:p>
-            <w:pPr>
-              <w:spacing w:after="0" w:line="240" w:lineRule="auto"/>
-              <w:jc w:val="center"/>
-            </w:pPr>
-            <w:r>
-              <w:rPr>
-                <w:rFonts w:ascii="Aptos" w:hAnsi="Aptos"/>
-                <w:sz w:val="15"/>
-              </w:rPr>
-              <w:t>0</w:t>
-            </w:r>
-          </w:p>
-        </w:tc>
-        <w:tc>
-          <w:tcPr>
-            <w:tcW w:type="dxa" w:w="1307"/>
-            <w:vAlign w:val="center"/>
-            <w:tcMar>
-              <w:top w:w="35" w:type="dxa"/>
-              <w:start w:w="55" w:type="dxa"/>
-              <w:bottom w:w="35" w:type="dxa"/>
-              <w:end w:w="55" w:type="dxa"/>
-            </w:tcMar>
-            <w:shd w:fill="EAF2F8"/>
-          </w:tcPr>
-          <w:p>
-            <w:pPr>
-              <w:spacing w:after="0" w:line="240" w:lineRule="auto"/>
-              <w:jc w:val="center"/>
-            </w:pPr>
-            <w:r>
-              <w:rPr>
-                <w:rFonts w:ascii="Aptos" w:hAnsi="Aptos"/>
-                <w:sz w:val="15"/>
-              </w:rPr>
-              <w:t>20</w:t>
-            </w:r>
-          </w:p>
-        </w:tc>
-        <w:tc>
-          <w:tcPr>
-            <w:tcW w:type="dxa" w:w="1307"/>
-            <w:vAlign w:val="center"/>
-            <w:tcMar>
-              <w:top w:w="35" w:type="dxa"/>
-              <w:start w:w="55" w:type="dxa"/>
-              <w:bottom w:w="35" w:type="dxa"/>
-              <w:end w:w="55" w:type="dxa"/>
-            </w:tcMar>
-            <w:shd w:fill="EAF2F8"/>
-          </w:tcPr>
-          <w:p>
-            <w:pPr>
-              <w:spacing w:after="0" w:line="240" w:lineRule="auto"/>
-              <w:jc w:val="center"/>
-            </w:pPr>
-            <w:r>
-              <w:rPr>
-                <w:rFonts w:ascii="Aptos" w:hAnsi="Aptos"/>
-                <w:sz w:val="15"/>
-              </w:rPr>
-              <w:t>50</w:t>
-            </w:r>
-          </w:p>
-        </w:tc>
-        <w:tc>
-          <w:tcPr>
-            <w:tcW w:type="dxa" w:w="1307"/>
-            <w:vAlign w:val="center"/>
-            <w:tcMar>
-              <w:top w:w="35" w:type="dxa"/>
-              <w:start w:w="55" w:type="dxa"/>
-              <w:bottom w:w="35" w:type="dxa"/>
-              <w:end w:w="55" w:type="dxa"/>
-            </w:tcMar>
-            <w:shd w:fill="EAF2F8"/>
-          </w:tcPr>
-          <w:p>
-            <w:pPr>
-              <w:spacing w:after="0" w:line="240" w:lineRule="auto"/>
-              <w:jc w:val="center"/>
-            </w:pPr>
-            <w:r>
-              <w:rPr>
-                <w:rFonts w:ascii="Aptos" w:hAnsi="Aptos"/>
-                <w:sz w:val="15"/>
-              </w:rPr>
-              <w:t>70</w:t>
-            </w:r>
-          </w:p>
-        </w:tc>
-        <w:tc>
-          <w:tcPr>
-            <w:tcW w:type="dxa" w:w="1307"/>
-            <w:vAlign w:val="center"/>
-            <w:tcMar>
-              <w:top w:w="35" w:type="dxa"/>
-              <w:start w:w="55" w:type="dxa"/>
-              <w:bottom w:w="35" w:type="dxa"/>
-              <w:end w:w="55" w:type="dxa"/>
-            </w:tcMar>
-            <w:shd w:fill="EAF2F8"/>
-          </w:tcPr>
-          <w:p>
-            <w:pPr>
-              <w:spacing w:after="0" w:line="240" w:lineRule="auto"/>
-              <w:jc w:val="center"/>
-            </w:pPr>
-            <w:r>
-              <w:rPr>
-                <w:rFonts w:ascii="Aptos" w:hAnsi="Aptos"/>
-                <w:sz w:val="15"/>
-              </w:rPr>
-              <w:t>90</w:t>
-            </w:r>
-          </w:p>
-        </w:tc>
-        <w:tc>
-          <w:tcPr>
-            <w:tcW w:type="dxa" w:w="1307"/>
-            <w:vAlign w:val="center"/>
-            <w:tcMar>
-              <w:top w:w="35" w:type="dxa"/>
-              <w:start w:w="55" w:type="dxa"/>
-              <w:bottom w:w="35" w:type="dxa"/>
-              <w:end w:w="55" w:type="dxa"/>
-            </w:tcMar>
-            <w:shd w:fill="EAF2F8"/>
-          </w:tcPr>
-          <w:p>
-            <w:pPr>
-              <w:spacing w:after="0" w:line="240" w:lineRule="auto"/>
-              <w:jc w:val="center"/>
-            </w:pPr>
-            <w:r>
-              <w:rPr>
-                <w:rFonts w:ascii="Aptos" w:hAnsi="Aptos"/>
-                <w:sz w:val="15"/>
-              </w:rPr>
-              <w:t>100</w:t>
-            </w:r>
-          </w:p>
-        </w:tc>
-      </w:tr>
-      <w:tr>
-        <w:trPr>
-          <w:cantSplit/>
-        </w:trPr>
-        <w:tc>
-          <w:tcPr>
-            <w:tcW w:type="dxa" w:w="1307"/>
-            <w:vAlign w:val="center"/>
-            <w:tcMar>
-              <w:top w:w="35" w:type="dxa"/>
-              <w:start w:w="55" w:type="dxa"/>
-              <w:bottom w:w="35" w:type="dxa"/>
-              <w:end w:w="55" w:type="dxa"/>
-            </w:tcMar>
-          </w:tcPr>
-          <w:p>
-            <w:pPr>
-              <w:spacing w:after="0" w:line="240" w:lineRule="auto"/>
-            </w:pPr>
-            <w:r>
-              <w:rPr>
-                <w:rFonts w:ascii="Aptos" w:hAnsi="Aptos"/>
-                <w:sz w:val="15"/>
-              </w:rPr>
-              <w:t>C5</w:t>
-            </w:r>
-          </w:p>
-        </w:tc>
-        <w:tc>
-          <w:tcPr>
-            <w:tcW w:type="dxa" w:w="1307"/>
-            <w:vAlign w:val="center"/>
-            <w:tcMar>
-              <w:top w:w="35" w:type="dxa"/>
-              <w:start w:w="55" w:type="dxa"/>
-              <w:bottom w:w="35" w:type="dxa"/>
-              <w:end w:w="55" w:type="dxa"/>
-            </w:tcMar>
-          </w:tcPr>
-          <w:p>
-            <w:pPr>
-              <w:spacing w:after="0" w:line="240" w:lineRule="auto"/>
-              <w:jc w:val="center"/>
-            </w:pPr>
-            <w:r>
-              <w:rPr>
-                <w:rFonts w:ascii="Aptos" w:hAnsi="Aptos"/>
-                <w:sz w:val="15"/>
-              </w:rPr>
-              <w:t>15%</w:t>
-            </w:r>
-          </w:p>
-        </w:tc>
-        <w:tc>
-          <w:tcPr>
-            <w:tcW w:type="dxa" w:w="1307"/>
-            <w:vAlign w:val="center"/>
-            <w:tcMar>
-              <w:top w:w="35" w:type="dxa"/>
-              <w:start w:w="55" w:type="dxa"/>
-              <w:bottom w:w="35" w:type="dxa"/>
-              <w:end w:w="55" w:type="dxa"/>
-            </w:tcMar>
-          </w:tcPr>
-          <w:p>
-            <w:pPr>
-              <w:spacing w:after="0" w:line="240" w:lineRule="auto"/>
-              <w:jc w:val="center"/>
-            </w:pPr>
-            <w:r>
-              <w:rPr>
-                <w:rFonts w:ascii="Aptos" w:hAnsi="Aptos"/>
-                <w:sz w:val="15"/>
-              </w:rPr>
-              <w:t>0</w:t>
-            </w:r>
-          </w:p>
-        </w:tc>
-        <w:tc>
-          <w:tcPr>
-            <w:tcW w:type="dxa" w:w="1307"/>
-            <w:vAlign w:val="center"/>
-            <w:tcMar>
-              <w:top w:w="35" w:type="dxa"/>
-              <w:start w:w="55" w:type="dxa"/>
-              <w:bottom w:w="35" w:type="dxa"/>
-              <w:end w:w="55" w:type="dxa"/>
-            </w:tcMar>
-          </w:tcPr>
-          <w:p>
-            <w:pPr>
-              <w:spacing w:after="0" w:line="240" w:lineRule="auto"/>
-              <w:jc w:val="center"/>
-            </w:pPr>
-            <w:r>
-              <w:rPr>
-                <w:rFonts w:ascii="Aptos" w:hAnsi="Aptos"/>
-                <w:sz w:val="15"/>
-              </w:rPr>
-              <w:t>15</w:t>
-            </w:r>
-          </w:p>
-        </w:tc>
-        <w:tc>
-          <w:tcPr>
-            <w:tcW w:type="dxa" w:w="1307"/>
-            <w:vAlign w:val="center"/>
-            <w:tcMar>
-              <w:top w:w="35" w:type="dxa"/>
-              <w:start w:w="55" w:type="dxa"/>
-              <w:bottom w:w="35" w:type="dxa"/>
-              <w:end w:w="55" w:type="dxa"/>
-            </w:tcMar>
-          </w:tcPr>
-          <w:p>
-            <w:pPr>
-              <w:spacing w:after="0" w:line="240" w:lineRule="auto"/>
-              <w:jc w:val="center"/>
-            </w:pPr>
-            <w:r>
-              <w:rPr>
-                <w:rFonts w:ascii="Aptos" w:hAnsi="Aptos"/>
-                <w:sz w:val="15"/>
-              </w:rPr>
-              <w:t>37,5</w:t>
-            </w:r>
-          </w:p>
-        </w:tc>
-        <w:tc>
-          <w:tcPr>
-            <w:tcW w:type="dxa" w:w="1307"/>
-            <w:vAlign w:val="center"/>
-            <w:tcMar>
-              <w:top w:w="35" w:type="dxa"/>
-              <w:start w:w="55" w:type="dxa"/>
-              <w:bottom w:w="35" w:type="dxa"/>
-              <w:end w:w="55" w:type="dxa"/>
-            </w:tcMar>
-          </w:tcPr>
-          <w:p>
-            <w:pPr>
-              <w:spacing w:after="0" w:line="240" w:lineRule="auto"/>
-              <w:jc w:val="center"/>
-            </w:pPr>
-            <w:r>
-              <w:rPr>
-                <w:rFonts w:ascii="Aptos" w:hAnsi="Aptos"/>
-                <w:sz w:val="15"/>
-              </w:rPr>
-              <w:t>52,5</w:t>
-            </w:r>
-          </w:p>
-        </w:tc>
-        <w:tc>
-          <w:tcPr>
-            <w:tcW w:type="dxa" w:w="1307"/>
-            <w:vAlign w:val="center"/>
-            <w:tcMar>
-              <w:top w:w="35" w:type="dxa"/>
-              <w:start w:w="55" w:type="dxa"/>
-              <w:bottom w:w="35" w:type="dxa"/>
-              <w:end w:w="55" w:type="dxa"/>
-            </w:tcMar>
-          </w:tcPr>
-          <w:p>
-            <w:pPr>
-              <w:spacing w:after="0" w:line="240" w:lineRule="auto"/>
-              <w:jc w:val="center"/>
-            </w:pPr>
-            <w:r>
-              <w:rPr>
-                <w:rFonts w:ascii="Aptos" w:hAnsi="Aptos"/>
-                <w:sz w:val="15"/>
-              </w:rPr>
-              <w:t>67,5</w:t>
-            </w:r>
-          </w:p>
-        </w:tc>
-        <w:tc>
-          <w:tcPr>
-            <w:tcW w:type="dxa" w:w="1307"/>
-            <w:vAlign w:val="center"/>
-            <w:tcMar>
-              <w:top w:w="35" w:type="dxa"/>
-              <w:start w:w="55" w:type="dxa"/>
-              <w:bottom w:w="35" w:type="dxa"/>
-              <w:end w:w="55" w:type="dxa"/>
-            </w:tcMar>
-          </w:tcPr>
-          <w:p>
-            <w:pPr>
-              <w:spacing w:after="0" w:line="240" w:lineRule="auto"/>
-              <w:jc w:val="center"/>
-            </w:pPr>
-            <w:r>
-              <w:rPr>
-                <w:rFonts w:ascii="Aptos" w:hAnsi="Aptos"/>
-                <w:sz w:val="15"/>
-              </w:rPr>
-              <w:t>75</w:t>
-            </w:r>
-          </w:p>
-        </w:tc>
-      </w:tr>
-    </w:tbl>
     <w:p>
       <w:pPr>
         <w:pStyle w:val="Heading1"/>
@@ -7961,25 +6284,10 @@
       </w:pPr>
       <w:r>
         <w:rPr>
-          <w:rFonts w:ascii="Aptos" w:hAnsi="Aptos"/>
-          <w:sz w:val="17"/>
+          <w:rFonts w:ascii="Arial" w:hAnsi="Arial"/>
+          <w:sz w:val="18"/>
         </w:rPr>
-        <w:t xml:space="preserve">Copie únicamente los cinco aportes de la tabla rápida. En Word, use </w:t>
-      </w:r>
-      <w:r>
-        <w:rPr>
-          <w:rFonts w:ascii="Aptos" w:hAnsi="Aptos"/>
-          <w:b/>
-          <w:sz w:val="17"/>
-        </w:rPr>
-        <w:t>Ctrl+A y F9</w:t>
-      </w:r>
-      <w:r>
-        <w:rPr>
-          <w:rFonts w:ascii="Aptos" w:hAnsi="Aptos"/>
-          <w:sz w:val="17"/>
-        </w:rPr>
-        <w:t xml:space="preserve"> para actualizar automáticamente el total y su equivalente sobre 5,0.</w:t>
+        <w:t>Zubatronic calcula este consolidado automáticamente. La tabla permite verificar la captura o registrar un respaldo manual; no depende de fórmulas de Word.</w:t>
       </w:r>
     </w:p>
     <w:tbl>
@@ -8097,16 +6405,15 @@
           </w:tcPr>
           <w:p>
             <w:pPr>
-              <w:spacing w:after="0" w:line="240" w:lineRule="auto"/>
+              <w:spacing w:after="0"/>
             </w:pPr>
             <w:r>
               <w:rPr>
-                <w:rFonts w:ascii="Aptos" w:hAnsi="Aptos"/>
+                <w:rFonts w:ascii="Arial" w:hAnsi="Arial"/>
                 <w:b/>
-                <w:color w:val="FFFFFF"/>
-                <w:sz w:val="15"/>
+                <w:sz w:val="16"/>
               </w:rPr>
-              <w:t>Valor del nivel</w:t>
+              <w:t>Valor 0–500</w:t>
             </w:r>
           </w:p>
         </w:tc>
@@ -8124,16 +6431,15 @@
           </w:tcPr>
           <w:p>
             <w:pPr>
-              <w:spacing w:after="0" w:line="240" w:lineRule="auto"/>
+              <w:spacing w:after="0"/>
             </w:pPr>
             <w:r>
               <w:rPr>
-                <w:rFonts w:ascii="Aptos" w:hAnsi="Aptos"/>
+                <w:rFonts w:ascii="Arial" w:hAnsi="Arial"/>
                 <w:b/>
-                <w:color w:val="FFFFFF"/>
-                <w:sz w:val="15"/>
+                <w:sz w:val="16"/>
               </w:rPr>
-              <w:t>Aporte según tabla rápida</w:t>
+              <w:t>Aporte ponderado</w:t>
             </w:r>
           </w:p>
         </w:tc>
@@ -8788,26 +7094,15 @@
           </w:tcPr>
           <w:p>
             <w:pPr>
-              <w:spacing w:after="0" w:line="240" w:lineRule="auto"/>
-              <w:jc w:val="center"/>
+              <w:spacing w:after="0"/>
             </w:pPr>
             <w:r>
               <w:rPr>
+                <w:rFonts w:ascii="Arial" w:hAnsi="Arial"/>
                 <w:b/>
+                <w:sz w:val="18"/>
               </w:rPr>
-              <w:t xml:space="preserve">Total: </w:t>
-            </w:r>
-            <w:bookmarkStart w:id="710" w:name="NotaTaller500"/>
-            <w:r>
-              <w:fldChar w:fldCharType="begin"/>
-              <w:instrText xml:space="preserve"> =SUM(ABOVE) \# "0.0" </w:instrText>
-              <w:fldChar w:fldCharType="separate"/>
-              <w:t>0.0</w:t>
-              <w:fldChar w:fldCharType="end"/>
-            </w:r>
-            <w:bookmarkEnd w:id="710"/>
-            <w:r>
-              <w:t xml:space="preserve"> / 500</w:t>
+              <w:t>________ / 500</w:t>
             </w:r>
           </w:p>
         </w:tc>
@@ -8902,11 +7197,12 @@
           </w:tcPr>
           <w:p>
             <w:pPr>
-              <w:spacing w:after="0" w:line="240" w:lineRule="auto"/>
+              <w:spacing w:after="0"/>
             </w:pPr>
             <w:r>
               <w:rPr>
-                <w:rFonts w:ascii="Aptos" w:hAnsi="Aptos"/>
+                <w:rFonts w:ascii="Arial" w:hAnsi="Arial"/>
+                <w:b w:val="0"/>
                 <w:sz w:val="16"/>
               </w:rPr>
               <w:t>Nota Taller 01 sobre 500</w:t>
@@ -8926,15 +7222,14 @@
           </w:tcPr>
           <w:p>
             <w:pPr>
-              <w:spacing w:after="0" w:line="240" w:lineRule="auto"/>
-              <w:jc w:val="center"/>
+              <w:spacing w:after="0"/>
             </w:pPr>
             <w:r>
-              <w:fldChar w:fldCharType="begin"/>
-              <w:instrText xml:space="preserve"> REF NotaTaller500 \# "0.0" </w:instrText>
-              <w:fldChar w:fldCharType="separate"/>
-              <w:t>0.0</w:t>
-              <w:fldChar w:fldCharType="end"/>
+              <w:rPr>
+                <w:rFonts w:ascii="Arial" w:hAnsi="Arial"/>
+                <w:b w:val="0"/>
+                <w:sz w:val="16"/>
+              </w:rPr>
             </w:r>
           </w:p>
         </w:tc>
@@ -8957,11 +7252,12 @@
           </w:tcPr>
           <w:p>
             <w:pPr>
-              <w:spacing w:after="0" w:line="240" w:lineRule="auto"/>
+              <w:spacing w:after="0"/>
             </w:pPr>
             <w:r>
               <w:rPr>
-                <w:rFonts w:ascii="Aptos" w:hAnsi="Aptos"/>
+                <w:rFonts w:ascii="Arial" w:hAnsi="Arial"/>
+                <w:b w:val="0"/>
                 <w:sz w:val="16"/>
               </w:rPr>
               <w:t>Nota Taller 01 sobre 5,0 = total ÷ 100</w:t>
@@ -8982,15 +7278,14 @@
           </w:tcPr>
           <w:p>
             <w:pPr>
-              <w:spacing w:after="0" w:line="240" w:lineRule="auto"/>
-              <w:jc w:val="center"/>
+              <w:spacing w:after="0"/>
             </w:pPr>
             <w:r>
-              <w:fldChar w:fldCharType="begin"/>
-              <w:instrText xml:space="preserve"> =NotaTaller500/100 \# "0.00" </w:instrText>
-              <w:fldChar w:fldCharType="separate"/>
-              <w:t>0.00</w:t>
-              <w:fldChar w:fldCharType="end"/>
+              <w:rPr>
+                <w:rFonts w:ascii="Arial" w:hAnsi="Arial"/>
+                <w:b w:val="0"/>
+                <w:sz w:val="16"/>
+              </w:rPr>
             </w:r>
           </w:p>
         </w:tc>
@@ -9012,14 +7307,15 @@
           </w:tcPr>
           <w:p>
             <w:pPr>
-              <w:spacing w:after="0" w:line="240" w:lineRule="auto"/>
+              <w:spacing w:after="0"/>
             </w:pPr>
             <w:r>
               <w:rPr>
-                <w:rFonts w:ascii="Aptos" w:hAnsi="Aptos"/>
+                <w:rFonts w:ascii="Arial" w:hAnsi="Arial"/>
+                <w:b w:val="0"/>
                 <w:sz w:val="16"/>
               </w:rPr>
-              <w:t>Nivel global</w:t>
+              <w:t>Criterios en N3 o superior</w:t>
             </w:r>
           </w:p>
         </w:tc>
@@ -9036,15 +7332,14 @@
           </w:tcPr>
           <w:p>
             <w:pPr>
-              <w:spacing w:after="0" w:line="240" w:lineRule="auto"/>
-              <w:jc w:val="center"/>
+              <w:spacing w:after="0"/>
             </w:pPr>
             <w:r>
               <w:rPr>
-                <w:rFonts w:ascii="Aptos" w:hAnsi="Aptos"/>
+                <w:rFonts w:ascii="Arial" w:hAnsi="Arial"/>
+                <w:b w:val="0"/>
                 <w:sz w:val="16"/>
               </w:rPr>
-              <w:t>__________</w:t>
             </w:r>
           </w:p>
         </w:tc>
@@ -9067,14 +7362,15 @@
           </w:tcPr>
           <w:p>
             <w:pPr>
-              <w:spacing w:after="0" w:line="240" w:lineRule="auto"/>
+              <w:spacing w:after="0"/>
             </w:pPr>
             <w:r>
               <w:rPr>
-                <w:rFonts w:ascii="Aptos" w:hAnsi="Aptos"/>
+                <w:rFonts w:ascii="Arial" w:hAnsi="Arial"/>
+                <w:b w:val="0"/>
                 <w:sz w:val="16"/>
               </w:rPr>
-              <w:t>Observaciones</w:t>
+              <w:t>Criterios por debajo de N3</w:t>
             </w:r>
           </w:p>
         </w:tc>
@@ -9092,8 +7388,52 @@
           </w:tcPr>
           <w:p>
             <w:pPr>
-              <w:spacing w:after="0" w:line="240" w:lineRule="auto"/>
+              <w:spacing w:after="0"/>
             </w:pPr>
+            <w:r>
+              <w:rPr>
+                <w:rFonts w:ascii="Arial" w:hAnsi="Arial"/>
+                <w:b w:val="0"/>
+                <w:sz w:val="16"/>
+              </w:rPr>
+            </w:r>
+          </w:p>
+        </w:tc>
+      </w:tr>
+      <w:tr>
+        <w:tc>
+          <w:tcPr>
+            <w:tcW w:type="dxa" w:w="5227"/>
+          </w:tcPr>
+          <w:p>
+            <w:pPr>
+              <w:spacing w:after="0"/>
+            </w:pPr>
+            <w:r>
+              <w:rPr>
+                <w:rFonts w:ascii="Arial" w:hAnsi="Arial"/>
+                <w:b w:val="0"/>
+                <w:sz w:val="16"/>
+              </w:rPr>
+              <w:t>Observaciones</w:t>
+            </w:r>
+          </w:p>
+        </w:tc>
+        <w:tc>
+          <w:tcPr>
+            <w:tcW w:type="dxa" w:w="5227"/>
+          </w:tcPr>
+          <w:p>
+            <w:pPr>
+              <w:spacing w:after="0"/>
+            </w:pPr>
+            <w:r>
+              <w:rPr>
+                <w:rFonts w:ascii="Arial" w:hAnsi="Arial"/>
+                <w:b w:val="0"/>
+                <w:sz w:val="16"/>
+              </w:rPr>
+            </w:r>
           </w:p>
         </w:tc>
       </w:tr>
@@ -9332,17 +7672,13 @@
       </w:r>
     </w:p>
     <w:p>
-      <w:r>
-        <w:t xml:space="preserve">Este documento entrega directamente la </w:t>
-      </w:r>
+      <w:pPr/>
       <w:r>
         <w:rPr>
-          <w:b/>
+          <w:rFonts w:ascii="Arial" w:hAnsi="Arial"/>
+          <w:sz w:val="18"/>
         </w:rPr>
-        <w:t>Nota Taller 01</w:t>
-      </w:r>
-      <w:r>
-        <w:t>. Esa nota pasa al consolidado de talleres y tareas del primer corte.</w:t>
+        <w:t>Este documento entrega la Nota Taller 01 y los resultados desagregados por criterio. La nota pasa al consolidado de talleres y tareas; Zubatronic genera por separado los reportes RAE/SO.</w:t>
       </w:r>
     </w:p>
     <w:p>

</xml_diff>

<commit_message>
feat: add ABET assessment instruments, laboratory documentation, and administrative automation scripts for ROS 2 curriculum management
</commit_message>
<xml_diff>
--- a/education/evidencias_abet/PLANTILLA_EVIDENCIA_ABET_TALLER_01_ROS2_CLI.docx
+++ b/education/evidencias_abet/PLANTILLA_EVIDENCIA_ABET_TALLER_01_ROS2_CLI.docx
@@ -78,18 +78,18 @@
               <w:bottom w:w="35" w:type="dxa"/>
               <w:end w:w="55" w:type="dxa"/>
             </w:tcMar>
-            <w:shd w:fill="1F4E78"/>
+            <w:shd w:fill="1F4E79"/>
           </w:tcPr>
           <w:p>
             <w:pPr>
-              <w:spacing w:after="0" w:line="240" w:lineRule="auto"/>
+              <w:spacing w:after="0" w:line="240" w:lineRule="auto" w:before="0"/>
             </w:pPr>
             <w:r>
               <w:rPr>
-                <w:rFonts w:ascii="Aptos" w:hAnsi="Aptos"/>
+                <w:rFonts w:ascii="Arial" w:hAnsi="Arial"/>
                 <w:b/>
                 <w:color w:val="FFFFFF"/>
-                <w:sz w:val="15"/>
+                <w:sz w:val="16"/>
               </w:rPr>
               <w:t>Campo</w:t>
             </w:r>
@@ -105,18 +105,18 @@
               <w:bottom w:w="35" w:type="dxa"/>
               <w:end w:w="55" w:type="dxa"/>
             </w:tcMar>
-            <w:shd w:fill="1F4E78"/>
+            <w:shd w:fill="1F4E79"/>
           </w:tcPr>
           <w:p>
             <w:pPr>
-              <w:spacing w:after="0" w:line="240" w:lineRule="auto"/>
+              <w:spacing w:after="0" w:line="240" w:lineRule="auto" w:before="0"/>
             </w:pPr>
             <w:r>
               <w:rPr>
-                <w:rFonts w:ascii="Aptos" w:hAnsi="Aptos"/>
+                <w:rFonts w:ascii="Arial" w:hAnsi="Arial"/>
                 <w:b/>
                 <w:color w:val="FFFFFF"/>
-                <w:sz w:val="15"/>
+                <w:sz w:val="16"/>
               </w:rPr>
               <w:t>Registro</w:t>
             </w:r>
@@ -140,12 +140,13 @@
           </w:tcPr>
           <w:p>
             <w:pPr>
-              <w:spacing w:after="0" w:line="240" w:lineRule="auto"/>
+              <w:spacing w:after="0" w:line="240" w:lineRule="auto" w:before="0"/>
             </w:pPr>
             <w:r>
               <w:rPr>
-                <w:rFonts w:ascii="Aptos" w:hAnsi="Aptos"/>
-                <w:sz w:val="15"/>
+                <w:rFonts w:ascii="Arial" w:hAnsi="Arial"/>
+                <w:b w:val="0"/>
+                <w:sz w:val="16"/>
               </w:rPr>
               <w:t>Asignatura</w:t>
             </w:r>
@@ -164,12 +165,13 @@
           </w:tcPr>
           <w:p>
             <w:pPr>
-              <w:spacing w:after="0" w:line="240" w:lineRule="auto"/>
+              <w:spacing w:after="0" w:line="240" w:lineRule="auto" w:before="0"/>
             </w:pPr>
             <w:r>
               <w:rPr>
-                <w:rFonts w:ascii="Aptos" w:hAnsi="Aptos"/>
-                <w:sz w:val="15"/>
+                <w:rFonts w:ascii="Arial" w:hAnsi="Arial"/>
+                <w:b w:val="0"/>
+                <w:sz w:val="16"/>
               </w:rPr>
               <w:t>ROBOT OPERATING SYSTEM - ROS</w:t>
             </w:r>
@@ -190,16 +192,17 @@
               <w:bottom w:w="35" w:type="dxa"/>
               <w:end w:w="55" w:type="dxa"/>
             </w:tcMar>
-            <w:shd w:fill="EAF2F8"/>
+            <w:shd w:fill="F2F2F2"/>
           </w:tcPr>
           <w:p>
             <w:pPr>
-              <w:spacing w:after="0" w:line="240" w:lineRule="auto"/>
+              <w:spacing w:after="0" w:line="240" w:lineRule="auto" w:before="0"/>
             </w:pPr>
             <w:r>
               <w:rPr>
-                <w:rFonts w:ascii="Aptos" w:hAnsi="Aptos"/>
-                <w:sz w:val="15"/>
+                <w:rFonts w:ascii="Arial" w:hAnsi="Arial"/>
+                <w:b w:val="0"/>
+                <w:sz w:val="16"/>
               </w:rPr>
               <w:t>Corte / instrumento</w:t>
             </w:r>
@@ -215,16 +218,17 @@
               <w:bottom w:w="35" w:type="dxa"/>
               <w:end w:w="55" w:type="dxa"/>
             </w:tcMar>
-            <w:shd w:fill="EAF2F8"/>
+            <w:shd w:fill="F2F2F2"/>
           </w:tcPr>
           <w:p>
             <w:pPr>
-              <w:spacing w:after="0" w:line="240" w:lineRule="auto"/>
+              <w:spacing w:after="0" w:line="240" w:lineRule="auto" w:before="0"/>
             </w:pPr>
             <w:r>
               <w:rPr>
-                <w:rFonts w:ascii="Aptos" w:hAnsi="Aptos"/>
-                <w:sz w:val="15"/>
+                <w:rFonts w:ascii="Arial" w:hAnsi="Arial"/>
+                <w:b w:val="0"/>
+                <w:sz w:val="16"/>
               </w:rPr>
               <w:t>Primer corte / Talleres y tareas</w:t>
             </w:r>
@@ -248,12 +252,13 @@
           </w:tcPr>
           <w:p>
             <w:pPr>
-              <w:spacing w:after="0" w:line="240" w:lineRule="auto"/>
+              <w:spacing w:after="0" w:line="240" w:lineRule="auto" w:before="0"/>
             </w:pPr>
             <w:r>
               <w:rPr>
-                <w:rFonts w:ascii="Aptos" w:hAnsi="Aptos"/>
-                <w:sz w:val="15"/>
+                <w:rFonts w:ascii="Arial" w:hAnsi="Arial"/>
+                <w:b w:val="0"/>
+                <w:sz w:val="16"/>
               </w:rPr>
               <w:t>Actividad</w:t>
             </w:r>
@@ -272,12 +277,13 @@
           </w:tcPr>
           <w:p>
             <w:pPr>
-              <w:spacing w:after="0" w:line="240" w:lineRule="auto"/>
+              <w:spacing w:after="0" w:line="240" w:lineRule="auto" w:before="0"/>
             </w:pPr>
             <w:r>
               <w:rPr>
-                <w:rFonts w:ascii="Aptos" w:hAnsi="Aptos"/>
-                <w:sz w:val="15"/>
+                <w:rFonts w:ascii="Arial" w:hAnsi="Arial"/>
+                <w:b w:val="0"/>
+                <w:sz w:val="16"/>
               </w:rPr>
               <w:t>Taller 01 — CLI de ROS 2</w:t>
             </w:r>
@@ -298,16 +304,17 @@
               <w:bottom w:w="35" w:type="dxa"/>
               <w:end w:w="55" w:type="dxa"/>
             </w:tcMar>
-            <w:shd w:fill="EAF2F8"/>
+            <w:shd w:fill="F2F2F2"/>
           </w:tcPr>
           <w:p>
             <w:pPr>
-              <w:spacing w:after="0" w:line="240" w:lineRule="auto"/>
+              <w:spacing w:after="0" w:line="240" w:lineRule="auto" w:before="0"/>
             </w:pPr>
             <w:r>
               <w:rPr>
-                <w:rFonts w:ascii="Aptos" w:hAnsi="Aptos"/>
-                <w:sz w:val="15"/>
+                <w:rFonts w:ascii="Arial" w:hAnsi="Arial"/>
+                <w:b w:val="0"/>
+                <w:sz w:val="16"/>
               </w:rPr>
               <w:t>Nombre completo</w:t>
             </w:r>
@@ -323,11 +330,11 @@
               <w:bottom w:w="35" w:type="dxa"/>
               <w:end w:w="55" w:type="dxa"/>
             </w:tcMar>
-            <w:shd w:fill="EAF2F8"/>
+            <w:shd w:fill="F2F2F2"/>
           </w:tcPr>
           <w:p>
             <w:pPr>
-              <w:spacing w:after="0" w:line="240" w:lineRule="auto"/>
+              <w:spacing w:after="0" w:line="240" w:lineRule="auto" w:before="0"/>
             </w:pPr>
           </w:p>
         </w:tc>
@@ -349,12 +356,13 @@
           </w:tcPr>
           <w:p>
             <w:pPr>
-              <w:spacing w:after="0" w:line="240" w:lineRule="auto"/>
+              <w:spacing w:after="0" w:line="240" w:lineRule="auto" w:before="0"/>
             </w:pPr>
             <w:r>
               <w:rPr>
-                <w:rFonts w:ascii="Aptos" w:hAnsi="Aptos"/>
-                <w:sz w:val="15"/>
+                <w:rFonts w:ascii="Arial" w:hAnsi="Arial"/>
+                <w:b w:val="0"/>
+                <w:sz w:val="16"/>
               </w:rPr>
               <w:t>Código / grupo</w:t>
             </w:r>
@@ -373,7 +381,7 @@
           </w:tcPr>
           <w:p>
             <w:pPr>
-              <w:spacing w:after="0" w:line="240" w:lineRule="auto"/>
+              <w:spacing w:after="0" w:line="240" w:lineRule="auto" w:before="0"/>
             </w:pPr>
           </w:p>
         </w:tc>
@@ -392,16 +400,17 @@
               <w:bottom w:w="35" w:type="dxa"/>
               <w:end w:w="55" w:type="dxa"/>
             </w:tcMar>
-            <w:shd w:fill="EAF2F8"/>
+            <w:shd w:fill="F2F2F2"/>
           </w:tcPr>
           <w:p>
             <w:pPr>
-              <w:spacing w:after="0" w:line="240" w:lineRule="auto"/>
+              <w:spacing w:after="0" w:line="240" w:lineRule="auto" w:before="0"/>
             </w:pPr>
             <w:r>
               <w:rPr>
-                <w:rFonts w:ascii="Aptos" w:hAnsi="Aptos"/>
-                <w:sz w:val="15"/>
+                <w:rFonts w:ascii="Arial" w:hAnsi="Arial"/>
+                <w:b w:val="0"/>
+                <w:sz w:val="16"/>
               </w:rPr>
               <w:t>Fecha de entrega</w:t>
             </w:r>
@@ -417,11 +426,11 @@
               <w:bottom w:w="35" w:type="dxa"/>
               <w:end w:w="55" w:type="dxa"/>
             </w:tcMar>
-            <w:shd w:fill="EAF2F8"/>
+            <w:shd w:fill="F2F2F2"/>
           </w:tcPr>
           <w:p>
             <w:pPr>
-              <w:spacing w:after="0" w:line="240" w:lineRule="auto"/>
+              <w:spacing w:after="0" w:line="240" w:lineRule="auto" w:before="0"/>
             </w:pPr>
           </w:p>
         </w:tc>
@@ -443,12 +452,13 @@
           </w:tcPr>
           <w:p>
             <w:pPr>
-              <w:spacing w:after="0" w:line="240" w:lineRule="auto"/>
+              <w:spacing w:after="0" w:line="240" w:lineRule="auto" w:before="0"/>
             </w:pPr>
             <w:r>
               <w:rPr>
-                <w:rFonts w:ascii="Aptos" w:hAnsi="Aptos"/>
-                <w:sz w:val="15"/>
+                <w:rFonts w:ascii="Arial" w:hAnsi="Arial"/>
+                <w:b w:val="0"/>
+                <w:sz w:val="16"/>
               </w:rPr>
               <w:t>Enlace o ubicación de la entrega</w:t>
             </w:r>
@@ -467,7 +477,7 @@
           </w:tcPr>
           <w:p>
             <w:pPr>
-              <w:spacing w:after="0" w:line="240" w:lineRule="auto"/>
+              <w:spacing w:after="0" w:line="240" w:lineRule="auto" w:before="0"/>
             </w:pPr>
           </w:p>
         </w:tc>
@@ -486,16 +496,17 @@
               <w:bottom w:w="35" w:type="dxa"/>
               <w:end w:w="55" w:type="dxa"/>
             </w:tcMar>
-            <w:shd w:fill="EAF2F8"/>
+            <w:shd w:fill="F2F2F2"/>
           </w:tcPr>
           <w:p>
             <w:pPr>
-              <w:spacing w:after="0" w:line="240" w:lineRule="auto"/>
+              <w:spacing w:after="0" w:line="240" w:lineRule="auto" w:before="0"/>
             </w:pPr>
             <w:r>
               <w:rPr>
-                <w:rFonts w:ascii="Aptos" w:hAnsi="Aptos"/>
-                <w:sz w:val="15"/>
+                <w:rFonts w:ascii="Arial" w:hAnsi="Arial"/>
+                <w:b w:val="0"/>
+                <w:sz w:val="16"/>
               </w:rPr>
               <w:t>Commit evaluado, si aplica</w:t>
             </w:r>
@@ -511,11 +522,11 @@
               <w:bottom w:w="35" w:type="dxa"/>
               <w:end w:w="55" w:type="dxa"/>
             </w:tcMar>
-            <w:shd w:fill="EAF2F8"/>
+            <w:shd w:fill="F2F2F2"/>
           </w:tcPr>
           <w:p>
             <w:pPr>
-              <w:spacing w:after="0" w:line="240" w:lineRule="auto"/>
+              <w:spacing w:after="0" w:line="240" w:lineRule="auto" w:before="0"/>
             </w:pPr>
           </w:p>
         </w:tc>
@@ -535,12 +546,12 @@
           </w:tcPr>
           <w:p>
             <w:pPr>
-              <w:spacing w:after="0"/>
+              <w:spacing w:after="0" w:before="0"/>
             </w:pPr>
             <w:r>
               <w:rPr>
                 <w:rFonts w:ascii="Arial" w:hAnsi="Arial"/>
-                <w:b/>
+                <w:b w:val="0"/>
                 <w:sz w:val="16"/>
               </w:rPr>
               <w:t>Periodo</w:t>
@@ -561,7 +572,7 @@
           </w:tcPr>
           <w:p>
             <w:pPr>
-              <w:spacing w:after="0"/>
+              <w:spacing w:after="0" w:before="0"/>
             </w:pPr>
             <w:r>
               <w:rPr>
@@ -585,16 +596,16 @@
               <w:bottom w:w="35" w:type="dxa"/>
               <w:end w:w="55" w:type="dxa"/>
             </w:tcMar>
-            <w:shd w:fill="EAF2F8"/>
+            <w:shd w:fill="F2F2F2"/>
           </w:tcPr>
           <w:p>
             <w:pPr>
-              <w:spacing w:after="0"/>
+              <w:spacing w:after="0" w:before="0"/>
             </w:pPr>
             <w:r>
               <w:rPr>
                 <w:rFonts w:ascii="Arial" w:hAnsi="Arial"/>
-                <w:b/>
+                <w:b w:val="0"/>
                 <w:sz w:val="16"/>
               </w:rPr>
               <w:t>Evaluador</w:t>
@@ -611,11 +622,11 @@
               <w:bottom w:w="35" w:type="dxa"/>
               <w:end w:w="55" w:type="dxa"/>
             </w:tcMar>
-            <w:shd w:fill="EAF2F8"/>
+            <w:shd w:fill="F2F2F2"/>
           </w:tcPr>
           <w:p>
             <w:pPr>
-              <w:spacing w:after="0"/>
+              <w:spacing w:after="0" w:before="0"/>
             </w:pPr>
             <w:r>
               <w:rPr>
@@ -642,12 +653,12 @@
           </w:tcPr>
           <w:p>
             <w:pPr>
-              <w:spacing w:after="0"/>
+              <w:spacing w:after="0" w:before="0"/>
             </w:pPr>
             <w:r>
               <w:rPr>
                 <w:rFonts w:ascii="Arial" w:hAnsi="Arial"/>
-                <w:b/>
+                <w:b w:val="0"/>
                 <w:sz w:val="16"/>
               </w:rPr>
               <w:t>Versión del instrumento</w:t>
@@ -668,7 +679,7 @@
           </w:tcPr>
           <w:p>
             <w:pPr>
-              <w:spacing w:after="0"/>
+              <w:spacing w:after="0" w:before="0"/>
             </w:pPr>
             <w:r>
               <w:rPr>
@@ -676,7 +687,49 @@
                 <w:b w:val="0"/>
                 <w:sz w:val="16"/>
               </w:rPr>
-              <w:t>1.0</w:t>
+              <w:t>1.1</w:t>
+            </w:r>
+          </w:p>
+        </w:tc>
+      </w:tr>
+      <w:tr>
+        <w:tc>
+          <w:tcPr>
+            <w:tcW w:type="dxa" w:w="5227"/>
+            <w:shd w:fill="F2F2F2"/>
+            <w:vAlign w:val="center"/>
+          </w:tcPr>
+          <w:p>
+            <w:pPr>
+              <w:spacing w:after="0" w:before="0"/>
+            </w:pPr>
+            <w:r>
+              <w:rPr>
+                <w:rFonts w:ascii="Arial" w:hAnsi="Arial"/>
+                <w:b w:val="0"/>
+                <w:sz w:val="16"/>
+              </w:rPr>
+              <w:t>Unidad de análisis</w:t>
+            </w:r>
+          </w:p>
+        </w:tc>
+        <w:tc>
+          <w:tcPr>
+            <w:tcW w:type="dxa" w:w="5227"/>
+            <w:shd w:fill="F2F2F2"/>
+            <w:vAlign w:val="center"/>
+          </w:tcPr>
+          <w:p>
+            <w:pPr>
+              <w:spacing w:after="0" w:before="0"/>
+            </w:pPr>
+            <w:r>
+              <w:rPr>
+                <w:rFonts w:ascii="Arial" w:hAnsi="Arial"/>
+                <w:b w:val="0"/>
+                <w:sz w:val="16"/>
+              </w:rPr>
+              <w:t>Individual</w:t>
             </w:r>
           </w:p>
         </w:tc>
@@ -1235,6 +1288,788 @@
         <w:br w:type="page"/>
       </w:r>
     </w:p>
+    <w:p>
+      <w:pPr>
+        <w:pStyle w:val="Heading2"/>
+      </w:pPr>
+      <w:r>
+        <w:rPr>
+          <w:rFonts w:ascii="Arial" w:hAnsi="Arial"/>
+          <w:color w:val="1F4E79"/>
+        </w:rPr>
+        <w:t>2.1. Parámetros de assessment — versión 1.1</w:t>
+      </w:r>
+    </w:p>
+    <w:tbl>
+      <w:tblPr>
+        <w:tblStyle w:val="TableGrid"/>
+        <w:tblW w:type="auto" w:w="0"/>
+        <w:jc w:val="center"/>
+        <w:tblLook w:firstColumn="1" w:firstRow="1" w:lastColumn="0" w:lastRow="0" w:noHBand="0" w:noVBand="1" w:val="04A0"/>
+      </w:tblPr>
+      <w:tblGrid>
+        <w:gridCol w:w="5227"/>
+        <w:gridCol w:w="5227"/>
+      </w:tblGrid>
+      <w:tr>
+        <w:tc>
+          <w:tcPr>
+            <w:tcW w:type="dxa" w:w="2835"/>
+            <w:shd w:fill="1F4E79"/>
+            <w:vAlign w:val="center"/>
+          </w:tcPr>
+          <w:p>
+            <w:pPr>
+              <w:spacing w:after="0" w:before="0"/>
+            </w:pPr>
+            <w:r>
+              <w:rPr>
+                <w:rFonts w:ascii="Arial" w:hAnsi="Arial"/>
+                <w:b/>
+                <w:color w:val="FFFFFF"/>
+                <w:sz w:val="15"/>
+              </w:rPr>
+              <w:t>Parámetro</w:t>
+            </w:r>
+          </w:p>
+        </w:tc>
+        <w:tc>
+          <w:tcPr>
+            <w:tcW w:type="dxa" w:w="6803"/>
+            <w:shd w:fill="1F4E79"/>
+            <w:vAlign w:val="center"/>
+          </w:tcPr>
+          <w:p>
+            <w:pPr>
+              <w:spacing w:after="0" w:before="0"/>
+            </w:pPr>
+            <w:r>
+              <w:rPr>
+                <w:rFonts w:ascii="Arial" w:hAnsi="Arial"/>
+                <w:b/>
+                <w:color w:val="FFFFFF"/>
+                <w:sz w:val="15"/>
+              </w:rPr>
+              <w:t>Regla</w:t>
+            </w:r>
+          </w:p>
+        </w:tc>
+      </w:tr>
+      <w:tr>
+        <w:tc>
+          <w:tcPr>
+            <w:tcW w:type="dxa" w:w="2835"/>
+            <w:vAlign w:val="center"/>
+          </w:tcPr>
+          <w:p>
+            <w:pPr>
+              <w:spacing w:after="0" w:before="0"/>
+            </w:pPr>
+            <w:r>
+              <w:rPr>
+                <w:rFonts w:ascii="Arial" w:hAnsi="Arial"/>
+                <w:b w:val="0"/>
+                <w:sz w:val="15"/>
+              </w:rPr>
+              <w:t>Población y muestreo</w:t>
+            </w:r>
+          </w:p>
+        </w:tc>
+        <w:tc>
+          <w:tcPr>
+            <w:tcW w:type="dxa" w:w="6803"/>
+            <w:vAlign w:val="center"/>
+          </w:tcPr>
+          <w:p>
+            <w:pPr>
+              <w:spacing w:after="0" w:before="0"/>
+            </w:pPr>
+            <w:r>
+              <w:rPr>
+                <w:rFonts w:ascii="Arial" w:hAnsi="Arial"/>
+                <w:b w:val="0"/>
+                <w:sz w:val="15"/>
+              </w:rPr>
+              <w:t>Censo de estudiantes matriculados con entrega exigible; no se usa muestra.</w:t>
+            </w:r>
+          </w:p>
+        </w:tc>
+      </w:tr>
+      <w:tr>
+        <w:tc>
+          <w:tcPr>
+            <w:tcW w:type="dxa" w:w="2835"/>
+            <w:shd w:fill="F2F2F2"/>
+            <w:vAlign w:val="center"/>
+          </w:tcPr>
+          <w:p>
+            <w:pPr>
+              <w:spacing w:after="0" w:before="0"/>
+            </w:pPr>
+            <w:r>
+              <w:rPr>
+                <w:rFonts w:ascii="Arial" w:hAnsi="Arial"/>
+                <w:b w:val="0"/>
+                <w:sz w:val="15"/>
+              </w:rPr>
+              <w:t>Umbral individual</w:t>
+            </w:r>
+          </w:p>
+        </w:tc>
+        <w:tc>
+          <w:tcPr>
+            <w:tcW w:type="dxa" w:w="6803"/>
+            <w:shd w:fill="F2F2F2"/>
+            <w:vAlign w:val="center"/>
+          </w:tcPr>
+          <w:p>
+            <w:pPr>
+              <w:spacing w:after="0" w:before="0"/>
+            </w:pPr>
+            <w:r>
+              <w:rPr>
+                <w:rFonts w:ascii="Arial" w:hAnsi="Arial"/>
+                <w:b w:val="0"/>
+                <w:sz w:val="15"/>
+              </w:rPr>
+              <w:t>N3 o superior en cada indicador evaluado.</w:t>
+            </w:r>
+          </w:p>
+        </w:tc>
+      </w:tr>
+      <w:tr>
+        <w:tc>
+          <w:tcPr>
+            <w:tcW w:type="dxa" w:w="2835"/>
+            <w:vAlign w:val="center"/>
+          </w:tcPr>
+          <w:p>
+            <w:pPr>
+              <w:spacing w:after="0" w:before="0"/>
+            </w:pPr>
+            <w:r>
+              <w:rPr>
+                <w:rFonts w:ascii="Arial" w:hAnsi="Arial"/>
+                <w:b w:val="0"/>
+                <w:sz w:val="15"/>
+              </w:rPr>
+              <w:t>Meta de cohorte</w:t>
+            </w:r>
+          </w:p>
+        </w:tc>
+        <w:tc>
+          <w:tcPr>
+            <w:tcW w:type="dxa" w:w="6803"/>
+            <w:vAlign w:val="center"/>
+          </w:tcPr>
+          <w:p>
+            <w:pPr>
+              <w:spacing w:after="0" w:before="0"/>
+            </w:pPr>
+            <w:r>
+              <w:rPr>
+                <w:rFonts w:ascii="Arial" w:hAnsi="Arial"/>
+                <w:b w:val="0"/>
+                <w:sz w:val="15"/>
+              </w:rPr>
+              <w:t>Al menos 70% de estudiantes evaluables alcanza N3 o superior por indicador.</w:t>
+            </w:r>
+          </w:p>
+        </w:tc>
+      </w:tr>
+      <w:tr>
+        <w:tc>
+          <w:tcPr>
+            <w:tcW w:type="dxa" w:w="2835"/>
+            <w:shd w:fill="F2F2F2"/>
+            <w:vAlign w:val="center"/>
+          </w:tcPr>
+          <w:p>
+            <w:pPr>
+              <w:spacing w:after="0" w:before="0"/>
+            </w:pPr>
+            <w:r>
+              <w:rPr>
+                <w:rFonts w:ascii="Arial" w:hAnsi="Arial"/>
+                <w:b w:val="0"/>
+                <w:sz w:val="15"/>
+              </w:rPr>
+              <w:t>Evidencia faltante</w:t>
+            </w:r>
+          </w:p>
+        </w:tc>
+        <w:tc>
+          <w:tcPr>
+            <w:tcW w:type="dxa" w:w="6803"/>
+            <w:shd w:fill="F2F2F2"/>
+            <w:vAlign w:val="center"/>
+          </w:tcPr>
+          <w:p>
+            <w:pPr>
+              <w:spacing w:after="0" w:before="0"/>
+            </w:pPr>
+            <w:r>
+              <w:rPr>
+                <w:rFonts w:ascii="Arial" w:hAnsi="Arial"/>
+                <w:b w:val="0"/>
+                <w:sz w:val="15"/>
+              </w:rPr>
+              <w:t>Entrega exigible sin evidencia: N1 con 0. Retiro/exclusión autorizada: NA.</w:t>
+            </w:r>
+          </w:p>
+        </w:tc>
+      </w:tr>
+      <w:tr>
+        <w:tc>
+          <w:tcPr>
+            <w:tcW w:type="dxa" w:w="2835"/>
+            <w:vAlign w:val="center"/>
+          </w:tcPr>
+          <w:p>
+            <w:pPr>
+              <w:spacing w:after="0" w:before="0"/>
+            </w:pPr>
+            <w:r>
+              <w:rPr>
+                <w:rFonts w:ascii="Arial" w:hAnsi="Arial"/>
+                <w:b w:val="0"/>
+                <w:sz w:val="15"/>
+              </w:rPr>
+              <w:t>Nombre de archivo</w:t>
+            </w:r>
+          </w:p>
+        </w:tc>
+        <w:tc>
+          <w:tcPr>
+            <w:tcW w:type="dxa" w:w="6803"/>
+            <w:vAlign w:val="center"/>
+          </w:tcPr>
+          <w:p>
+            <w:pPr>
+              <w:spacing w:after="0" w:before="0"/>
+            </w:pPr>
+            <w:r>
+              <w:rPr>
+                <w:rFonts w:ascii="Arial" w:hAnsi="Arial"/>
+                <w:b w:val="0"/>
+                <w:sz w:val="15"/>
+              </w:rPr>
+              <w:t>C1_T01_&lt;codigo&gt;_&lt;apellido&gt;_v1.docx</w:t>
+            </w:r>
+          </w:p>
+        </w:tc>
+      </w:tr>
+    </w:tbl>
+    <w:p>
+      <w:pPr>
+        <w:pStyle w:val="Heading2"/>
+      </w:pPr>
+      <w:r>
+        <w:rPr>
+          <w:rFonts w:ascii="Arial" w:hAnsi="Arial"/>
+          <w:color w:val="1F4E79"/>
+        </w:rPr>
+        <w:t>2.2. Alineación de criterios para Zubatronic/SGDE</w:t>
+      </w:r>
+    </w:p>
+    <w:tbl>
+      <w:tblPr>
+        <w:tblStyle w:val="TableGrid"/>
+        <w:tblW w:type="auto" w:w="0"/>
+        <w:jc w:val="center"/>
+        <w:tblLook w:firstColumn="1" w:firstRow="1" w:lastColumn="0" w:lastRow="0" w:noHBand="0" w:noVBand="1" w:val="04A0"/>
+      </w:tblPr>
+      <w:tblGrid>
+        <w:gridCol w:w="2613"/>
+        <w:gridCol w:w="2613"/>
+        <w:gridCol w:w="2613"/>
+        <w:gridCol w:w="2613"/>
+      </w:tblGrid>
+      <w:tr>
+        <w:tc>
+          <w:tcPr>
+            <w:tcW w:type="dxa" w:w="2835"/>
+            <w:shd w:fill="1F4E79"/>
+            <w:vAlign w:val="center"/>
+          </w:tcPr>
+          <w:p>
+            <w:pPr>
+              <w:spacing w:after="0" w:before="0"/>
+            </w:pPr>
+            <w:r>
+              <w:rPr>
+                <w:rFonts w:ascii="Arial" w:hAnsi="Arial"/>
+                <w:b/>
+                <w:color w:val="FFFFFF"/>
+                <w:sz w:val="15"/>
+              </w:rPr>
+              <w:t>Criterio</w:t>
+            </w:r>
+          </w:p>
+        </w:tc>
+        <w:tc>
+          <w:tcPr>
+            <w:tcW w:type="dxa" w:w="850"/>
+            <w:shd w:fill="1F4E79"/>
+            <w:vAlign w:val="center"/>
+          </w:tcPr>
+          <w:p>
+            <w:pPr>
+              <w:spacing w:after="0" w:before="0"/>
+            </w:pPr>
+            <w:r>
+              <w:rPr>
+                <w:rFonts w:ascii="Arial" w:hAnsi="Arial"/>
+                <w:b/>
+                <w:color w:val="FFFFFF"/>
+                <w:sz w:val="15"/>
+              </w:rPr>
+              <w:t>Peso</w:t>
+            </w:r>
+          </w:p>
+        </w:tc>
+        <w:tc>
+          <w:tcPr>
+            <w:tcW w:type="dxa" w:w="850"/>
+            <w:shd w:fill="1F4E79"/>
+            <w:vAlign w:val="center"/>
+          </w:tcPr>
+          <w:p>
+            <w:pPr>
+              <w:spacing w:after="0" w:before="0"/>
+            </w:pPr>
+            <w:r>
+              <w:rPr>
+                <w:rFonts w:ascii="Arial" w:hAnsi="Arial"/>
+                <w:b/>
+                <w:color w:val="FFFFFF"/>
+                <w:sz w:val="15"/>
+              </w:rPr>
+              <w:t>SO</w:t>
+            </w:r>
+          </w:p>
+        </w:tc>
+        <w:tc>
+          <w:tcPr>
+            <w:tcW w:type="dxa" w:w="5102"/>
+            <w:shd w:fill="1F4E79"/>
+            <w:vAlign w:val="center"/>
+          </w:tcPr>
+          <w:p>
+            <w:pPr>
+              <w:spacing w:after="0" w:before="0"/>
+            </w:pPr>
+            <w:r>
+              <w:rPr>
+                <w:rFonts w:ascii="Arial" w:hAnsi="Arial"/>
+                <w:b/>
+                <w:color w:val="FFFFFF"/>
+                <w:sz w:val="15"/>
+              </w:rPr>
+              <w:t>Indicador principal</w:t>
+            </w:r>
+          </w:p>
+        </w:tc>
+      </w:tr>
+      <w:tr>
+        <w:tc>
+          <w:tcPr>
+            <w:tcW w:type="dxa" w:w="2835"/>
+            <w:vAlign w:val="center"/>
+          </w:tcPr>
+          <w:p>
+            <w:pPr>
+              <w:spacing w:after="0" w:before="0"/>
+            </w:pPr>
+            <w:r>
+              <w:rPr>
+                <w:rFonts w:ascii="Arial" w:hAnsi="Arial"/>
+                <w:b w:val="0"/>
+                <w:sz w:val="15"/>
+              </w:rPr>
+              <w:t>C1. Grafo ROS 2</w:t>
+            </w:r>
+          </w:p>
+        </w:tc>
+        <w:tc>
+          <w:tcPr>
+            <w:tcW w:type="dxa" w:w="850"/>
+            <w:vAlign w:val="center"/>
+          </w:tcPr>
+          <w:p>
+            <w:pPr>
+              <w:spacing w:after="0" w:before="0"/>
+            </w:pPr>
+            <w:r>
+              <w:rPr>
+                <w:rFonts w:ascii="Arial" w:hAnsi="Arial"/>
+                <w:b w:val="0"/>
+                <w:sz w:val="15"/>
+              </w:rPr>
+              <w:t>25%</w:t>
+            </w:r>
+          </w:p>
+        </w:tc>
+        <w:tc>
+          <w:tcPr>
+            <w:tcW w:type="dxa" w:w="850"/>
+            <w:vAlign w:val="center"/>
+          </w:tcPr>
+          <w:p>
+            <w:pPr>
+              <w:spacing w:after="0" w:before="0"/>
+            </w:pPr>
+            <w:r>
+              <w:rPr>
+                <w:rFonts w:ascii="Arial" w:hAnsi="Arial"/>
+                <w:b w:val="0"/>
+                <w:sz w:val="15"/>
+              </w:rPr>
+              <w:t>SO2</w:t>
+            </w:r>
+          </w:p>
+        </w:tc>
+        <w:tc>
+          <w:tcPr>
+            <w:tcW w:type="dxa" w:w="5102"/>
+            <w:vAlign w:val="center"/>
+          </w:tcPr>
+          <w:p>
+            <w:pPr>
+              <w:spacing w:after="0" w:before="0"/>
+            </w:pPr>
+            <w:r>
+              <w:rPr>
+                <w:rFonts w:ascii="Arial" w:hAnsi="Arial"/>
+                <w:b w:val="0"/>
+                <w:sz w:val="15"/>
+              </w:rPr>
+              <w:t>2.1. Diseña soluciones de software para control y monitoreo de robots, integrando contratos de comunicación (QoS, interfaces customizadas) y redes DDS robustas.</w:t>
+            </w:r>
+          </w:p>
+        </w:tc>
+      </w:tr>
+      <w:tr>
+        <w:tc>
+          <w:tcPr>
+            <w:tcW w:type="dxa" w:w="2835"/>
+            <w:shd w:fill="F2F2F2"/>
+            <w:vAlign w:val="center"/>
+          </w:tcPr>
+          <w:p>
+            <w:pPr>
+              <w:spacing w:after="0" w:before="0"/>
+            </w:pPr>
+            <w:r>
+              <w:rPr>
+                <w:rFonts w:ascii="Arial" w:hAnsi="Arial"/>
+                <w:b w:val="0"/>
+                <w:sz w:val="15"/>
+              </w:rPr>
+              <w:t>C2. Tópicos y mensajes</w:t>
+            </w:r>
+          </w:p>
+        </w:tc>
+        <w:tc>
+          <w:tcPr>
+            <w:tcW w:type="dxa" w:w="850"/>
+            <w:shd w:fill="F2F2F2"/>
+            <w:vAlign w:val="center"/>
+          </w:tcPr>
+          <w:p>
+            <w:pPr>
+              <w:spacing w:after="0" w:before="0"/>
+            </w:pPr>
+            <w:r>
+              <w:rPr>
+                <w:rFonts w:ascii="Arial" w:hAnsi="Arial"/>
+                <w:b w:val="0"/>
+                <w:sz w:val="15"/>
+              </w:rPr>
+              <w:t>20%</w:t>
+            </w:r>
+          </w:p>
+        </w:tc>
+        <w:tc>
+          <w:tcPr>
+            <w:tcW w:type="dxa" w:w="850"/>
+            <w:shd w:fill="F2F2F2"/>
+            <w:vAlign w:val="center"/>
+          </w:tcPr>
+          <w:p>
+            <w:pPr>
+              <w:spacing w:after="0" w:before="0"/>
+            </w:pPr>
+            <w:r>
+              <w:rPr>
+                <w:rFonts w:ascii="Arial" w:hAnsi="Arial"/>
+                <w:b w:val="0"/>
+                <w:sz w:val="15"/>
+              </w:rPr>
+              <w:t>SO2</w:t>
+            </w:r>
+          </w:p>
+        </w:tc>
+        <w:tc>
+          <w:tcPr>
+            <w:tcW w:type="dxa" w:w="5102"/>
+            <w:shd w:fill="F2F2F2"/>
+            <w:vAlign w:val="center"/>
+          </w:tcPr>
+          <w:p>
+            <w:pPr>
+              <w:spacing w:after="0" w:before="0"/>
+            </w:pPr>
+            <w:r>
+              <w:rPr>
+                <w:rFonts w:ascii="Arial" w:hAnsi="Arial"/>
+                <w:b w:val="0"/>
+                <w:sz w:val="15"/>
+              </w:rPr>
+              <w:t>2.1. Diseña soluciones de software para control y monitoreo de robots, integrando contratos de comunicación (QoS, interfaces customizadas) y redes DDS robustas.</w:t>
+            </w:r>
+          </w:p>
+        </w:tc>
+      </w:tr>
+      <w:tr>
+        <w:tc>
+          <w:tcPr>
+            <w:tcW w:type="dxa" w:w="2835"/>
+            <w:vAlign w:val="center"/>
+          </w:tcPr>
+          <w:p>
+            <w:pPr>
+              <w:spacing w:after="0" w:before="0"/>
+            </w:pPr>
+            <w:r>
+              <w:rPr>
+                <w:rFonts w:ascii="Arial" w:hAnsi="Arial"/>
+                <w:b w:val="0"/>
+                <w:sz w:val="15"/>
+              </w:rPr>
+              <w:t>C3. Servicios, parámetros y rqt</w:t>
+            </w:r>
+          </w:p>
+        </w:tc>
+        <w:tc>
+          <w:tcPr>
+            <w:tcW w:type="dxa" w:w="850"/>
+            <w:vAlign w:val="center"/>
+          </w:tcPr>
+          <w:p>
+            <w:pPr>
+              <w:spacing w:after="0" w:before="0"/>
+            </w:pPr>
+            <w:r>
+              <w:rPr>
+                <w:rFonts w:ascii="Arial" w:hAnsi="Arial"/>
+                <w:b w:val="0"/>
+                <w:sz w:val="15"/>
+              </w:rPr>
+              <w:t>20%</w:t>
+            </w:r>
+          </w:p>
+        </w:tc>
+        <w:tc>
+          <w:tcPr>
+            <w:tcW w:type="dxa" w:w="850"/>
+            <w:vAlign w:val="center"/>
+          </w:tcPr>
+          <w:p>
+            <w:pPr>
+              <w:spacing w:after="0" w:before="0"/>
+            </w:pPr>
+            <w:r>
+              <w:rPr>
+                <w:rFonts w:ascii="Arial" w:hAnsi="Arial"/>
+                <w:b w:val="0"/>
+                <w:sz w:val="15"/>
+              </w:rPr>
+              <w:t>SO2</w:t>
+            </w:r>
+          </w:p>
+        </w:tc>
+        <w:tc>
+          <w:tcPr>
+            <w:tcW w:type="dxa" w:w="5102"/>
+            <w:vAlign w:val="center"/>
+          </w:tcPr>
+          <w:p>
+            <w:pPr>
+              <w:spacing w:after="0" w:before="0"/>
+            </w:pPr>
+            <w:r>
+              <w:rPr>
+                <w:rFonts w:ascii="Arial" w:hAnsi="Arial"/>
+                <w:b w:val="0"/>
+                <w:sz w:val="15"/>
+              </w:rPr>
+              <w:t>2.1. Diseña soluciones de software para control y monitoreo de robots, integrando contratos de comunicación (QoS, interfaces customizadas) y redes DDS robustas.</w:t>
+            </w:r>
+          </w:p>
+        </w:tc>
+      </w:tr>
+      <w:tr>
+        <w:tc>
+          <w:tcPr>
+            <w:tcW w:type="dxa" w:w="2835"/>
+            <w:shd w:fill="F2F2F2"/>
+            <w:vAlign w:val="center"/>
+          </w:tcPr>
+          <w:p>
+            <w:pPr>
+              <w:spacing w:after="0" w:before="0"/>
+            </w:pPr>
+            <w:r>
+              <w:rPr>
+                <w:rFonts w:ascii="Arial" w:hAnsi="Arial"/>
+                <w:b w:val="0"/>
+                <w:sz w:val="15"/>
+              </w:rPr>
+              <w:t>C4. Arquitectura burger_delivery</w:t>
+            </w:r>
+          </w:p>
+        </w:tc>
+        <w:tc>
+          <w:tcPr>
+            <w:tcW w:type="dxa" w:w="850"/>
+            <w:shd w:fill="F2F2F2"/>
+            <w:vAlign w:val="center"/>
+          </w:tcPr>
+          <w:p>
+            <w:pPr>
+              <w:spacing w:after="0" w:before="0"/>
+            </w:pPr>
+            <w:r>
+              <w:rPr>
+                <w:rFonts w:ascii="Arial" w:hAnsi="Arial"/>
+                <w:b w:val="0"/>
+                <w:sz w:val="15"/>
+              </w:rPr>
+              <w:t>20%</w:t>
+            </w:r>
+          </w:p>
+        </w:tc>
+        <w:tc>
+          <w:tcPr>
+            <w:tcW w:type="dxa" w:w="850"/>
+            <w:shd w:fill="F2F2F2"/>
+            <w:vAlign w:val="center"/>
+          </w:tcPr>
+          <w:p>
+            <w:pPr>
+              <w:spacing w:after="0" w:before="0"/>
+            </w:pPr>
+            <w:r>
+              <w:rPr>
+                <w:rFonts w:ascii="Arial" w:hAnsi="Arial"/>
+                <w:b w:val="0"/>
+                <w:sz w:val="15"/>
+              </w:rPr>
+              <w:t>SO2</w:t>
+            </w:r>
+          </w:p>
+        </w:tc>
+        <w:tc>
+          <w:tcPr>
+            <w:tcW w:type="dxa" w:w="5102"/>
+            <w:shd w:fill="F2F2F2"/>
+            <w:vAlign w:val="center"/>
+          </w:tcPr>
+          <w:p>
+            <w:pPr>
+              <w:spacing w:after="0" w:before="0"/>
+            </w:pPr>
+            <w:r>
+              <w:rPr>
+                <w:rFonts w:ascii="Arial" w:hAnsi="Arial"/>
+                <w:b w:val="0"/>
+                <w:sz w:val="15"/>
+              </w:rPr>
+              <w:t>2.1. Diseña soluciones de software para control y monitoreo de robots, integrando contratos de comunicación (QoS, interfaces customizadas) y redes DDS robustas.</w:t>
+            </w:r>
+          </w:p>
+        </w:tc>
+      </w:tr>
+      <w:tr>
+        <w:tc>
+          <w:tcPr>
+            <w:tcW w:type="dxa" w:w="2835"/>
+            <w:vAlign w:val="center"/>
+          </w:tcPr>
+          <w:p>
+            <w:pPr>
+              <w:spacing w:after="0" w:before="0"/>
+            </w:pPr>
+            <w:r>
+              <w:rPr>
+                <w:rFonts w:ascii="Arial" w:hAnsi="Arial"/>
+                <w:b w:val="0"/>
+                <w:sz w:val="15"/>
+              </w:rPr>
+              <w:t>C5. Evidencia reproducible</w:t>
+            </w:r>
+          </w:p>
+        </w:tc>
+        <w:tc>
+          <w:tcPr>
+            <w:tcW w:type="dxa" w:w="850"/>
+            <w:vAlign w:val="center"/>
+          </w:tcPr>
+          <w:p>
+            <w:pPr>
+              <w:spacing w:after="0" w:before="0"/>
+            </w:pPr>
+            <w:r>
+              <w:rPr>
+                <w:rFonts w:ascii="Arial" w:hAnsi="Arial"/>
+                <w:b w:val="0"/>
+                <w:sz w:val="15"/>
+              </w:rPr>
+              <w:t>15%</w:t>
+            </w:r>
+          </w:p>
+        </w:tc>
+        <w:tc>
+          <w:tcPr>
+            <w:tcW w:type="dxa" w:w="850"/>
+            <w:vAlign w:val="center"/>
+          </w:tcPr>
+          <w:p>
+            <w:pPr>
+              <w:spacing w:after="0" w:before="0"/>
+            </w:pPr>
+            <w:r>
+              <w:rPr>
+                <w:rFonts w:ascii="Arial" w:hAnsi="Arial"/>
+                <w:b w:val="0"/>
+                <w:sz w:val="15"/>
+              </w:rPr>
+              <w:t>SO3</w:t>
+            </w:r>
+          </w:p>
+        </w:tc>
+        <w:tc>
+          <w:tcPr>
+            <w:tcW w:type="dxa" w:w="5102"/>
+            <w:vAlign w:val="center"/>
+          </w:tcPr>
+          <w:p>
+            <w:pPr>
+              <w:spacing w:after="0" w:before="0"/>
+            </w:pPr>
+            <w:r>
+              <w:rPr>
+                <w:rFonts w:ascii="Arial" w:hAnsi="Arial"/>
+                <w:b w:val="0"/>
+                <w:sz w:val="15"/>
+              </w:rPr>
+              <w:t>3.1. Elabora documentación técnica reproducible del sistema ROS 2, incluyendo diagramas de nodos, tópicos, servicios, acciones, frames TF y contratos de comunicación DDS.</w:t>
+            </w:r>
+          </w:p>
+        </w:tc>
+      </w:tr>
+    </w:tbl>
     <w:p>
       <w:pPr>
         <w:pStyle w:val="Heading1"/>
@@ -2987,11 +3822,6 @@
       </w:tr>
     </w:tbl>
     <w:p>
-      <w:r>
-        <w:br w:type="page"/>
-      </w:r>
-    </w:p>
-    <w:p>
       <w:pPr>
         <w:pStyle w:val="Heading1"/>
         <w:keepNext/>
@@ -3016,7 +3846,11 @@
         <w:keepNext/>
       </w:pPr>
       <w:r>
-        <w:t>C1. Ejecución e introspección del grafo ROS 2 — peso 25%</w:t>
+        <w:rPr>
+          <w:rFonts w:ascii="Arial" w:hAnsi="Arial"/>
+          <w:sz w:val="18"/>
+        </w:rPr>
+        <w:t>C1. Ejecución e introspección del grafo ROS 2 — peso 25% — indicador 2.1 / SO2</w:t>
       </w:r>
     </w:p>
     <w:tbl>
@@ -3637,7 +4471,11 @@
         <w:keepNext/>
       </w:pPr>
       <w:r>
-        <w:t>C2. Operación e interpretación de tópicos y mensajes — peso 20%</w:t>
+        <w:rPr>
+          <w:rFonts w:ascii="Arial" w:hAnsi="Arial"/>
+          <w:sz w:val="18"/>
+        </w:rPr>
+        <w:t>C2. Operación e interpretación de tópicos y mensajes — peso 20% — indicador 2.1 / SO2</w:t>
       </w:r>
     </w:p>
     <w:tbl>
@@ -4323,7 +5161,11 @@
         <w:keepNext/>
       </w:pPr>
       <w:r>
-        <w:t>C3. Servicios, parámetros y rqt — peso 20%</w:t>
+        <w:rPr>
+          <w:rFonts w:ascii="Arial" w:hAnsi="Arial"/>
+          <w:sz w:val="18"/>
+        </w:rPr>
+        <w:t>C3. Servicios, parámetros y rqt — peso 20% — indicador 2.1 / SO2</w:t>
       </w:r>
     </w:p>
     <w:tbl>
@@ -4989,18 +5831,11 @@
         <w:keepNext/>
       </w:pPr>
       <w:r>
-        <w:t xml:space="preserve">C4. Decisión arquitectónica para </w:t>
-      </w:r>
-      <w:r>
         <w:rPr>
-          <w:rFonts w:ascii="Aptos Mono" w:hAnsi="Aptos Mono" w:eastAsia="Aptos Mono"/>
-          <w:color w:val="9C0006"/>
-          <w:sz w:val="16"/>
+          <w:rFonts w:ascii="Arial" w:hAnsi="Arial"/>
+          <w:sz w:val="18"/>
         </w:rPr>
-        <w:t>burger_delivery</w:t>
-      </w:r>
-      <w:r>
-        <w:t xml:space="preserve"> — peso 20%</w:t>
+        <w:t>C4. Decisión arquitectónica para burger_delivery — peso 20% — indicador 2.1 / SO2</w:t>
       </w:r>
     </w:p>
     <w:tbl>
@@ -5626,7 +6461,11 @@
         <w:keepNext/>
       </w:pPr>
       <w:r>
-        <w:t>C5. Evidencia reproducible y diagnóstico — peso 15%</w:t>
+        <w:rPr>
+          <w:rFonts w:ascii="Arial" w:hAnsi="Arial"/>
+          <w:sz w:val="18"/>
+        </w:rPr>
+        <w:t>C5. Evidencia reproducible y diagnóstico — peso 15% — indicador 3.1 / SO3</w:t>
       </w:r>
     </w:p>
     <w:tbl>
@@ -7567,16 +8406,8 @@
             </w:tcMar>
           </w:tcPr>
           <w:p>
-            <w:pPr>
-              <w:spacing w:after="0" w:line="240" w:lineRule="auto"/>
-              <w:jc w:val="center"/>
-            </w:pPr>
             <w:r>
-              <w:rPr>
-                <w:rFonts w:ascii="Aptos" w:hAnsi="Aptos"/>
-                <w:sz w:val="16"/>
-              </w:rPr>
-              <w:t>______ %</w:t>
+              <w:t>100% para el primer corte 2026-2</w:t>
             </w:r>
           </w:p>
         </w:tc>
@@ -7651,11 +8482,12 @@
       </w:pPr>
       <w:r>
         <w:rPr>
-          <w:rFonts w:ascii="Aptos Mono" w:hAnsi="Aptos Mono" w:eastAsia="Aptos Mono"/>
-          <w:color w:val="404040"/>
-          <w:sz w:val="16"/>
+          <w:rFonts w:ascii="Arial" w:hAnsi="Arial"/>
+          <w:sz w:val="18"/>
         </w:rPr>
-        <w:t>T₁ = Σ(Nota de cada taller o tarea × su peso) / 100</w:t>
+        <w:t>T₁ = Nota Taller 01</w:t>
+        <w:br/>
+        <w:t>Nota Corte 1 = 0,28 T₁ + 0,42 L₁ + 0,30 E₁</w:t>
       </w:r>
     </w:p>
     <w:p>
@@ -7678,16 +8510,702 @@
           <w:rFonts w:ascii="Arial" w:hAnsi="Arial"/>
           <w:sz w:val="18"/>
         </w:rPr>
-        <w:t>Este documento entrega la Nota Taller 01 y los resultados desagregados por criterio. La nota pasa al consolidado de talleres y tareas; Zubatronic genera por separado los reportes RAE/SO.</w:t>
+        <w:t>Este documento entrega la Nota Taller 01 y los resultados por criterio. En 2026-2, Taller 01 constituye el 100% de T₁; cualquier cambio exige una nueva versión antes de recibir entregas.</w:t>
       </w:r>
     </w:p>
+    <w:p>
+      <w:pPr>
+        <w:pStyle w:val="Heading2"/>
+      </w:pPr>
+      <w:r>
+        <w:rPr>
+          <w:rFonts w:ascii="Arial" w:hAnsi="Arial"/>
+          <w:color w:val="1F4E79"/>
+        </w:rPr>
+        <w:t>9. Consolidación ABET y mejora continua</w:t>
+      </w:r>
+    </w:p>
+    <w:tbl>
+      <w:tblPr>
+        <w:tblStyle w:val="TableGrid"/>
+        <w:tblW w:type="auto" w:w="0"/>
+        <w:jc w:val="center"/>
+        <w:tblLook w:firstColumn="1" w:firstRow="1" w:lastColumn="0" w:lastRow="0" w:noHBand="0" w:noVBand="1" w:val="04A0"/>
+      </w:tblPr>
+      <w:tblGrid>
+        <w:gridCol w:w="1742"/>
+        <w:gridCol w:w="1742"/>
+        <w:gridCol w:w="1742"/>
+        <w:gridCol w:w="1742"/>
+        <w:gridCol w:w="1742"/>
+        <w:gridCol w:w="1742"/>
+      </w:tblGrid>
+      <w:tr>
+        <w:tc>
+          <w:tcPr>
+            <w:tcW w:type="dxa" w:w="1701"/>
+            <w:shd w:fill="1F4E79"/>
+            <w:vAlign w:val="center"/>
+          </w:tcPr>
+          <w:p>
+            <w:pPr>
+              <w:spacing w:after="0" w:before="0"/>
+            </w:pPr>
+            <w:r>
+              <w:rPr>
+                <w:rFonts w:ascii="Arial" w:hAnsi="Arial"/>
+                <w:b/>
+                <w:color w:val="FFFFFF"/>
+                <w:sz w:val="15"/>
+              </w:rPr>
+              <w:t>Indicador</w:t>
+            </w:r>
+          </w:p>
+        </w:tc>
+        <w:tc>
+          <w:tcPr>
+            <w:tcW w:type="dxa" w:w="1134"/>
+            <w:shd w:fill="1F4E79"/>
+            <w:vAlign w:val="center"/>
+          </w:tcPr>
+          <w:p>
+            <w:pPr>
+              <w:spacing w:after="0" w:before="0"/>
+            </w:pPr>
+            <w:r>
+              <w:rPr>
+                <w:rFonts w:ascii="Arial" w:hAnsi="Arial"/>
+                <w:b/>
+                <w:color w:val="FFFFFF"/>
+                <w:sz w:val="15"/>
+              </w:rPr>
+              <w:t>N evaluable</w:t>
+            </w:r>
+          </w:p>
+        </w:tc>
+        <w:tc>
+          <w:tcPr>
+            <w:tcW w:type="dxa" w:w="1134"/>
+            <w:shd w:fill="1F4E79"/>
+            <w:vAlign w:val="center"/>
+          </w:tcPr>
+          <w:p>
+            <w:pPr>
+              <w:spacing w:after="0" w:before="0"/>
+            </w:pPr>
+            <w:r>
+              <w:rPr>
+                <w:rFonts w:ascii="Arial" w:hAnsi="Arial"/>
+                <w:b/>
+                <w:color w:val="FFFFFF"/>
+                <w:sz w:val="15"/>
+              </w:rPr>
+              <w:t>N ≥ N3</w:t>
+            </w:r>
+          </w:p>
+        </w:tc>
+        <w:tc>
+          <w:tcPr>
+            <w:tcW w:type="dxa" w:w="1134"/>
+            <w:shd w:fill="1F4E79"/>
+            <w:vAlign w:val="center"/>
+          </w:tcPr>
+          <w:p>
+            <w:pPr>
+              <w:spacing w:after="0" w:before="0"/>
+            </w:pPr>
+            <w:r>
+              <w:rPr>
+                <w:rFonts w:ascii="Arial" w:hAnsi="Arial"/>
+                <w:b/>
+                <w:color w:val="FFFFFF"/>
+                <w:sz w:val="15"/>
+              </w:rPr>
+              <w:t>% logro</w:t>
+            </w:r>
+          </w:p>
+        </w:tc>
+        <w:tc>
+          <w:tcPr>
+            <w:tcW w:type="dxa" w:w="1134"/>
+            <w:shd w:fill="1F4E79"/>
+            <w:vAlign w:val="center"/>
+          </w:tcPr>
+          <w:p>
+            <w:pPr>
+              <w:spacing w:after="0" w:before="0"/>
+            </w:pPr>
+            <w:r>
+              <w:rPr>
+                <w:rFonts w:ascii="Arial" w:hAnsi="Arial"/>
+                <w:b/>
+                <w:color w:val="FFFFFF"/>
+                <w:sz w:val="15"/>
+              </w:rPr>
+              <w:t>Meta</w:t>
+            </w:r>
+          </w:p>
+        </w:tc>
+        <w:tc>
+          <w:tcPr>
+            <w:tcW w:type="dxa" w:w="3402"/>
+            <w:shd w:fill="1F4E79"/>
+            <w:vAlign w:val="center"/>
+          </w:tcPr>
+          <w:p>
+            <w:pPr>
+              <w:spacing w:after="0" w:before="0"/>
+            </w:pPr>
+            <w:r>
+              <w:rPr>
+                <w:rFonts w:ascii="Arial" w:hAnsi="Arial"/>
+                <w:b/>
+                <w:color w:val="FFFFFF"/>
+                <w:sz w:val="15"/>
+              </w:rPr>
+              <w:t>Hallazgo</w:t>
+            </w:r>
+          </w:p>
+        </w:tc>
+      </w:tr>
+      <w:tr>
+        <w:tc>
+          <w:tcPr>
+            <w:tcW w:type="dxa" w:w="1701"/>
+            <w:vAlign w:val="center"/>
+          </w:tcPr>
+          <w:p>
+            <w:pPr>
+              <w:spacing w:after="0" w:before="0"/>
+            </w:pPr>
+            <w:r>
+              <w:rPr>
+                <w:rFonts w:ascii="Arial" w:hAnsi="Arial"/>
+                <w:b w:val="0"/>
+                <w:sz w:val="15"/>
+              </w:rPr>
+              <w:t>2.1 / SO2</w:t>
+            </w:r>
+          </w:p>
+        </w:tc>
+        <w:tc>
+          <w:tcPr>
+            <w:tcW w:type="dxa" w:w="1134"/>
+            <w:vAlign w:val="center"/>
+          </w:tcPr>
+          <w:p>
+            <w:pPr>
+              <w:spacing w:after="0" w:before="0"/>
+            </w:pPr>
+            <w:r>
+              <w:rPr>
+                <w:rFonts w:ascii="Arial" w:hAnsi="Arial"/>
+                <w:b w:val="0"/>
+                <w:sz w:val="15"/>
+              </w:rPr>
+            </w:r>
+          </w:p>
+        </w:tc>
+        <w:tc>
+          <w:tcPr>
+            <w:tcW w:type="dxa" w:w="1134"/>
+            <w:vAlign w:val="center"/>
+          </w:tcPr>
+          <w:p>
+            <w:pPr>
+              <w:spacing w:after="0" w:before="0"/>
+            </w:pPr>
+            <w:r>
+              <w:rPr>
+                <w:rFonts w:ascii="Arial" w:hAnsi="Arial"/>
+                <w:b w:val="0"/>
+                <w:sz w:val="15"/>
+              </w:rPr>
+            </w:r>
+          </w:p>
+        </w:tc>
+        <w:tc>
+          <w:tcPr>
+            <w:tcW w:type="dxa" w:w="1134"/>
+            <w:vAlign w:val="center"/>
+          </w:tcPr>
+          <w:p>
+            <w:pPr>
+              <w:spacing w:after="0" w:before="0"/>
+            </w:pPr>
+            <w:r>
+              <w:rPr>
+                <w:rFonts w:ascii="Arial" w:hAnsi="Arial"/>
+                <w:b w:val="0"/>
+                <w:sz w:val="15"/>
+              </w:rPr>
+            </w:r>
+          </w:p>
+        </w:tc>
+        <w:tc>
+          <w:tcPr>
+            <w:tcW w:type="dxa" w:w="1134"/>
+            <w:vAlign w:val="center"/>
+          </w:tcPr>
+          <w:p>
+            <w:pPr>
+              <w:spacing w:after="0" w:before="0"/>
+            </w:pPr>
+            <w:r>
+              <w:rPr>
+                <w:rFonts w:ascii="Arial" w:hAnsi="Arial"/>
+                <w:b w:val="0"/>
+                <w:sz w:val="15"/>
+              </w:rPr>
+              <w:t>70%</w:t>
+            </w:r>
+          </w:p>
+        </w:tc>
+        <w:tc>
+          <w:tcPr>
+            <w:tcW w:type="dxa" w:w="3402"/>
+            <w:vAlign w:val="center"/>
+          </w:tcPr>
+          <w:p>
+            <w:pPr>
+              <w:spacing w:after="0" w:before="0"/>
+            </w:pPr>
+            <w:r>
+              <w:rPr>
+                <w:rFonts w:ascii="Arial" w:hAnsi="Arial"/>
+                <w:b w:val="0"/>
+                <w:sz w:val="15"/>
+              </w:rPr>
+            </w:r>
+          </w:p>
+        </w:tc>
+      </w:tr>
+      <w:tr>
+        <w:tc>
+          <w:tcPr>
+            <w:tcW w:type="dxa" w:w="1701"/>
+            <w:shd w:fill="F2F2F2"/>
+            <w:vAlign w:val="center"/>
+          </w:tcPr>
+          <w:p>
+            <w:pPr>
+              <w:spacing w:after="0" w:before="0"/>
+            </w:pPr>
+            <w:r>
+              <w:rPr>
+                <w:rFonts w:ascii="Arial" w:hAnsi="Arial"/>
+                <w:b w:val="0"/>
+                <w:sz w:val="15"/>
+              </w:rPr>
+              <w:t>3.1 / SO3</w:t>
+            </w:r>
+          </w:p>
+        </w:tc>
+        <w:tc>
+          <w:tcPr>
+            <w:tcW w:type="dxa" w:w="1134"/>
+            <w:shd w:fill="F2F2F2"/>
+            <w:vAlign w:val="center"/>
+          </w:tcPr>
+          <w:p>
+            <w:pPr>
+              <w:spacing w:after="0" w:before="0"/>
+            </w:pPr>
+            <w:r>
+              <w:rPr>
+                <w:rFonts w:ascii="Arial" w:hAnsi="Arial"/>
+                <w:b w:val="0"/>
+                <w:sz w:val="15"/>
+              </w:rPr>
+            </w:r>
+          </w:p>
+        </w:tc>
+        <w:tc>
+          <w:tcPr>
+            <w:tcW w:type="dxa" w:w="1134"/>
+            <w:shd w:fill="F2F2F2"/>
+            <w:vAlign w:val="center"/>
+          </w:tcPr>
+          <w:p>
+            <w:pPr>
+              <w:spacing w:after="0" w:before="0"/>
+            </w:pPr>
+            <w:r>
+              <w:rPr>
+                <w:rFonts w:ascii="Arial" w:hAnsi="Arial"/>
+                <w:b w:val="0"/>
+                <w:sz w:val="15"/>
+              </w:rPr>
+            </w:r>
+          </w:p>
+        </w:tc>
+        <w:tc>
+          <w:tcPr>
+            <w:tcW w:type="dxa" w:w="1134"/>
+            <w:shd w:fill="F2F2F2"/>
+            <w:vAlign w:val="center"/>
+          </w:tcPr>
+          <w:p>
+            <w:pPr>
+              <w:spacing w:after="0" w:before="0"/>
+            </w:pPr>
+            <w:r>
+              <w:rPr>
+                <w:rFonts w:ascii="Arial" w:hAnsi="Arial"/>
+                <w:b w:val="0"/>
+                <w:sz w:val="15"/>
+              </w:rPr>
+            </w:r>
+          </w:p>
+        </w:tc>
+        <w:tc>
+          <w:tcPr>
+            <w:tcW w:type="dxa" w:w="1134"/>
+            <w:shd w:fill="F2F2F2"/>
+            <w:vAlign w:val="center"/>
+          </w:tcPr>
+          <w:p>
+            <w:pPr>
+              <w:spacing w:after="0" w:before="0"/>
+            </w:pPr>
+            <w:r>
+              <w:rPr>
+                <w:rFonts w:ascii="Arial" w:hAnsi="Arial"/>
+                <w:b w:val="0"/>
+                <w:sz w:val="15"/>
+              </w:rPr>
+              <w:t>70%</w:t>
+            </w:r>
+          </w:p>
+        </w:tc>
+        <w:tc>
+          <w:tcPr>
+            <w:tcW w:type="dxa" w:w="3402"/>
+            <w:shd w:fill="F2F2F2"/>
+            <w:vAlign w:val="center"/>
+          </w:tcPr>
+          <w:p>
+            <w:pPr>
+              <w:spacing w:after="0" w:before="0"/>
+            </w:pPr>
+            <w:r>
+              <w:rPr>
+                <w:rFonts w:ascii="Arial" w:hAnsi="Arial"/>
+                <w:b w:val="0"/>
+                <w:sz w:val="15"/>
+              </w:rPr>
+            </w:r>
+          </w:p>
+        </w:tc>
+      </w:tr>
+    </w:tbl>
+    <w:tbl>
+      <w:tblPr>
+        <w:tblStyle w:val="TableGrid"/>
+        <w:tblW w:type="auto" w:w="0"/>
+        <w:jc w:val="center"/>
+        <w:tblLook w:firstColumn="1" w:firstRow="1" w:lastColumn="0" w:lastRow="0" w:noHBand="0" w:noVBand="1" w:val="04A0"/>
+      </w:tblPr>
+      <w:tblGrid>
+        <w:gridCol w:w="5227"/>
+        <w:gridCol w:w="5227"/>
+      </w:tblGrid>
+      <w:tr>
+        <w:tc>
+          <w:tcPr>
+            <w:tcW w:type="dxa" w:w="3402"/>
+            <w:shd w:fill="1F4E79"/>
+            <w:vAlign w:val="center"/>
+          </w:tcPr>
+          <w:p>
+            <w:pPr>
+              <w:spacing w:after="0" w:before="0"/>
+            </w:pPr>
+            <w:r>
+              <w:rPr>
+                <w:rFonts w:ascii="Arial" w:hAnsi="Arial"/>
+                <w:b/>
+                <w:color w:val="FFFFFF"/>
+                <w:sz w:val="15"/>
+              </w:rPr>
+              <w:t>Cierre de ciclo</w:t>
+            </w:r>
+          </w:p>
+        </w:tc>
+        <w:tc>
+          <w:tcPr>
+            <w:tcW w:type="dxa" w:w="6236"/>
+            <w:shd w:fill="1F4E79"/>
+            <w:vAlign w:val="center"/>
+          </w:tcPr>
+          <w:p>
+            <w:pPr>
+              <w:spacing w:after="0" w:before="0"/>
+            </w:pPr>
+            <w:r>
+              <w:rPr>
+                <w:rFonts w:ascii="Arial" w:hAnsi="Arial"/>
+                <w:b/>
+                <w:color w:val="FFFFFF"/>
+                <w:sz w:val="15"/>
+              </w:rPr>
+              <w:t>Registro</w:t>
+            </w:r>
+          </w:p>
+        </w:tc>
+      </w:tr>
+      <w:tr>
+        <w:tc>
+          <w:tcPr>
+            <w:tcW w:type="dxa" w:w="3402"/>
+            <w:vAlign w:val="center"/>
+          </w:tcPr>
+          <w:p>
+            <w:pPr>
+              <w:spacing w:after="0" w:before="0"/>
+            </w:pPr>
+            <w:r>
+              <w:rPr>
+                <w:rFonts w:ascii="Arial" w:hAnsi="Arial"/>
+                <w:b w:val="0"/>
+                <w:sz w:val="15"/>
+              </w:rPr>
+              <w:t>Decisión derivada del hallazgo</w:t>
+            </w:r>
+          </w:p>
+        </w:tc>
+        <w:tc>
+          <w:tcPr>
+            <w:tcW w:type="dxa" w:w="6236"/>
+            <w:vAlign w:val="center"/>
+          </w:tcPr>
+          <w:p>
+            <w:pPr>
+              <w:spacing w:after="0" w:before="0"/>
+            </w:pPr>
+            <w:r>
+              <w:rPr>
+                <w:rFonts w:ascii="Arial" w:hAnsi="Arial"/>
+                <w:b w:val="0"/>
+                <w:sz w:val="15"/>
+              </w:rPr>
+            </w:r>
+          </w:p>
+        </w:tc>
+      </w:tr>
+      <w:tr>
+        <w:tc>
+          <w:tcPr>
+            <w:tcW w:type="dxa" w:w="3402"/>
+            <w:shd w:fill="F2F2F2"/>
+            <w:vAlign w:val="center"/>
+          </w:tcPr>
+          <w:p>
+            <w:pPr>
+              <w:spacing w:after="0" w:before="0"/>
+            </w:pPr>
+            <w:r>
+              <w:rPr>
+                <w:rFonts w:ascii="Arial" w:hAnsi="Arial"/>
+                <w:b w:val="0"/>
+                <w:sz w:val="15"/>
+              </w:rPr>
+              <w:t>Acción de mejora</w:t>
+            </w:r>
+          </w:p>
+        </w:tc>
+        <w:tc>
+          <w:tcPr>
+            <w:tcW w:type="dxa" w:w="6236"/>
+            <w:shd w:fill="F2F2F2"/>
+            <w:vAlign w:val="center"/>
+          </w:tcPr>
+          <w:p>
+            <w:pPr>
+              <w:spacing w:after="0" w:before="0"/>
+            </w:pPr>
+            <w:r>
+              <w:rPr>
+                <w:rFonts w:ascii="Arial" w:hAnsi="Arial"/>
+                <w:b w:val="0"/>
+                <w:sz w:val="15"/>
+              </w:rPr>
+            </w:r>
+          </w:p>
+        </w:tc>
+      </w:tr>
+      <w:tr>
+        <w:tc>
+          <w:tcPr>
+            <w:tcW w:type="dxa" w:w="3402"/>
+            <w:vAlign w:val="center"/>
+          </w:tcPr>
+          <w:p>
+            <w:pPr>
+              <w:spacing w:after="0" w:before="0"/>
+            </w:pPr>
+            <w:r>
+              <w:rPr>
+                <w:rFonts w:ascii="Arial" w:hAnsi="Arial"/>
+                <w:b w:val="0"/>
+                <w:sz w:val="15"/>
+              </w:rPr>
+              <w:t>Responsable</w:t>
+            </w:r>
+          </w:p>
+        </w:tc>
+        <w:tc>
+          <w:tcPr>
+            <w:tcW w:type="dxa" w:w="6236"/>
+            <w:vAlign w:val="center"/>
+          </w:tcPr>
+          <w:p>
+            <w:pPr>
+              <w:spacing w:after="0" w:before="0"/>
+            </w:pPr>
+            <w:r>
+              <w:rPr>
+                <w:rFonts w:ascii="Arial" w:hAnsi="Arial"/>
+                <w:b w:val="0"/>
+                <w:sz w:val="15"/>
+              </w:rPr>
+            </w:r>
+          </w:p>
+        </w:tc>
+      </w:tr>
+      <w:tr>
+        <w:tc>
+          <w:tcPr>
+            <w:tcW w:type="dxa" w:w="3402"/>
+            <w:shd w:fill="F2F2F2"/>
+            <w:vAlign w:val="center"/>
+          </w:tcPr>
+          <w:p>
+            <w:pPr>
+              <w:spacing w:after="0" w:before="0"/>
+            </w:pPr>
+            <w:r>
+              <w:rPr>
+                <w:rFonts w:ascii="Arial" w:hAnsi="Arial"/>
+                <w:b w:val="0"/>
+                <w:sz w:val="15"/>
+              </w:rPr>
+              <w:t>Fecha de seguimiento</w:t>
+            </w:r>
+          </w:p>
+        </w:tc>
+        <w:tc>
+          <w:tcPr>
+            <w:tcW w:type="dxa" w:w="6236"/>
+            <w:shd w:fill="F2F2F2"/>
+            <w:vAlign w:val="center"/>
+          </w:tcPr>
+          <w:p>
+            <w:pPr>
+              <w:spacing w:after="0" w:before="0"/>
+            </w:pPr>
+            <w:r>
+              <w:rPr>
+                <w:rFonts w:ascii="Arial" w:hAnsi="Arial"/>
+                <w:b w:val="0"/>
+                <w:sz w:val="15"/>
+              </w:rPr>
+            </w:r>
+          </w:p>
+        </w:tc>
+      </w:tr>
+      <w:tr>
+        <w:tc>
+          <w:tcPr>
+            <w:tcW w:type="dxa" w:w="3402"/>
+            <w:vAlign w:val="center"/>
+          </w:tcPr>
+          <w:p>
+            <w:pPr>
+              <w:spacing w:after="0" w:before="0"/>
+            </w:pPr>
+            <w:r>
+              <w:rPr>
+                <w:rFonts w:ascii="Arial" w:hAnsi="Arial"/>
+                <w:b w:val="0"/>
+                <w:sz w:val="15"/>
+              </w:rPr>
+              <w:t>Evidencia de seguimiento</w:t>
+            </w:r>
+          </w:p>
+        </w:tc>
+        <w:tc>
+          <w:tcPr>
+            <w:tcW w:type="dxa" w:w="6236"/>
+            <w:vAlign w:val="center"/>
+          </w:tcPr>
+          <w:p>
+            <w:pPr>
+              <w:spacing w:after="0" w:before="0"/>
+            </w:pPr>
+            <w:r>
+              <w:rPr>
+                <w:rFonts w:ascii="Arial" w:hAnsi="Arial"/>
+                <w:b w:val="0"/>
+                <w:sz w:val="15"/>
+              </w:rPr>
+            </w:r>
+          </w:p>
+        </w:tc>
+      </w:tr>
+      <w:tr>
+        <w:tc>
+          <w:tcPr>
+            <w:tcW w:type="dxa" w:w="3402"/>
+            <w:shd w:fill="F2F2F2"/>
+            <w:vAlign w:val="center"/>
+          </w:tcPr>
+          <w:p>
+            <w:pPr>
+              <w:spacing w:after="0" w:before="0"/>
+            </w:pPr>
+            <w:r>
+              <w:rPr>
+                <w:rFonts w:ascii="Arial" w:hAnsi="Arial"/>
+                <w:b w:val="0"/>
+                <w:sz w:val="15"/>
+              </w:rPr>
+              <w:t>Resultado del siguiente ciclo</w:t>
+            </w:r>
+          </w:p>
+        </w:tc>
+        <w:tc>
+          <w:tcPr>
+            <w:tcW w:type="dxa" w:w="6236"/>
+            <w:shd w:fill="F2F2F2"/>
+            <w:vAlign w:val="center"/>
+          </w:tcPr>
+          <w:p>
+            <w:pPr>
+              <w:spacing w:after="0" w:before="0"/>
+            </w:pPr>
+            <w:r>
+              <w:rPr>
+                <w:rFonts w:ascii="Arial" w:hAnsi="Arial"/>
+                <w:b w:val="0"/>
+                <w:sz w:val="15"/>
+              </w:rPr>
+            </w:r>
+          </w:p>
+        </w:tc>
+      </w:tr>
+    </w:tbl>
     <w:p>
       <w:pPr>
         <w:pStyle w:val="Heading1"/>
         <w:keepNext/>
       </w:pPr>
       <w:r>
-        <w:t>9. Cierre</w:t>
+        <w:rPr>
+          <w:rFonts w:ascii="Arial" w:hAnsi="Arial"/>
+          <w:sz w:val="18"/>
+        </w:rPr>
+        <w:t>10. Cierre</w:t>
       </w:r>
     </w:p>
     <w:p>

</xml_diff>